<commit_message>
Correct GBCO: replace study/model/PDF with MNT-Halan-stake-corrected versions (42.58% vs unsourced 20%); update on-site fair value (30.2->37.3, gap -3%->+19%) in data.js/coverage.js, hero + plain-terms + MC-lab copy in EN/AR pages; cache-bust 20260709a
</commit_message>
<xml_diff>
--- a/files/GBCO_Valuation_Study_08-07-2026_public.docx
+++ b/files/GBCO_Valuation_Study_08-07-2026_public.docx
@@ -163,7 +163,7 @@
           <w:color w:val="1C3A36"/>
           <w:sz w:val="19"/>
         </w:rPr>
-        <w:t xml:space="preserve"> · prices and probabilities computed 7 Jul 2026 from the attached daily history · primary lens: split-the-legs sum-of-the-parts (operating company + captive lender, §3.5-F5) · Auto cash conversion and the Egyptian nominal-rate path are the swing factors.</w:t>
+        <w:t xml:space="preserve"> · prices and probabilities computed 7 Jul 2026 from the attached daily history · primary lens: split-the-legs sum-of-the-parts (operating company + captive lender, §3.5-F5) · the MNT-Halan stake percentage is now the dominant swing factor, ahead of Auto cash conversion and the Egyptian nominal-rate path.</w:t>
       </w:r>
     </w:p>
     <w:tbl>
@@ -270,7 +270,7 @@
           <w:color w:val="1C3A36"/>
           <w:sz w:val="21"/>
         </w:rPr>
-        <w:t xml:space="preserve">The model's read: roughly fairly valued — the price already pays for the recovery; what it does not yet pay for is the cash. </w:t>
+        <w:t xml:space="preserve">The model's read: the fundamentals point meaningfully undervalued — but the entire gap traces to one uncertain number, GB Corp's current stake in MNT-Halan. </w:t>
       </w:r>
       <w:r>
         <w:rPr>
@@ -279,7 +279,7 @@
           <w:color w:val="1C3A36"/>
           <w:sz w:val="21"/>
         </w:rPr>
-        <w:t>At EGP 31.25 the shares sit about 3% above our weighted central estimate of EGP 30.2. The four lenses cluster tightly: the split-the-legs sum-of-the-parts lands at 28.7 after a 10% complexity discount (pre-discount 31.9), a conservative relative read at 28.9, and a normalized mid-cycle read at 32.9 marks the ceiling. One structural fact belongs up front: the ~20% MNT-Halan stake alone is ≈EGP 11/share of that SOTP — about a third of the market price — marked to June’s USD 1.4 bn first close. The whole answer turns on the Auto leg's cash conversion: FY25 revenue grew 49% but working capital swallowed EGP 8.1 bn and Auto net debt rose to EGP 15.2 bn, so the DCF value of a business earning a 21% ROCE depends almost entirely on working-capital intensity gliding from 28.5% of revenue back toward its FY23–24 range — and on how fast Egyptian nominal rates (the 22% WACC against 11.5% terminal growth) come down. Technically the stock is the mirror image of a cheap chart: above all four moving averages, RSI in the low-60s, five months into a new all-time-high zone. Over three months the Monte Carlo — whose secular drift is the configuration that passed the Step 0 calibration gate — places the 5th–95th percentile band at roughly EGP 24–51 with a median near 35.</w:t>
+        <w:t>At EGP 31.25 the shares sit about 19% below our weighted central estimate of EGP 37.3. The four lenses spread wider than usual: the split-the-legs sum-of-the-parts lands at 41.1 after a 10% complexity discount (pre-discount 45.7), a conservative relative read at 28.9 marks the floor, and a normalized mid-cycle read at 32.9 sits in between. One correction belongs up front: GB Corp's own 28-Jul-2024 press release discloses its MNT-Halan stake directly — 42.58% fully diluted — dramatically higher than an earlier ~20% placeholder used in this study's first draft, which was an unsourced estimate made in error (§1.1 box). Applying the disclosed 42.58% to June's USD 1.4bn round values the stake alone at ≈EGP 28.3bn — 83% of GB Corp's entire spot market cap, which is itself an implausible read (it would leave almost nothing priced in for a real, profitable, EGP 66bn-revenue auto business) and the strongest signal that the stake has likely been diluted well below 42.58% by two capital events since 2024 that GB Corp has not individually quantified. This is now the single largest swing factor in the entire study — every 5 percentage points of stake is worth ≈EGP 3.3/share — and it dominates the Auto-leg cash-conversion question that would otherwise be the crux (FY25 revenue grew 49% but working capital swallowed EGP 8.1bn and Auto net debt rose to EGP 15.2bn; the DCF still depends on working-capital intensity gliding from 28.5% of revenue back toward its FY23–24 range and on the pace of Egyptian nominal-rate cuts). Technically the stock is the mirror image of a cheap chart: above all four moving averages, RSI in the low-60s, five months into a new all-time-high zone. Over three months the Monte Carlo — whose secular drift is the configuration that passed the Step 0 calibration gate — places the 5th–95th percentile band at roughly EGP 24–51 with a median near 35; that engine is completely unaffected by the stake correction, since it prices the stock's own path, not the SOTP.</w:t>
       </w:r>
     </w:p>
     <w:p>
@@ -543,7 +543,7 @@
                 <w:color w:val="1C3A36"/>
                 <w:sz w:val="17"/>
               </w:rPr>
-              <w:t>EGP 28.7</w:t>
+              <w:t>EGP 41.1</w:t>
             </w:r>
           </w:p>
         </w:tc>
@@ -561,7 +561,7 @@
                 <w:color w:val="1C3A36"/>
                 <w:sz w:val="17"/>
               </w:rPr>
-              <w:t>−8% vs spot</w:t>
+              <w:t>+32% vs spot</w:t>
             </w:r>
           </w:p>
         </w:tc>
@@ -616,7 +616,7 @@
                 <w:color w:val="1C3A36"/>
                 <w:sz w:val="17"/>
               </w:rPr>
-              <w:t>EGP 31.9</w:t>
+              <w:t>EGP 45.7</w:t>
             </w:r>
           </w:p>
         </w:tc>
@@ -634,7 +634,7 @@
                 <w:color w:val="1C3A36"/>
                 <w:sz w:val="17"/>
               </w:rPr>
-              <w:t>+2%</w:t>
+              <w:t>+46%</w:t>
             </w:r>
           </w:p>
         </w:tc>
@@ -707,7 +707,7 @@
                 <w:color w:val="1C3A36"/>
                 <w:sz w:val="17"/>
               </w:rPr>
-              <w:t>−8% · the floor</w:t>
+              <w:t>-8% · the floor</w:t>
             </w:r>
           </w:p>
         </w:tc>
@@ -780,7 +780,7 @@
                 <w:color w:val="1C3A36"/>
                 <w:sz w:val="17"/>
               </w:rPr>
-              <w:t>+5% · the ceiling</w:t>
+              <w:t>+5%</w:t>
             </w:r>
           </w:p>
         </w:tc>
@@ -835,7 +835,7 @@
                 <w:color w:val="1C3A36"/>
                 <w:sz w:val="17"/>
               </w:rPr>
-              <w:t>EGP 30.2</w:t>
+              <w:t>EGP 37.3</w:t>
             </w:r>
           </w:p>
         </w:tc>
@@ -853,7 +853,7 @@
                 <w:color w:val="1C3A36"/>
                 <w:sz w:val="17"/>
               </w:rPr>
-              <w:t>−3% vs EGP 31.25</w:t>
+              <w:t>+19% vs EGP 31.25</w:t>
             </w:r>
           </w:p>
         </w:tc>
@@ -1434,7 +1434,7 @@
                 <w:color w:val="1C3A36"/>
                 <w:sz w:val="17"/>
               </w:rPr>
-              <w:t>EGP 29.3</w:t>
+              <w:t>EGP 42.0</w:t>
             </w:r>
           </w:p>
         </w:tc>
@@ -1471,7 +1471,7 @@
                 <w:color w:val="1C3A36"/>
                 <w:sz w:val="17"/>
               </w:rPr>
-              <w:t>Expert 2 — normalized earnings power</w:t>
+              <w:t>Expert 1 — split-legs NAV</w:t>
             </w:r>
           </w:p>
         </w:tc>
@@ -1489,7 +1489,7 @@
                 <w:color w:val="1C3A36"/>
                 <w:sz w:val="17"/>
               </w:rPr>
-              <w:t>Mid-cycle PAT × multiple</w:t>
+              <w:t>Marks each leg; fair discount</w:t>
             </w:r>
           </w:p>
         </w:tc>
@@ -1507,7 +1507,7 @@
                 <w:color w:val="1C3A36"/>
                 <w:sz w:val="17"/>
               </w:rPr>
-              <w:t>EGP 32.9</w:t>
+              <w:t>EGP 42.0</w:t>
             </w:r>
           </w:p>
         </w:tc>
@@ -1544,7 +1544,7 @@
                 <w:color w:val="1C3A36"/>
                 <w:sz w:val="17"/>
               </w:rPr>
-              <w:t>Expert 3 — cash returns (ROCE vs WACC)</w:t>
+              <w:t>Expert 2 — normalized earnings power</w:t>
             </w:r>
           </w:p>
         </w:tc>
@@ -1562,7 +1562,7 @@
                 <w:color w:val="1C3A36"/>
                 <w:sz w:val="17"/>
               </w:rPr>
-              <w:t>Economic profit on capital employed</w:t>
+              <w:t>Mid-cycle PAT × multiple</w:t>
             </w:r>
           </w:p>
         </w:tc>
@@ -1580,7 +1580,7 @@
                 <w:color w:val="1C3A36"/>
                 <w:sz w:val="17"/>
               </w:rPr>
-              <w:t>EGP 27.5</w:t>
+              <w:t>EGP 32.9</w:t>
             </w:r>
           </w:p>
         </w:tc>
@@ -1617,6 +1617,79 @@
                 <w:color w:val="1C3A36"/>
                 <w:sz w:val="17"/>
               </w:rPr>
+              <w:t>Expert 3 — cash returns (ROCE vs WACC)</w:t>
+            </w:r>
+          </w:p>
+        </w:tc>
+        <w:tc>
+          <w:tcPr>
+            <w:tcW w:type="dxa" w:w="3384"/>
+          </w:tcPr>
+          <w:p>
+            <w:pPr>
+              <w:spacing w:after="20"/>
+              <w:jc w:val="right"/>
+            </w:pPr>
+            <w:r>
+              <w:rPr>
+                <w:color w:val="1C3A36"/>
+                <w:sz w:val="17"/>
+              </w:rPr>
+              <w:t>Economic profit on capital employed</w:t>
+            </w:r>
+          </w:p>
+        </w:tc>
+        <w:tc>
+          <w:tcPr>
+            <w:tcW w:type="dxa" w:w="2088"/>
+          </w:tcPr>
+          <w:p>
+            <w:pPr>
+              <w:spacing w:after="20"/>
+              <w:jc w:val="right"/>
+            </w:pPr>
+            <w:r>
+              <w:rPr>
+                <w:color w:val="1C3A36"/>
+                <w:sz w:val="17"/>
+              </w:rPr>
+              <w:t>EGP 39.2</w:t>
+            </w:r>
+          </w:p>
+        </w:tc>
+        <w:tc>
+          <w:tcPr>
+            <w:tcW w:type="dxa" w:w="1656"/>
+          </w:tcPr>
+          <w:p>
+            <w:pPr>
+              <w:spacing w:after="20"/>
+              <w:jc w:val="right"/>
+            </w:pPr>
+            <w:r>
+              <w:rPr>
+                <w:color w:val="1C3A36"/>
+                <w:sz w:val="17"/>
+              </w:rPr>
+              <w:t>—</w:t>
+            </w:r>
+          </w:p>
+        </w:tc>
+      </w:tr>
+      <w:tr>
+        <w:tc>
+          <w:tcPr>
+            <w:tcW w:type="dxa" w:w="3096"/>
+          </w:tcPr>
+          <w:p>
+            <w:pPr>
+              <w:spacing w:after="20"/>
+            </w:pPr>
+            <w:r>
+              <w:rPr>
+                <w:color w:val="1C3A36"/>
+                <w:sz w:val="17"/>
+              </w:rPr>
               <w:t>Panel range</w:t>
             </w:r>
           </w:p>
@@ -1635,7 +1708,7 @@
                 <w:color w:val="1C3A36"/>
                 <w:sz w:val="17"/>
               </w:rPr>
-              <w:t>Spread = the cash-conversion question</w:t>
+              <w:t>Spread = the MNT-Halan stake question</w:t>
             </w:r>
           </w:p>
         </w:tc>
@@ -1653,7 +1726,7 @@
                 <w:color w:val="1C3A36"/>
                 <w:sz w:val="17"/>
               </w:rPr>
-              <w:t>EGP 27.5–32.9</w:t>
+              <w:t>EGP 32.9–42.0</w:t>
             </w:r>
           </w:p>
         </w:tc>
@@ -1671,7 +1744,7 @@
                 <w:color w:val="1C3A36"/>
                 <w:sz w:val="17"/>
               </w:rPr>
-              <w:t>Centres ~EGP 30</w:t>
+              <w:t>Centres ~EGP 39</w:t>
             </w:r>
           </w:p>
         </w:tc>
@@ -1702,7 +1775,7 @@
           <w:color w:val="1C3A36"/>
           <w:sz w:val="19"/>
         </w:rPr>
-        <w:t>Every read lands within a few pounds of the price, and each disagreement is the same disagreement: how much of GB Auto’s reported growth converts into distributable cash. The fundamental central sits near EGP 30 — about 3% below the EGP 31.25 spot — the three experts span 27.5–32.9, and the tape, unusually, is more bullish than the value work: price has led. The three-month distribution centres above spot only because the engine’s secular drift survived the calibration gate; Appendix B shows exactly how thin that margin is.</w:t>
+        <w:t>The reads spread wider than usual, and every disagreement now traces to the same open question: what GB Corp's MNT-Halan stake actually is today. The fundamental central sits near EGP 37 — 19% below the EGP 31.25 spot — the three experts span 33–42, and the tape (unusually) sits closer to fair value than the fundamental work: price has not yet caught up to what the disclosed stake would be worth if taken at face value — or the market already suspects the stake is smaller than 42.58% today and is pricing that in. The three-month Monte Carlo distribution is unaffected either way: it prices the stock's own historical path, and its median sits above spot only because the engine's secular drift survived the calibration gate; Appendix B shows exactly how thin that margin is.</w:t>
       </w:r>
     </w:p>
     <w:p>
@@ -2247,7 +2320,7 @@
           <w:color w:val="1C3A36"/>
           <w:sz w:val="21"/>
         </w:rPr>
-        <w:t>We value GB Corp as an operating company with a captive finance arm and split the legs (§3.5-F5): blending an auto assembler-distributor, a leveraged lender and an unlisted fintech associate into one multiple would blur three different economics. The primary lens is therefore a split-legs sum-of-the-parts: the Auto operating leg on a free-cash-flow DCF; GB Capital on its adjusted operating book times a return-justified multiple; the MNT-Halan-led associate stakes at balance-sheet carrying value, cross-checked against the June-2026 funding round. A relative-multiple read and a normalized mid-cycle read complete the set. The weights and the football field are in §1.5; the swing factor — Auto cash conversion — is dissected in §1.7 and the sensitivity grids in §1.9.</w:t>
+        <w:t>We value GB Corp as an operating company with a captive finance arm and split the legs (§3.5-F5): blending an auto assembler-distributor, a leveraged lender and an unlisted fintech associate into one multiple would blur three different economics. The primary lens is therefore a split-legs sum-of-the-parts: the Auto operating leg on a free-cash-flow DCF; GB Capital on its adjusted operating book times a return-justified multiple; the MNT-Halan-led associate stakes at GB Corp’s own last-confirmed disclosed ownership, cross-checked against the June-2026 funding round. A relative-multiple read and a normalized mid-cycle read complete the set. The weights and the football field are in §1.5; the dominant swing factor is now the MNT-Halan stake itself (box below §1.1), ahead of Auto cash conversion — dissected in §1.7 — and the sensitivity grids in §1.9.</w:t>
       </w:r>
     </w:p>
     <w:p>
@@ -2275,7 +2348,7 @@
           <w:color w:val="1C3A36"/>
           <w:sz w:val="21"/>
         </w:rPr>
-        <w:t>Each leg is marked on the basis that fits it. The Auto leg takes the §1.2 DCF value; GB Capital is marked on the company’s own adjusted-ROAE equity base (the disclosure that strips the MNT-Halan revaluation out of the equity denominator: NP EGP 1,366 mn / 15.1% adjusted ROAE ⇒ ~EGP 9.5 bn of operating book) at 1.0× — the return-justified multiple for a mid-teens-ROE lender whose margin is a beneficiary of the easing cycle; and the associates are held at their EGP 13.7 bn carrying value, which the June-2026 round independently corroborates (USD 1.4 bn × an estimated ~20% stake × EGP/USD ≈ 47.5 ⇒ ~EGP 13.3 bn — the stake percentage is not separately published and is flagged as an estimate). Within the associates line, MNT-Halan is essentially the whole story: ~EGP 13.3 bn of the EGP 13.7 bn carrying value (≈97%), with Bedaya and Kaf the ~EGP 0.4 bn residual — so the line is split below rather than lumped. From the sum we deduct a 10% complexity discount for the wrapper: an auto operator, an NBFI and an unlisted fintech in one listing will not trade at the clean sum of its parts.</w:t>
+        <w:t>Each leg is marked on the basis that fits it. The Auto leg takes the §1.2 DCF value; GB Capital is marked on the company’s own adjusted-ROAE equity base (the disclosure that strips the MNT-Halan revaluation out of the equity denominator: NP EGP 1,366 mn / 15.1% adjusted ROAE ⇒ ~EGP 9.5 bn of operating book) at 1.0× — the return-justified multiple for a mid-teens-ROE lender whose margin is a beneficiary of the easing cycle; and the associates are marked by applying GB Corp’s own last-confirmed disclosed stake to the June-2026 funding round (USD 1.4 bn × 42.58% × EGP/USD ≈ 47.5 ⇒ ≈EGP 28.3 bn). CORRECTION (09-07-2026): the first draft of this study used an unsourced ~20% stake estimate — GB Corp had in fact already disclosed the figure (28-Jul-2024 press release, Tam Finans transaction: "pre-transactions GBCO’s stake in MNT-Halan was 49.45%, and following the Capital raise ... GBCO’s stake shall become 42.58% on a fully diluted basis"). That is now used as the base case, flagged as "last confirmed, pre-2026-round" rather than a guaranteed current figure — see the box below for why even this corrected number should be treated with real caution. Within the associates line, MNT-Halan is now the overwhelming majority of the value (≈99%), with Bedaya and Kaf the ≈EGP 0.4 bn residual. From the sum we deduct a 10% complexity discount for the wrapper: an auto operator, an NBFI and an unlisted fintech in one listing will not trade at the clean sum of its parts.</w:t>
       </w:r>
     </w:p>
     <w:tbl>
@@ -2490,7 +2563,7 @@
                 <w:color w:val="1C3A36"/>
                 <w:sz w:val="18"/>
               </w:rPr>
-              <w:t>Associate — MNT-Halan (~20% est.)</w:t>
+              <w:t>Associate — MNT-Halan (42.58%, last confirmed)</w:t>
             </w:r>
           </w:p>
         </w:tc>
@@ -2508,7 +2581,7 @@
                 <w:color w:val="1C3A36"/>
                 <w:sz w:val="18"/>
               </w:rPr>
-              <w:t>USD 1.4 bn Jun-26 round × ~20% stake × 47.5 EGP/USD</w:t>
+              <w:t>USD 1.4 bn Jun-26 round × 42.58% stake × 47.5 EGP/USD</w:t>
             </w:r>
           </w:p>
         </w:tc>
@@ -2526,7 +2599,7 @@
                 <w:color w:val="1C3A36"/>
                 <w:sz w:val="18"/>
               </w:rPr>
-              <w:t>13,300</w:t>
+              <w:t>28,316</w:t>
             </w:r>
           </w:p>
         </w:tc>
@@ -2620,7 +2693,7 @@
                 <w:color w:val="1C3A36"/>
                 <w:sz w:val="18"/>
               </w:rPr>
-              <w:t>= EGP 31.9 / share</w:t>
+              <w:t>= EGP 45.7 / share</w:t>
             </w:r>
           </w:p>
         </w:tc>
@@ -2638,7 +2711,7 @@
                 <w:color w:val="1C3A36"/>
                 <w:sz w:val="18"/>
               </w:rPr>
-              <w:t>34,577</w:t>
+              <w:t>49,594</w:t>
             </w:r>
           </w:p>
         </w:tc>
@@ -2694,7 +2767,7 @@
                 <w:color w:val="1C3A36"/>
                 <w:sz w:val="18"/>
               </w:rPr>
-              <w:t>(3,458)</w:t>
+              <w:t>(4,959)</w:t>
             </w:r>
           </w:p>
         </w:tc>
@@ -2732,7 +2805,7 @@
                 <w:color w:val="1C3A36"/>
                 <w:sz w:val="18"/>
               </w:rPr>
-              <w:t>= EGP 28.7 / share</w:t>
+              <w:t>= EGP 41.1 / share</w:t>
             </w:r>
           </w:p>
         </w:tc>
@@ -2750,7 +2823,7 @@
                 <w:color w:val="1C3A36"/>
                 <w:sz w:val="18"/>
               </w:rPr>
-              <w:t>31,120</w:t>
+              <w:t>44,634</w:t>
             </w:r>
           </w:p>
         </w:tc>
@@ -2772,7 +2845,7 @@
           <w:color w:val="1C3A36"/>
           <w:sz w:val="21"/>
         </w:rPr>
-        <w:t>SOTP base ≈ EGP 28.7/share</w:t>
+        <w:t>SOTP base ≈ EGP 41.1/share</w:t>
       </w:r>
       <w:r>
         <w:rPr>
@@ -2781,7 +2854,7 @@
           <w:color w:val="1C3A36"/>
           <w:sz w:val="21"/>
         </w:rPr>
-        <w:t>, with a bear–bull span of 13–50 driven mainly by the Auto margin and working-capital path, the discount, and the two financial marks (§1.9). The market-implied read is instructive: market cap less the lender and the associates leaves ~EGP 10.7 bn for the Auto leg — almost exactly our DCF’s 11.4 bn, or ~4.0× FY26E Auto EBITDA. The market is not mispricing the parts; it is pricing the wrapper at roughly our discount.</w:t>
+        <w:t>, with a very wide bear–bull span of 22–66 — driven now mainly by the MNT-Halan stake and mark (see below), with the Auto margin/working-capital path and the discount a secondary factor (§1.9). The market-implied read has flipped from reassuring to a genuine red flag: market cap less the lender and the associates at the corrected stake would need to be strongly negative for the Auto leg — an impossibility for a profitable, EGP 66bn-revenue business — which is the clearest signal available that 42.58% overstates GB Corp’s current stake and that real dilution has occurred since mid-2024 that this study cannot yet quantify precisely.</w:t>
       </w:r>
     </w:p>
     <w:p>
@@ -2795,7 +2868,7 @@
           <w:color w:val="1C3A36"/>
           <w:sz w:val="24"/>
         </w:rPr>
-        <w:t>What the MNT-Halan stake is worth inside this valuation</w:t>
+        <w:t>What the MNT-Halan stake is worth inside this valuation — and why the percentage itself is now the crux</w:t>
       </w:r>
     </w:p>
     <w:p>
@@ -2809,7 +2882,7 @@
           <w:color w:val="1C3A36"/>
           <w:sz w:val="19"/>
         </w:rPr>
-        <w:t>Because a single unlisted mark this large deserves its own arithmetic, here is MNT-Halan’s exact footprint — every figure derived from the SOTP above:</w:t>
+        <w:t>Because this single line now swings the whole valuation more than any other input, here is its exact footprint, followed by why the corrected 42.58% figure should still be treated as an upper bound rather than a settled number:</w:t>
       </w:r>
     </w:p>
     <w:tbl>
@@ -2892,7 +2965,7 @@
                 <w:color w:val="1C3A36"/>
                 <w:sz w:val="18"/>
               </w:rPr>
-              <w:t>Implied value at the June-2026 round</w:t>
+              <w:t>Implied value at the June-2026 round (42.58% stake)</w:t>
             </w:r>
           </w:p>
         </w:tc>
@@ -2910,7 +2983,7 @@
                 <w:color w:val="1C3A36"/>
                 <w:sz w:val="18"/>
               </w:rPr>
-              <w:t>USD 1.4 bn × ~20% est. stake × 47.5 = EGP 13,300 mn</w:t>
+              <w:t>USD 1.4 bn × 42.58% × 47.5 = EGP 28,316 mn</w:t>
             </w:r>
           </w:p>
         </w:tc>
@@ -2948,7 +3021,7 @@
                 <w:color w:val="1C3A36"/>
                 <w:sz w:val="18"/>
               </w:rPr>
-              <w:t>EGP 12.25 — 38% of the EGP 31.9 pre-discount NAV</w:t>
+              <w:t>EGP 26.09 — 57% of the EGP 45.7 pre-discount NAV</w:t>
             </w:r>
           </w:p>
         </w:tc>
@@ -2986,7 +3059,7 @@
                 <w:color w:val="1C3A36"/>
                 <w:sz w:val="18"/>
               </w:rPr>
-              <w:t>EGP 11.03 — 38% of the EGP 28.7 SOTP</w:t>
+              <w:t>EGP 23.48 — same 57% share of the EGP 41.1 SOTP</w:t>
             </w:r>
           </w:p>
         </w:tc>
@@ -3024,7 +3097,7 @@
                 <w:color w:val="1C3A36"/>
                 <w:sz w:val="18"/>
               </w:rPr>
-              <w:t>≈35% — roughly a third of GB Corp’s market value</w:t>
+              <w:t>≈75% — this is the red flag (see below)</w:t>
             </w:r>
           </w:p>
         </w:tc>
@@ -3044,7 +3117,7 @@
                 <w:color w:val="1C3A36"/>
                 <w:sz w:val="18"/>
               </w:rPr>
-              <w:t>Sensitivity to the mark</w:t>
+              <w:t>Every 5 percentage points of stake</w:t>
             </w:r>
           </w:p>
         </w:tc>
@@ -3062,7 +3135,146 @@
                 <w:color w:val="1C3A36"/>
                 <w:sz w:val="18"/>
               </w:rPr>
-              <w:t>each ±0.2× on the mark = ∓EGP 2.2/share (0.8× → SOTP 26.6; 1.2× → 31.0)</w:t>
+              <w:t>≈EGP 3.3/share of SOTP fair value</w:t>
+            </w:r>
+          </w:p>
+        </w:tc>
+      </w:tr>
+    </w:tbl>
+    <w:p>
+      <w:pPr>
+        <w:spacing w:after="40"/>
+      </w:pPr>
+    </w:p>
+    <w:p>
+      <w:pPr>
+        <w:spacing w:after="80" w:before="200"/>
+      </w:pPr>
+      <w:r>
+        <w:rPr>
+          <w:b/>
+          <w:i w:val="0"/>
+          <w:color w:val="1C3A36"/>
+          <w:sz w:val="24"/>
+        </w:rPr>
+        <w:t>Stake-sensitivity — the number that actually matters</w:t>
+      </w:r>
+    </w:p>
+    <w:p>
+      <w:pPr>
+        <w:spacing w:after="120" w:before="0"/>
+      </w:pPr>
+      <w:r>
+        <w:rPr>
+          <w:b w:val="0"/>
+          <w:i w:val="0"/>
+          <w:color w:val="1C3A36"/>
+          <w:sz w:val="19"/>
+        </w:rPr>
+        <w:t>GB Corp’s 42.58% is the last figure the company confirmed in writing (28-Jul-2024), but two capital events since — a 2024 international raise (GB Corp itself re-invested, per the participant list, so may have partly defended its pro-rata share) and the small Jun-2026 Al Ahly Capital first close (initial ~USD 30mn into a USD 1.4bn company, second closing pending, size undisclosed) — will have diluted it further by an unquantified amount. The table below shows the resulting SOTP fair value across a plausible range, so the reader can substitute their own view of the current stake rather than take 42.58% on faith:</w:t>
+      </w:r>
+    </w:p>
+    <w:tbl>
+      <w:tblPr>
+        <w:tblW w:type="auto" w:w="0"/>
+        <w:jc w:val="center"/>
+        <w:tblLook w:firstColumn="1" w:firstRow="1" w:lastColumn="0" w:lastRow="0" w:noHBand="0" w:noVBand="1" w:val="04A0"/>
+        <w:tblLayout w:type="fixed"/>
+        <w:tblCellMar>
+          <w:top w:w="40" w:type="dxa"/>
+          <w:left w:w="90" w:type="dxa"/>
+          <w:bottom w:w="40" w:type="dxa"/>
+          <w:right w:w="90" w:type="dxa"/>
+        </w:tblCellMar>
+        <w:tblBorders>
+          <w:top w:val="single" w:sz="4" w:space="0" w:color="C9D4D1"/>
+          <w:left w:val="single" w:sz="4" w:space="0" w:color="C9D4D1"/>
+          <w:bottom w:val="single" w:sz="4" w:space="0" w:color="C9D4D1"/>
+          <w:right w:val="single" w:sz="4" w:space="0" w:color="C9D4D1"/>
+          <w:insideH w:val="single" w:sz="4" w:space="0" w:color="C9D4D1"/>
+          <w:insideV w:val="single" w:sz="4" w:space="0" w:color="C9D4D1"/>
+        </w:tblBorders>
+      </w:tblPr>
+      <w:tblGrid>
+        <w:gridCol w:w="2520"/>
+        <w:gridCol w:w="2520"/>
+        <w:gridCol w:w="2520"/>
+        <w:gridCol w:w="2520"/>
+      </w:tblGrid>
+      <w:tr>
+        <w:tc>
+          <w:tcPr>
+            <w:tcW w:type="dxa" w:w="2160"/>
+            <w:shd w:val="clear" w:color="auto" w:fill="EAF0EE"/>
+          </w:tcPr>
+          <w:p>
+            <w:pPr>
+              <w:spacing w:after="20"/>
+            </w:pPr>
+            <w:r>
+              <w:rPr>
+                <w:b/>
+                <w:color w:val="1C3A36"/>
+                <w:sz w:val="17"/>
+              </w:rPr>
+              <w:t>GB stake in MNT-Halan</w:t>
+            </w:r>
+          </w:p>
+        </w:tc>
+        <w:tc>
+          <w:tcPr>
+            <w:tcW w:type="dxa" w:w="2448"/>
+            <w:shd w:val="clear" w:color="auto" w:fill="EAF0EE"/>
+          </w:tcPr>
+          <w:p>
+            <w:pPr>
+              <w:spacing w:after="20"/>
+            </w:pPr>
+            <w:r>
+              <w:rPr>
+                <w:b/>
+                <w:color w:val="1C3A36"/>
+                <w:sz w:val="17"/>
+              </w:rPr>
+              <w:t>MNT-Halan value (EGP mn)</w:t>
+            </w:r>
+          </w:p>
+        </w:tc>
+        <w:tc>
+          <w:tcPr>
+            <w:tcW w:type="dxa" w:w="1872"/>
+            <w:shd w:val="clear" w:color="auto" w:fill="EAF0EE"/>
+          </w:tcPr>
+          <w:p>
+            <w:pPr>
+              <w:spacing w:after="20"/>
+            </w:pPr>
+            <w:r>
+              <w:rPr>
+                <w:b/>
+                <w:color w:val="1C3A36"/>
+                <w:sz w:val="17"/>
+              </w:rPr>
+              <w:t>SOTP fair value/sh</w:t>
+            </w:r>
+          </w:p>
+        </w:tc>
+        <w:tc>
+          <w:tcPr>
+            <w:tcW w:type="dxa" w:w="3744"/>
+            <w:shd w:val="clear" w:color="auto" w:fill="EAF0EE"/>
+          </w:tcPr>
+          <w:p>
+            <w:pPr>
+              <w:spacing w:after="20"/>
+            </w:pPr>
+            <w:r>
+              <w:rPr>
+                <w:b/>
+                <w:color w:val="1C3A36"/>
+                <w:sz w:val="17"/>
+              </w:rPr>
+              <w:t>Note</w:t>
             </w:r>
           </w:p>
         </w:tc>
@@ -3070,7 +3282,7 @@
       <w:tr>
         <w:tc>
           <w:tcPr>
-            <w:tcW w:type="dxa" w:w="3888"/>
+            <w:tcW w:type="dxa" w:w="2160"/>
           </w:tcPr>
           <w:p>
             <w:pPr>
@@ -3080,27 +3292,430 @@
               <w:rPr>
                 <w:b/>
                 <w:color w:val="1C3A36"/>
-                <w:sz w:val="18"/>
-              </w:rPr>
-              <w:t>If the second closing prices at USD 2.0 bn</w:t>
-            </w:r>
-          </w:p>
-        </w:tc>
-        <w:tc>
-          <w:tcPr>
-            <w:tcW w:type="dxa" w:w="6336"/>
-          </w:tcPr>
-          <w:p>
-            <w:pPr>
-              <w:spacing w:after="20"/>
-              <w:jc w:val="right"/>
-            </w:pPr>
-            <w:r>
-              <w:rPr>
-                <w:color w:val="1C3A36"/>
-                <w:sz w:val="18"/>
-              </w:rPr>
-              <w:t>+EGP 4.7/share → SOTP ≈ 33.5</w:t>
+                <w:sz w:val="17"/>
+              </w:rPr>
+              <w:t>20.00%</w:t>
+            </w:r>
+          </w:p>
+        </w:tc>
+        <w:tc>
+          <w:tcPr>
+            <w:tcW w:type="dxa" w:w="2448"/>
+          </w:tcPr>
+          <w:p>
+            <w:pPr>
+              <w:spacing w:after="20"/>
+              <w:jc w:val="right"/>
+            </w:pPr>
+            <w:r>
+              <w:rPr>
+                <w:color w:val="1C3A36"/>
+                <w:sz w:val="17"/>
+              </w:rPr>
+              <w:t>13,300</w:t>
+            </w:r>
+          </w:p>
+        </w:tc>
+        <w:tc>
+          <w:tcPr>
+            <w:tcW w:type="dxa" w:w="1872"/>
+          </w:tcPr>
+          <w:p>
+            <w:pPr>
+              <w:spacing w:after="20"/>
+              <w:jc w:val="right"/>
+            </w:pPr>
+            <w:r>
+              <w:rPr>
+                <w:color w:val="1C3A36"/>
+                <w:sz w:val="17"/>
+              </w:rPr>
+              <w:t>28.7</w:t>
+            </w:r>
+          </w:p>
+        </w:tc>
+        <w:tc>
+          <w:tcPr>
+            <w:tcW w:type="dxa" w:w="3744"/>
+          </w:tcPr>
+          <w:p>
+            <w:pPr>
+              <w:spacing w:after="20"/>
+              <w:jc w:val="right"/>
+            </w:pPr>
+            <w:r>
+              <w:rPr>
+                <w:color w:val="1C3A36"/>
+                <w:sz w:val="17"/>
+              </w:rPr>
+              <w:t>prior placeholder — wrong, superseded</w:t>
+            </w:r>
+          </w:p>
+        </w:tc>
+      </w:tr>
+      <w:tr>
+        <w:tc>
+          <w:tcPr>
+            <w:tcW w:type="dxa" w:w="2160"/>
+          </w:tcPr>
+          <w:p>
+            <w:pPr>
+              <w:spacing w:after="20"/>
+            </w:pPr>
+            <w:r>
+              <w:rPr>
+                <w:b/>
+                <w:color w:val="1C3A36"/>
+                <w:sz w:val="17"/>
+              </w:rPr>
+              <w:t>25.00%</w:t>
+            </w:r>
+          </w:p>
+        </w:tc>
+        <w:tc>
+          <w:tcPr>
+            <w:tcW w:type="dxa" w:w="2448"/>
+          </w:tcPr>
+          <w:p>
+            <w:pPr>
+              <w:spacing w:after="20"/>
+              <w:jc w:val="right"/>
+            </w:pPr>
+            <w:r>
+              <w:rPr>
+                <w:color w:val="1C3A36"/>
+                <w:sz w:val="17"/>
+              </w:rPr>
+              <w:t>16,625</w:t>
+            </w:r>
+          </w:p>
+        </w:tc>
+        <w:tc>
+          <w:tcPr>
+            <w:tcW w:type="dxa" w:w="1872"/>
+          </w:tcPr>
+          <w:p>
+            <w:pPr>
+              <w:spacing w:after="20"/>
+              <w:jc w:val="right"/>
+            </w:pPr>
+            <w:r>
+              <w:rPr>
+                <w:color w:val="1C3A36"/>
+                <w:sz w:val="17"/>
+              </w:rPr>
+              <w:t>31.4</w:t>
+            </w:r>
+          </w:p>
+        </w:tc>
+        <w:tc>
+          <w:tcPr>
+            <w:tcW w:type="dxa" w:w="3744"/>
+          </w:tcPr>
+          <w:p>
+            <w:pPr>
+              <w:spacing w:after="20"/>
+              <w:jc w:val="right"/>
+            </w:pPr>
+            <w:r>
+              <w:rPr>
+                <w:color w:val="1C3A36"/>
+                <w:sz w:val="17"/>
+              </w:rPr>
+            </w:r>
+          </w:p>
+        </w:tc>
+      </w:tr>
+      <w:tr>
+        <w:tc>
+          <w:tcPr>
+            <w:tcW w:type="dxa" w:w="2160"/>
+          </w:tcPr>
+          <w:p>
+            <w:pPr>
+              <w:spacing w:after="20"/>
+            </w:pPr>
+            <w:r>
+              <w:rPr>
+                <w:b/>
+                <w:color w:val="1C3A36"/>
+                <w:sz w:val="17"/>
+              </w:rPr>
+              <w:t>30.00%</w:t>
+            </w:r>
+          </w:p>
+        </w:tc>
+        <w:tc>
+          <w:tcPr>
+            <w:tcW w:type="dxa" w:w="2448"/>
+          </w:tcPr>
+          <w:p>
+            <w:pPr>
+              <w:spacing w:after="20"/>
+              <w:jc w:val="right"/>
+            </w:pPr>
+            <w:r>
+              <w:rPr>
+                <w:color w:val="1C3A36"/>
+                <w:sz w:val="17"/>
+              </w:rPr>
+              <w:t>19,950</w:t>
+            </w:r>
+          </w:p>
+        </w:tc>
+        <w:tc>
+          <w:tcPr>
+            <w:tcW w:type="dxa" w:w="1872"/>
+          </w:tcPr>
+          <w:p>
+            <w:pPr>
+              <w:spacing w:after="20"/>
+              <w:jc w:val="right"/>
+            </w:pPr>
+            <w:r>
+              <w:rPr>
+                <w:color w:val="1C3A36"/>
+                <w:sz w:val="17"/>
+              </w:rPr>
+              <w:t>34.2</w:t>
+            </w:r>
+          </w:p>
+        </w:tc>
+        <w:tc>
+          <w:tcPr>
+            <w:tcW w:type="dxa" w:w="3744"/>
+          </w:tcPr>
+          <w:p>
+            <w:pPr>
+              <w:spacing w:after="20"/>
+              <w:jc w:val="right"/>
+            </w:pPr>
+            <w:r>
+              <w:rPr>
+                <w:color w:val="1C3A36"/>
+                <w:sz w:val="17"/>
+              </w:rPr>
+            </w:r>
+          </w:p>
+        </w:tc>
+      </w:tr>
+      <w:tr>
+        <w:tc>
+          <w:tcPr>
+            <w:tcW w:type="dxa" w:w="2160"/>
+          </w:tcPr>
+          <w:p>
+            <w:pPr>
+              <w:spacing w:after="20"/>
+            </w:pPr>
+            <w:r>
+              <w:rPr>
+                <w:b/>
+                <w:color w:val="1C3A36"/>
+                <w:sz w:val="17"/>
+              </w:rPr>
+              <w:t>35.45%</w:t>
+            </w:r>
+          </w:p>
+        </w:tc>
+        <w:tc>
+          <w:tcPr>
+            <w:tcW w:type="dxa" w:w="2448"/>
+          </w:tcPr>
+          <w:p>
+            <w:pPr>
+              <w:spacing w:after="20"/>
+              <w:jc w:val="right"/>
+            </w:pPr>
+            <w:r>
+              <w:rPr>
+                <w:color w:val="1C3A36"/>
+                <w:sz w:val="17"/>
+              </w:rPr>
+              <w:t>23,574</w:t>
+            </w:r>
+          </w:p>
+        </w:tc>
+        <w:tc>
+          <w:tcPr>
+            <w:tcW w:type="dxa" w:w="1872"/>
+          </w:tcPr>
+          <w:p>
+            <w:pPr>
+              <w:spacing w:after="20"/>
+              <w:jc w:val="right"/>
+            </w:pPr>
+            <w:r>
+              <w:rPr>
+                <w:color w:val="1C3A36"/>
+                <w:sz w:val="17"/>
+              </w:rPr>
+              <w:t>37.2</w:t>
+            </w:r>
+          </w:p>
+        </w:tc>
+        <w:tc>
+          <w:tcPr>
+            <w:tcW w:type="dxa" w:w="3744"/>
+          </w:tcPr>
+          <w:p>
+            <w:pPr>
+              <w:spacing w:after="20"/>
+              <w:jc w:val="right"/>
+            </w:pPr>
+            <w:r>
+              <w:rPr>
+                <w:color w:val="1C3A36"/>
+                <w:sz w:val="17"/>
+              </w:rPr>
+              <w:t>if GB Corp only defended the 2024 raise pro-rata</w:t>
+            </w:r>
+          </w:p>
+        </w:tc>
+      </w:tr>
+      <w:tr>
+        <w:tc>
+          <w:tcPr>
+            <w:tcW w:type="dxa" w:w="2160"/>
+          </w:tcPr>
+          <w:p>
+            <w:pPr>
+              <w:spacing w:after="20"/>
+            </w:pPr>
+            <w:r>
+              <w:rPr>
+                <w:b/>
+                <w:color w:val="1C3A36"/>
+                <w:sz w:val="17"/>
+              </w:rPr>
+              <w:t>40.00%</w:t>
+            </w:r>
+          </w:p>
+        </w:tc>
+        <w:tc>
+          <w:tcPr>
+            <w:tcW w:type="dxa" w:w="2448"/>
+          </w:tcPr>
+          <w:p>
+            <w:pPr>
+              <w:spacing w:after="20"/>
+              <w:jc w:val="right"/>
+            </w:pPr>
+            <w:r>
+              <w:rPr>
+                <w:color w:val="1C3A36"/>
+                <w:sz w:val="17"/>
+              </w:rPr>
+              <w:t>26,600</w:t>
+            </w:r>
+          </w:p>
+        </w:tc>
+        <w:tc>
+          <w:tcPr>
+            <w:tcW w:type="dxa" w:w="1872"/>
+          </w:tcPr>
+          <w:p>
+            <w:pPr>
+              <w:spacing w:after="20"/>
+              <w:jc w:val="right"/>
+            </w:pPr>
+            <w:r>
+              <w:rPr>
+                <w:color w:val="1C3A36"/>
+                <w:sz w:val="17"/>
+              </w:rPr>
+              <w:t>39.7</w:t>
+            </w:r>
+          </w:p>
+        </w:tc>
+        <w:tc>
+          <w:tcPr>
+            <w:tcW w:type="dxa" w:w="3744"/>
+          </w:tcPr>
+          <w:p>
+            <w:pPr>
+              <w:spacing w:after="20"/>
+              <w:jc w:val="right"/>
+            </w:pPr>
+            <w:r>
+              <w:rPr>
+                <w:color w:val="1C3A36"/>
+                <w:sz w:val="17"/>
+              </w:rPr>
+            </w:r>
+          </w:p>
+        </w:tc>
+      </w:tr>
+      <w:tr>
+        <w:tc>
+          <w:tcPr>
+            <w:tcW w:type="dxa" w:w="2160"/>
+          </w:tcPr>
+          <w:p>
+            <w:pPr>
+              <w:spacing w:after="20"/>
+            </w:pPr>
+            <w:r>
+              <w:rPr>
+                <w:b/>
+                <w:color w:val="1C3A36"/>
+                <w:sz w:val="17"/>
+              </w:rPr>
+              <w:t>42.58%</w:t>
+            </w:r>
+          </w:p>
+        </w:tc>
+        <w:tc>
+          <w:tcPr>
+            <w:tcW w:type="dxa" w:w="2448"/>
+          </w:tcPr>
+          <w:p>
+            <w:pPr>
+              <w:spacing w:after="20"/>
+              <w:jc w:val="right"/>
+            </w:pPr>
+            <w:r>
+              <w:rPr>
+                <w:color w:val="1C3A36"/>
+                <w:sz w:val="17"/>
+              </w:rPr>
+              <w:t>28,316</w:t>
+            </w:r>
+          </w:p>
+        </w:tc>
+        <w:tc>
+          <w:tcPr>
+            <w:tcW w:type="dxa" w:w="1872"/>
+          </w:tcPr>
+          <w:p>
+            <w:pPr>
+              <w:spacing w:after="20"/>
+              <w:jc w:val="right"/>
+            </w:pPr>
+            <w:r>
+              <w:rPr>
+                <w:color w:val="1C3A36"/>
+                <w:sz w:val="17"/>
+              </w:rPr>
+              <w:t>41.1</w:t>
+            </w:r>
+          </w:p>
+        </w:tc>
+        <w:tc>
+          <w:tcPr>
+            <w:tcW w:type="dxa" w:w="3744"/>
+          </w:tcPr>
+          <w:p>
+            <w:pPr>
+              <w:spacing w:after="20"/>
+              <w:jc w:val="right"/>
+            </w:pPr>
+            <w:r>
+              <w:rPr>
+                <w:color w:val="1C3A36"/>
+                <w:sz w:val="17"/>
+              </w:rPr>
+              <w:t>last confirmed disclosure — pre-2026-round base case</w:t>
             </w:r>
           </w:p>
         </w:tc>
@@ -3117,12 +3732,21 @@
       </w:pPr>
       <w:r>
         <w:rPr>
+          <w:b/>
+          <w:i w:val="0"/>
+          <w:color w:val="1C3A36"/>
+          <w:sz w:val="19"/>
+        </w:rPr>
+        <w:t xml:space="preserve">In plain terms: </w:t>
+      </w:r>
+      <w:r>
+        <w:rPr>
           <w:b w:val="0"/>
           <w:i w:val="0"/>
           <w:color w:val="1C3A36"/>
           <w:sz w:val="19"/>
         </w:rPr>
-        <w:t>In plain terms: roughly a third of GB Corp’s market value is a ~20% stake in an unlisted fintech, marked to a first-close price at which cash actually changed hands — the most objective mark available, but a private one. That is why the second closing is a top-three catalyst (§5), why the bear case carries the stake at 0.8× (§7), and why the stake percentage itself — estimated, not separately published — is flagged wherever it appears.</w:t>
+        <w:t>this study cannot currently pin down GB Corp's precise MNT-Halan stake to the decimal, and that single unknown now matters more to the fair value than every other assumption in the model combined. The base case (42.58%) is the last hard, company-disclosed number and is used because it is sourced — not because it is certain to still be current. Anyone relying on this study for a decision should confirm the FY25 annual-report associates footnote (GB Corp's own related-party disclosure typically states ownership % directly) before leaning on any single point in the table above. The bear case in this study's football field (§1.5) carries the stake and the mark down together; the crux (§1.7) and caveats (§7) return to this explicitly.</w:t>
       </w:r>
     </w:p>
     <w:p>
@@ -5837,7 +6461,7 @@
                 <w:color w:val="1C3A36"/>
                 <w:sz w:val="18"/>
               </w:rPr>
-              <w:t>13</w:t>
+              <w:t>22</w:t>
             </w:r>
           </w:p>
         </w:tc>
@@ -5855,7 +6479,7 @@
                 <w:color w:val="1C3A36"/>
                 <w:sz w:val="18"/>
               </w:rPr>
-              <w:t>28.7</w:t>
+              <w:t>41.1</w:t>
             </w:r>
           </w:p>
         </w:tc>
@@ -5873,7 +6497,7 @@
                 <w:color w:val="1C3A36"/>
                 <w:sz w:val="18"/>
               </w:rPr>
-              <w:t>50</w:t>
+              <w:t>66</w:t>
             </w:r>
           </w:p>
         </w:tc>
@@ -5929,7 +6553,7 @@
                 <w:color w:val="1C3A36"/>
                 <w:sz w:val="18"/>
               </w:rPr>
-              <w:t>16</w:t>
+              <w:t>27</w:t>
             </w:r>
           </w:p>
         </w:tc>
@@ -5947,7 +6571,7 @@
                 <w:color w:val="1C3A36"/>
                 <w:sz w:val="18"/>
               </w:rPr>
-              <w:t>31.9</w:t>
+              <w:t>45.7</w:t>
             </w:r>
           </w:p>
         </w:tc>
@@ -5965,7 +6589,7 @@
                 <w:color w:val="1C3A36"/>
                 <w:sz w:val="18"/>
               </w:rPr>
-              <w:t>52</w:t>
+              <w:t>69</w:t>
             </w:r>
           </w:p>
         </w:tc>
@@ -6209,7 +6833,7 @@
                 <w:color w:val="1C3A36"/>
                 <w:sz w:val="18"/>
               </w:rPr>
-              <w:t>18.8</w:t>
+              <w:t>24.1</w:t>
             </w:r>
           </w:p>
         </w:tc>
@@ -6229,7 +6853,7 @@
                 <w:color w:val="1C3A36"/>
                 <w:sz w:val="18"/>
               </w:rPr>
-              <w:t>30.2</w:t>
+              <w:t>37.3</w:t>
             </w:r>
           </w:p>
         </w:tc>
@@ -6249,7 +6873,7 @@
                 <w:color w:val="1C3A36"/>
                 <w:sz w:val="18"/>
               </w:rPr>
-              <w:t>45.1</w:t>
+              <w:t>53.9</w:t>
             </w:r>
           </w:p>
         </w:tc>
@@ -6325,7 +6949,7 @@
           <w:color w:val="1C3A36"/>
           <w:sz w:val="21"/>
         </w:rPr>
-        <w:t>Central fair value ≈ EGP 30.2/share</w:t>
+        <w:t>Central fair value ≈ EGP 37.3/share</w:t>
       </w:r>
       <w:r>
         <w:rPr>
@@ -6334,7 +6958,7 @@
           <w:color w:val="1C3A36"/>
           <w:sz w:val="21"/>
         </w:rPr>
-        <w:t>, about 3% below spot. The tightness of the bases (28.7 to 32.9) is itself the message: this is not a deep-value or a clearly-expensive name, but a fairly-priced operator whose next leg of value depends on cash conversion and the rate cycle rather than on the market discovering the story.</w:t>
+        <w:t>, 19% below spot. Unlike a typical Testahil football field, the width here is not really four independent views converging — the SOTP and pre-discount NAV lenses (41.1 and 45.7) both carry the same MNT-Halan stake assumption, so they move together with it, while the relative (28.9) and normalized (32.9) lenses don’t touch the stake at all and sit much closer to spot. That split is itself informative: strip out the MNT-Halan question and this is a fairly-priced operator; include it at the last disclosed stake and it looks meaningfully cheap. Which is right depends entirely on a number this study cannot currently confirm to the decimal (§1.1 box).</w:t>
       </w:r>
     </w:p>
     <w:p>
@@ -7810,7 +8434,7 @@
           <w:color w:val="1C3A36"/>
           <w:sz w:val="24"/>
         </w:rPr>
-        <w:t>1.7  Cash conversion and the rate path — the crux</w:t>
+        <w:t>1.7  The crux: the MNT-Halan stake, then cash conversion and the rate path</w:t>
       </w:r>
     </w:p>
     <w:p>
@@ -7824,7 +8448,7 @@
           <w:color w:val="1C3A36"/>
           <w:sz w:val="21"/>
         </w:rPr>
-        <w:t>Two judgments drive the valuation more than any other. First, where working-capital intensity settles (the observable, disclosed unit: net Auto working capital as % of Auto revenue — device A-1). It ran 18.7% in FY23, 22.9% in FY24 and 28.5% in FY25 as import-restriction payables normalized and inventory was pre-built for Sadat; we glide it to 21.5% by FY30E. Each percentage point of steady-state intensity is worth roughly EGP 4–5/share of SOTP value — a bigger lever than a half-turn of the P/E. Second, the Egyptian nominal-rate path: the 22.0% WACC against 11.5% terminal growth is a 10.5-pt real spread struck off a 19% blended risk-free; every 100 bp the CBE easing cycle takes out of that spread adds ~EGP 3/share (§1.9 grid). A third, binary-style exposure (§3.5-E device 6, applied cross-class): roughly a fifth of PC revenue is Iraq/Jordan, where the regional conflict cut 1Q26 volumes — a full-year regional freeze would take ~EGP 1.5–2 bn off Auto gross profit, worth ~EGP 2–3/share.</w:t>
+        <w:t>Three judgments drive the valuation, in order of size. First and now by far the largest: what GB Corp’s current MNT-Halan stake actually is (§1.1 box). Every 5 percentage points is worth ≈EGP 3.3/share of SOTP fair value — roughly ten times the impact of a full percentage point on Auto working capital. This study uses 42.58% (GB Corp’s last disclosed figure, 28-Jul-2024) as a sourced but likely-stale base case; the honest range runs from there down to whatever dilution two subsequent, unquantified capital events have produced. Second, where Auto working-capital intensity settles (the observable, disclosed unit: net Auto working capital as % of Auto revenue — device A-1). It ran 18.7% in FY23, 22.9% in FY24 and 28.5% in FY25 as import-restriction payables normalized and inventory was pre-built for Sadat; we glide it to 21.5% by FY30E. Each percentage point of steady-state intensity is worth roughly EGP 4–5/share of SOTP value. Third, the Egyptian nominal-rate path: the 22.0% WACC against 11.5% terminal growth is a 10.5-pt real spread struck off a 19% blended risk-free; every 100 bp the CBE easing cycle takes out of that spread adds ~EGP 3/share (§1.9 grid). A fourth, binary-style exposure (§3.5-E device 6, applied cross-class): roughly a fifth of PC revenue is Iraq/Jordan, where the regional conflict cut 1Q26 volumes — a full-year regional freeze would take ~EGP 1.5–2 bn off Auto gross profit, worth ~EGP 2–3/share.</w:t>
       </w:r>
     </w:p>
     <w:p>
@@ -8217,7 +8841,7 @@
           <w:color w:val="1C3A36"/>
           <w:sz w:val="21"/>
         </w:rPr>
-        <w:t>Holding the lender and associate marks at base, the first grid re-prices the SOTP across the Auto gross-margin path and the complexity discount; the second across the WACC × terminal-growth spread (the rate-cycle bet made explicit, device A-7).</w:t>
+        <w:t>Holding the lender and associate marks (and the MNT-Halan stake, at the 42.58% base case) fixed, the first grid re-prices the SOTP across the Auto gross-margin path and the complexity discount; the second across the WACC × terminal-growth spread (the rate-cycle bet made explicit, device A-7). The stake itself — now the larger swing factor — is sensitized separately in the §1.1 box, since it dominates both of these grids combined.</w:t>
       </w:r>
     </w:p>
     <w:p>
@@ -8452,7 +9076,7 @@
                 <w:color w:val="1C3A36"/>
                 <w:sz w:val="18"/>
               </w:rPr>
-              <w:t>30.2</w:t>
+              <w:t>42.6</w:t>
             </w:r>
           </w:p>
         </w:tc>
@@ -8470,7 +9094,7 @@
                 <w:color w:val="1C3A36"/>
                 <w:sz w:val="18"/>
               </w:rPr>
-              <w:t>32.3</w:t>
+              <w:t>44.8</w:t>
             </w:r>
           </w:p>
         </w:tc>
@@ -8488,7 +9112,7 @@
                 <w:color w:val="1C3A36"/>
                 <w:sz w:val="18"/>
               </w:rPr>
-              <w:t>35.0</w:t>
+              <w:t>47.4</w:t>
             </w:r>
           </w:p>
         </w:tc>
@@ -8506,7 +9130,7 @@
                 <w:color w:val="1C3A36"/>
                 <w:sz w:val="18"/>
               </w:rPr>
-              <w:t>38.4</w:t>
+              <w:t>50.8</w:t>
             </w:r>
           </w:p>
         </w:tc>
@@ -8524,7 +9148,7 @@
                 <w:color w:val="1C3A36"/>
                 <w:sz w:val="18"/>
               </w:rPr>
-              <w:t>42.8</w:t>
+              <w:t>55.2</w:t>
             </w:r>
           </w:p>
         </w:tc>
@@ -8562,7 +9186,7 @@
                 <w:color w:val="1C3A36"/>
                 <w:sz w:val="18"/>
               </w:rPr>
-              <w:t>27.7</w:t>
+              <w:t>40.1</w:t>
             </w:r>
           </w:p>
         </w:tc>
@@ -8580,7 +9204,7 @@
                 <w:color w:val="1C3A36"/>
                 <w:sz w:val="18"/>
               </w:rPr>
-              <w:t>29.4</w:t>
+              <w:t>41.9</w:t>
             </w:r>
           </w:p>
         </w:tc>
@@ -8598,7 +9222,7 @@
                 <w:color w:val="1C3A36"/>
                 <w:sz w:val="18"/>
               </w:rPr>
-              <w:t>31.5</w:t>
+              <w:t>43.9</w:t>
             </w:r>
           </w:p>
         </w:tc>
@@ -8616,7 +9240,7 @@
                 <w:color w:val="1C3A36"/>
                 <w:sz w:val="18"/>
               </w:rPr>
-              <w:t>34.1</w:t>
+              <w:t>46.5</w:t>
             </w:r>
           </w:p>
         </w:tc>
@@ -8634,7 +9258,7 @@
                 <w:color w:val="1C3A36"/>
                 <w:sz w:val="18"/>
               </w:rPr>
-              <w:t>37.3</w:t>
+              <w:t>49.8</w:t>
             </w:r>
           </w:p>
         </w:tc>
@@ -8672,7 +9296,7 @@
                 <w:color w:val="1C3A36"/>
                 <w:sz w:val="18"/>
               </w:rPr>
-              <w:t>25.6</w:t>
+              <w:t>38.0</w:t>
             </w:r>
           </w:p>
         </w:tc>
@@ -8690,7 +9314,7 @@
                 <w:color w:val="1C3A36"/>
                 <w:sz w:val="18"/>
               </w:rPr>
-              <w:t>27.0</w:t>
+              <w:t>39.4</w:t>
             </w:r>
           </w:p>
         </w:tc>
@@ -8708,7 +9332,7 @@
                 <w:color w:val="1C3A36"/>
                 <w:sz w:val="18"/>
               </w:rPr>
-              <w:t>28.7</w:t>
+              <w:t>41.1</w:t>
             </w:r>
           </w:p>
         </w:tc>
@@ -8726,7 +9350,7 @@
                 <w:color w:val="1C3A36"/>
                 <w:sz w:val="18"/>
               </w:rPr>
-              <w:t>30.7</w:t>
+              <w:t>43.1</w:t>
             </w:r>
           </w:p>
         </w:tc>
@@ -8744,7 +9368,7 @@
                 <w:color w:val="1C3A36"/>
                 <w:sz w:val="18"/>
               </w:rPr>
-              <w:t>33.2</w:t>
+              <w:t>45.6</w:t>
             </w:r>
           </w:p>
         </w:tc>
@@ -8782,7 +9406,7 @@
                 <w:color w:val="1C3A36"/>
                 <w:sz w:val="18"/>
               </w:rPr>
-              <w:t>23.8</w:t>
+              <w:t>36.3</w:t>
             </w:r>
           </w:p>
         </w:tc>
@@ -8800,7 +9424,7 @@
                 <w:color w:val="1C3A36"/>
                 <w:sz w:val="18"/>
               </w:rPr>
-              <w:t>25.0</w:t>
+              <w:t>37.4</w:t>
             </w:r>
           </w:p>
         </w:tc>
@@ -8818,7 +9442,7 @@
                 <w:color w:val="1C3A36"/>
                 <w:sz w:val="18"/>
               </w:rPr>
-              <w:t>26.3</w:t>
+              <w:t>38.8</w:t>
             </w:r>
           </w:p>
         </w:tc>
@@ -8836,7 +9460,7 @@
                 <w:color w:val="1C3A36"/>
                 <w:sz w:val="18"/>
               </w:rPr>
-              <w:t>28.0</w:t>
+              <w:t>40.4</w:t>
             </w:r>
           </w:p>
         </w:tc>
@@ -8854,7 +9478,7 @@
                 <w:color w:val="1C3A36"/>
                 <w:sz w:val="18"/>
               </w:rPr>
-              <w:t>29.9</w:t>
+              <w:t>42.4</w:t>
             </w:r>
           </w:p>
         </w:tc>
@@ -8892,7 +9516,7 @@
                 <w:color w:val="1C3A36"/>
                 <w:sz w:val="18"/>
               </w:rPr>
-              <w:t>22.3</w:t>
+              <w:t>34.8</w:t>
             </w:r>
           </w:p>
         </w:tc>
@@ -8910,7 +9534,7 @@
                 <w:color w:val="1C3A36"/>
                 <w:sz w:val="18"/>
               </w:rPr>
-              <w:t>23.3</w:t>
+              <w:t>35.7</w:t>
             </w:r>
           </w:p>
         </w:tc>
@@ -8928,7 +9552,7 @@
                 <w:color w:val="1C3A36"/>
                 <w:sz w:val="18"/>
               </w:rPr>
-              <w:t>24.4</w:t>
+              <w:t>36.9</w:t>
             </w:r>
           </w:p>
         </w:tc>
@@ -8946,7 +9570,7 @@
                 <w:color w:val="1C3A36"/>
                 <w:sz w:val="18"/>
               </w:rPr>
-              <w:t>25.7</w:t>
+              <w:t>38.2</w:t>
             </w:r>
           </w:p>
         </w:tc>
@@ -8964,7 +9588,7 @@
                 <w:color w:val="1C3A36"/>
                 <w:sz w:val="18"/>
               </w:rPr>
-              <w:t>27.3</w:t>
+              <w:t>39.7</w:t>
             </w:r>
           </w:p>
         </w:tc>
@@ -8986,7 +9610,7 @@
           <w:color w:val="6E7B77"/>
           <w:sz w:val="17"/>
         </w:rPr>
-        <w:t>SOTP fair value (EGP/share, post-discount) across WACC × terminal growth. Base cell 22% × 11.5% = 28.7. Read it as the bet you are taking: spot is consistent with roughly a 9.5–10-pt nominal spread — i.e. two-to-three more CBE cutting cycles already partly in the price.</w:t>
+        <w:t>SOTP fair value (EGP/share, post-discount) across WACC × terminal growth. Base cell 22% × 11.5% = 41.1. Read the rate axis as the bet you are taking on Egyptian nominal normalization — this grid holds the MNT-Halan stake fixed at 42.58%; it is not the dominant sensitivity in this study (see §1.1).</w:t>
       </w:r>
     </w:p>
     <w:p>
@@ -12156,7 +12780,7 @@
           <w:color w:val="1C3A36"/>
           <w:sz w:val="21"/>
         </w:rPr>
-        <w:t>Three readings sit side by side. The fundamental lenses cluster at 29–33 with a central 30.2 — a shade below spot, contingent on cash conversion. The technical picture is, unusually, the most bullish of the three: above every average, momentum positive, six percent from an all-time high. The probabilistic map splits the difference in an unfamiliar way: its median (35) sits above both spot and fair value, because the engine’s calibrated secular drift — the EGX repricing that has carried this stock thirteen-fold in five years — has not yet statistically died. That is a description of measured price behaviour, not a claim about value.</w:t>
+        <w:t>Three readings sit side by side, and for once they genuinely disagree. The fundamental lenses spread 29–41.1 with a central 37.3 — meaningfully below spot — but that reading is now dominated by a single unconfirmed input (the MNT-Halan stake, §1.1) rather than by the operating business. The technical picture sits closer to the middle: above every average, momentum positive, six percent from an all-time high, but not pricing in anything like the fundamental lenses' implied re-rating. The probabilistic map is the one piece unaffected by the correction: its median (35) sits above spot because the engine’s calibrated secular drift — the EGX repricing that has carried this stock thirteen-fold in five years — has not yet statistically died; that is a description of measured price behaviour, not a claim about value, and it does not know or care what GB Corp’s associate stake is.</w:t>
       </w:r>
     </w:p>
     <w:tbl>
@@ -12277,7 +12901,7 @@
                 <w:color w:val="1C3A36"/>
                 <w:sz w:val="18"/>
               </w:rPr>
-              <w:t>Fairly valued</w:t>
+              <w:t>Meaningfully undervalued — if the stake holds</w:t>
             </w:r>
           </w:p>
         </w:tc>
@@ -12295,7 +12919,7 @@
                 <w:color w:val="1C3A36"/>
                 <w:sz w:val="18"/>
               </w:rPr>
-              <w:t>EGP 30.2 (~−3%)</w:t>
+              <w:t>EGP 37.3 (+19%)</w:t>
             </w:r>
           </w:p>
         </w:tc>
@@ -12438,7 +13062,7 @@
           <w:color w:val="1C3A36"/>
           <w:sz w:val="21"/>
         </w:rPr>
-        <w:t>GBCO looks fairly valued on fundamentals with the recovery priced but the cash-conversion proof still pending: working capital, not demand, is now the income statement’s judge. The strong tape and the drift-up distribution argue the market is willing to pay ahead of that proof; the fundamental work argues the next EGP 5/share of value must be earned in the balance sheet (WC release, CBE cuts, an MNT-Halan second closing) rather than re-rated into existence. The honest summary is a value at price, a distribution centred modestly above it, and a bear–bull span (EGP 19–45) wide enough to demand humility. Readers should weigh the lenses themselves; we publish the distribution, not a target.</w:t>
+        <w:t>GBCO reads meaningfully undervalued on fundamentals (+19% central) — but that verdict rests almost entirely on taking GB Corp's last-disclosed MNT-Halan stake (42.58%, mid-2024) at face value, and this study's own market-implied cross-check (§1.1) suggests that figure likely overstates the current stake materially. Strip the associate leg out and the remaining business — Auto plus GB Capital — reads close to fairly valued against spot, in line with what the tape and the Monte Carlo distribution already show. The honest summary is: the operating business is priced about right; whether the shares are cheap or fair depends on a single unconfirmed disclosure question that this study flags rather than resolves. The bear–bull span (EGP 24–54) is wide enough on its own to demand real humility, and readers should treat the stake-sensitivity table in §1.1 as the actual output of this study, not the single central number. We publish the distribution, not a target.</w:t>
       </w:r>
     </w:p>
     <w:p>
@@ -12508,6 +13132,27 @@
           <w:color w:val="1C3A36"/>
           <w:sz w:val="21"/>
         </w:rPr>
+        <w:t xml:space="preserve">GB Corp’s FY25 annual-report associates footnote. </w:t>
+      </w:r>
+      <w:r>
+        <w:rPr>
+          <w:color w:val="1C3A36"/>
+          <w:sz w:val="21"/>
+        </w:rPr>
+        <w:t>The single most important disclosure this study is waiting on: a direct statement of GB Corp’s current MNT-Halan ownership %, which would replace the last-confirmed-but-likely-stale 42.58% (mid-2024) used here and could move the SOTP fair value by EGP 10+/share in either direction.</w:t>
+      </w:r>
+    </w:p>
+    <w:p>
+      <w:pPr>
+        <w:pStyle w:val="ListBullet"/>
+        <w:spacing w:after="60"/>
+      </w:pPr>
+      <w:r>
+        <w:rPr>
+          <w:b/>
+          <w:color w:val="1C3A36"/>
+          <w:sz w:val="21"/>
+        </w:rPr>
         <w:t xml:space="preserve">MNT-Halan second closing. </w:t>
       </w:r>
       <w:r>
@@ -12515,7 +13160,7 @@
           <w:color w:val="1C3A36"/>
           <w:sz w:val="21"/>
         </w:rPr>
-        <w:t>The June first close priced USD 1.4 bn; a completed round at or above it hardens ~40% of the SOTP’s financial-asset value; a re-price below would cut it directly.</w:t>
+        <w:t>The June first close priced the company at USD 1.4 bn; a completed round confirms the valuation cross-check, but does not by itself resolve GB Corp’s stake percentage — watch for GB Corp to disclose its resulting ownership alongside the close, not just the round’s size.</w:t>
       </w:r>
     </w:p>
     <w:p>
@@ -13171,14 +13816,35 @@
           <w:color w:val="1C3A36"/>
           <w:sz w:val="21"/>
         </w:rPr>
-        <w:t xml:space="preserve">Working capital is the model. </w:t>
+        <w:t xml:space="preserve">The MNT-Halan stake is the whole ballgame, and it is not confirmed. </w:t>
       </w:r>
       <w:r>
         <w:rPr>
           <w:color w:val="1C3A36"/>
           <w:sz w:val="21"/>
         </w:rPr>
-        <w:t>The DCF’s value lives in the glide from 28.5% to 21.5% WC intensity; if 26–28% is the new structural cost of holding share (import finance, CKD stock), the Auto leg is worth EGP 4–8/share less and the central drops toward the relative lens.</w:t>
+        <w:t>This study uses GB Corp’s last-disclosed stake (42.58%, 28-Jul-2024) because it is the only sourced figure available, but this study’s own market-implied cross-check (§1.1) suggests the true current stake is materially lower — two undisclosed dilution events have occurred since. Every 5 points of stake is worth ≈EGP 3.3/share; a confirmed lower stake (e.g. from the FY25 annual report) would immediately compress the SOTP toward the relative and normalized lenses, i.e. toward fair value, not undervalued.</w:t>
+      </w:r>
+    </w:p>
+    <w:p>
+      <w:pPr>
+        <w:pStyle w:val="ListBullet"/>
+        <w:spacing w:after="60"/>
+      </w:pPr>
+      <w:r>
+        <w:rPr>
+          <w:b/>
+          <w:color w:val="1C3A36"/>
+          <w:sz w:val="21"/>
+        </w:rPr>
+        <w:t xml:space="preserve">Working capital is the second-order model. </w:t>
+      </w:r>
+      <w:r>
+        <w:rPr>
+          <w:color w:val="1C3A36"/>
+          <w:sz w:val="21"/>
+        </w:rPr>
+        <w:t>The DCF’s Auto-leg value lives in the glide from 28.5% to 21.5% WC intensity; if 26–28% is the new structural cost of holding share (import finance, CKD stock), the Auto leg is worth EGP 4–8/share less — a real but now secondary lever next to the stake question above.</w:t>
       </w:r>
     </w:p>
     <w:p>
@@ -13234,14 +13900,14 @@
           <w:color w:val="1C3A36"/>
           <w:sz w:val="21"/>
         </w:rPr>
-        <w:t xml:space="preserve">The associate mark is private. </w:t>
+        <w:t xml:space="preserve">The associate mark compounds two separate uncertainties. </w:t>
       </w:r>
       <w:r>
         <w:rPr>
           <w:color w:val="1C3A36"/>
           <w:sz w:val="21"/>
         </w:rPr>
-        <w:t>MNT-Halan’s USD 1.4 bn is a first-close price, the GB stake percentage is an estimate, and private marks are sticky on the way down; the bear case carries it at 0.8×.</w:t>
+        <w:t>MNT-Halan’s USD 1.4bn is a first-close price (a real, objective mark, but for an unlisted company and only a first tranche of an ongoing round); on top of that, the stake percentage applied to it is a mid-2024 disclosure, not a current one. The bear case in the football field carries both the stake and the mark down together, which is why its EGP 22 floor sits far below the base case.</w:t>
       </w:r>
     </w:p>
     <w:p>
@@ -20761,7 +21427,7 @@
           <w:color w:val="1C3A36"/>
           <w:sz w:val="19"/>
         </w:rPr>
-        <w:t>When it works / fails. Best where the legs are separable and independently markable (they are here: a DCF-able operator, a bookable lender, a just-priced associate); fails when a private mark is stale or the legs share a balance sheet more than the accounts admit.</w:t>
+        <w:t>When it works / fails. Best where the legs are separable and independently markable; fails hardest when a mark rests on a stake percentage the company itself has not recently confirmed — exactly the position he is in here.</w:t>
       </w:r>
     </w:p>
     <w:tbl>
@@ -20920,7 +21586,7 @@
                 <w:color w:val="1C3A36"/>
                 <w:sz w:val="18"/>
               </w:rPr>
-              <w:t>Associates: MNT-Halan 13,300 (~20% est. × USD 1.4 bn) + other 390</w:t>
+              <w:t>Associates: MNT-Halan 28,316 (42.58% last-confirmed × USD 1.4bn) + other 390</w:t>
             </w:r>
           </w:p>
         </w:tc>
@@ -20938,7 +21604,7 @@
                 <w:color w:val="1C3A36"/>
                 <w:sz w:val="18"/>
               </w:rPr>
-              <w:t>13,690</w:t>
+              <w:t>28,706</w:t>
             </w:r>
           </w:p>
         </w:tc>
@@ -20958,7 +21624,7 @@
                 <w:color w:val="1C3A36"/>
                 <w:sz w:val="18"/>
               </w:rPr>
-              <w:t>Σ = EGP 31.9/share pre-discount</w:t>
+              <w:t>Σ = EGP 45.7/share pre-discount</w:t>
             </w:r>
           </w:p>
         </w:tc>
@@ -20976,7 +21642,7 @@
                 <w:color w:val="1C3A36"/>
                 <w:sz w:val="18"/>
               </w:rPr>
-              <w:t>34,577</w:t>
+              <w:t>49,594</w:t>
             </w:r>
           </w:p>
         </w:tc>
@@ -21014,7 +21680,7 @@
                 <w:color w:val="1C3A36"/>
                 <w:sz w:val="18"/>
               </w:rPr>
-              <w:t>→ EGP 29.3/share</w:t>
+              <w:t>→ EGP 42.0/share</w:t>
             </w:r>
           </w:p>
         </w:tc>
@@ -21036,7 +21702,7 @@
           <w:color w:val="1C3A36"/>
           <w:sz w:val="19"/>
         </w:rPr>
-        <w:t>Sensitivity (swing = the discount): at 0% EGP 31.9; at 15%, 27.1; at 20%, 25.5. Cross-examination: he tells Expert 2 that capitalizing mid-cycle earnings double-counts assets he has already marked at full value; he tells Expert 3 that punishing the Auto leg for working capital while crediting the lender book at 1× is applying two different standards to the same balance sheet.</w:t>
+        <w:t>Sensitivity (swing = the stake, not the discount, this time): at a 30% stake his NAV falls to ≈EGP 35/share; at 20%, ≈EGP 29. He concedes this openly: “my method is only as good as the weakest mark, and right now that’s the one I can’t independently verify.” Cross-examination: he tells Expert 2 that capitalizing mid-cycle earnings double-counts assets he has already marked at full value; he tells Expert 3 that punishing the Auto leg for working capital while resting the bigger swing on an 18-month-old stake disclosure is misplaced precision.</w:t>
       </w:r>
     </w:p>
     <w:p>
@@ -21048,7 +21714,7 @@
           <w:b/>
           <w:i w:val="0"/>
           <w:color w:val="1C3A36"/>
-          <w:sz w:val="19"/>
+          <w:sz w:val="21"/>
         </w:rPr>
         <w:t xml:space="preserve">Verdict, falsification, market-implied. </w:t>
       </w:r>
@@ -21057,9 +21723,9 @@
           <w:b w:val="0"/>
           <w:i w:val="0"/>
           <w:color w:val="1C3A36"/>
-          <w:sz w:val="19"/>
+          <w:sz w:val="21"/>
         </w:rPr>
-        <w:t>Fair EGP 29.3 (range ~24–37). Falsified if a mark proves illusory — above all if the MNT-Halan second closing re-prices below USD 1.4 bn, or the lender’s NPLs breach ~5%. The market price implies a ~2% discount to his NAV — tighter than his 8%; on his method the stock is a shade rich.</w:t>
+        <w:t>Fair EGP 42.0 (range 22–66) — his widest range yet, and he knows it. Falsified immediately if GB Corp's FY25 annual report discloses a materially lower current MNT-Halan stake, or if the second closing re-prices the round below USD 1.4bn. The market price implies either a discount far steeper than his stated 8% — or, more likely in his own view, that the market has already concluded the stake is well below 42.58% and is pricing the parts it can see.</w:t>
       </w:r>
     </w:p>
     <w:p>
@@ -21638,7 +22304,7 @@
                 <w:color w:val="1C3A36"/>
                 <w:sz w:val="18"/>
               </w:rPr>
-              <w:t>Lender at 0.9× book · associate at 0.85× (private-mark haircut)</w:t>
+              <w:t>Lender at 0.9× book · associate at 0.85× (his own haircut on a stake he also can't verify)</w:t>
             </w:r>
           </w:p>
         </w:tc>
@@ -21656,7 +22322,7 @@
                 <w:color w:val="1C3A36"/>
                 <w:sz w:val="18"/>
               </w:rPr>
-              <w:t>8,550 · 11,636</w:t>
+              <w:t>8,550 · 24,400</w:t>
             </w:r>
           </w:p>
         </w:tc>
@@ -21732,7 +22398,7 @@
                 <w:color w:val="1C3A36"/>
                 <w:sz w:val="18"/>
               </w:rPr>
-              <w:t>→ EGP 27.5/share</w:t>
+              <w:t>→ EGP 39.2/share</w:t>
             </w:r>
           </w:p>
         </w:tc>
@@ -21754,7 +22420,7 @@
           <w:color w:val="1C3A36"/>
           <w:sz w:val="19"/>
         </w:rPr>
-        <w:t>Sensitivity (swing = the ROCE fade): if ROCE re-approaches 30% as WC releases, his Auto mark rises to ~1.1× CE and his fair value to ~EGP 31; if 21% is the new normal against a 22% hurdle, he stands. Cross-examination: he tells Expert 2 that mid-cycle earnings without the capital cost to hold them is a half-truth — FY25 grew profit 49% in revenue terms and consumed EGP 8 bn doing it; he tells Expert 1 that a discount debate is premature until the parts prove they earn their keep.</w:t>
+        <w:t>Sensitivity (swing = the ROCE fade, and now the stake): if ROCE re-approaches 30% as WC releases, his Auto mark rises to ≈EGP 3/share more; but a confirmed MNT-Halan stake even 10 points below his 42.58%-derived assumption costs ≈EGP 6/share — larger than his own preferred swing factor. Cross-examination: he tells Expert 2 that mid-cycle earnings without the capital cost to hold them is a half-truth — FY25 grew profit 49% in revenue terms and consumed EGP 8bn doing it; he tells Expert 1 that resting most of the NAV’s movement on an unconfirmed stake is exactly the kind of false precision his own discipline exists to prevent.</w:t>
       </w:r>
     </w:p>
     <w:p>
@@ -21766,7 +22432,7 @@
           <w:b/>
           <w:i w:val="0"/>
           <w:color w:val="1C3A36"/>
-          <w:sz w:val="19"/>
+          <w:sz w:val="21"/>
         </w:rPr>
         <w:t xml:space="preserve">Verdict, falsification, market-implied. </w:t>
       </w:r>
@@ -21775,9 +22441,9 @@
           <w:b w:val="0"/>
           <w:i w:val="0"/>
           <w:color w:val="1C3A36"/>
-          <w:sz w:val="19"/>
+          <w:sz w:val="21"/>
         </w:rPr>
-        <w:t>Fair EGP 27.5 (range ~22–33) — the most cautious: fairly valued with no margin of safety. Falsified by a durable ROCE recovery above ~28–30% with working capital normalizing — the FY23–24 configuration re-established. The market price sits ~14% above his number: on a cash-returns basis, the market is paying ahead of the proof.</w:t>
+        <w:t>Fair EGP 39.2 (range ≈32–47) — even his conservative method lands well above spot once the corrected stake flows through, which he flags as the tell: his own number moved more from a disclosure correction than from anything the business actually did. Falsified either by a durable ROCE recovery above ~28–30%, or — more likely to matter first — by GB Corp confirming a current stake meaningfully below 42.58%. The market price sits well below his number on either reading: on a cash-returns basis the market looks unconvinced by the stake at face value.</w:t>
       </w:r>
     </w:p>
     <w:p>
@@ -21805,7 +22471,7 @@
           <w:color w:val="1C3A36"/>
           <w:sz w:val="19"/>
         </w:rPr>
-        <w:t>The single thing they most disagree on is the Auto leg’s working capital — whether the EGP 18.9 bn tied up at year-end is a temporary stock or a permanent cost of doing business.</w:t>
+        <w:t>The single thing they most disagree on is no longer working capital — it’s what GB Corp actually owns of MNT-Halan today, and every other disagreement is now secondary to it.</w:t>
       </w:r>
     </w:p>
     <w:p>
@@ -21819,7 +22485,7 @@
           <w:color w:val="1C3A36"/>
           <w:sz w:val="19"/>
         </w:rPr>
-        <w:t>Expert 2: “FY25 was a company doubling its volumes into a supply-constrained market. Of course the balance sheet bulged. Normalize the margin, let the volumes stand, and the group earns EGP 4.2 bn — the market pays eight times that.”</w:t>
+        <w:t>Expert 1: “I mark to the last disclosed figure because that’s the discipline — 42.58%, stated by the company itself in writing. If that’s stale, the company should say so. Until then, I don’t get to just assume a lower number because the market implies one.”</w:t>
       </w:r>
     </w:p>
     <w:p>
@@ -21833,7 +22499,7 @@
           <w:color w:val="1C3A36"/>
           <w:sz w:val="19"/>
         </w:rPr>
-        <w:t>Expert 3: “And to earn it, the Auto business absorbed eight billion pounds of cash and tripled its net debt. Capitalize the earnings if you like — I subtract the capital that produces them. At a 21% return against a 22% hurdle, growth adds nothing until the working capital comes back out.”</w:t>
+        <w:t>Expert 3: “Your own arithmetic says that stake is worth 83% of the entire market cap. That’s not a valuation, it’s a red flag. I’d rather understate the stake and be roughly right than repeat a number I know is probably stale just because it’s the only one on paper.”</w:t>
       </w:r>
     </w:p>
     <w:p>
@@ -21847,7 +22513,7 @@
           <w:color w:val="1C3A36"/>
           <w:sz w:val="19"/>
         </w:rPr>
-        <w:t>Expert 1: “You are both arguing about one leg. Mark all three — the operator, the lender, the associate the market just priced at USD 1.4 bn — and the bundle is worth EGP 31.9 a share. The market pays 31.25. The argument left is the wrapper, and two points of discount is not much of an argument.”</w:t>
+        <w:t>Expert 2: “You’re both missing that this barely touches my number. I never priced the stake at all — mid-cycle earnings power doesn’t care what MNT-Halan is worth. If you want the one lens immune to this whole argument, it’s mine.”</w:t>
       </w:r>
     </w:p>
     <w:p>
@@ -21915,7 +22581,7 @@
           <w:color w:val="6E7B77"/>
           <w:sz w:val="17"/>
         </w:rPr>
-        <w:t>Figure D-1 — The three experts’ fair-value ranges. Brass ticks are base cases; the gold band is the panel centre; the light line is spot. The spread is almost entirely a cash-conversion disagreement.</w:t>
+        <w:t>Figure D-1 — The three experts’ fair-value ranges. Brass ticks are base cases; the gold band is the panel centre; the light line is spot. The spread is now almost entirely the MNT-Halan stake question.</w:t>
       </w:r>
     </w:p>
     <w:tbl>
@@ -22074,7 +22740,7 @@
                 <w:color w:val="1C3A36"/>
                 <w:sz w:val="18"/>
               </w:rPr>
-              <w:t>Fair wrapper discount (8%)</w:t>
+              <w:t>MNT-Halan stake (42.58% last confirmed)</w:t>
             </w:r>
           </w:p>
         </w:tc>
@@ -22092,7 +22758,7 @@
                 <w:color w:val="1C3A36"/>
                 <w:sz w:val="18"/>
               </w:rPr>
-              <w:t>EGP 29.3</w:t>
+              <w:t>EGP 42.0</w:t>
             </w:r>
           </w:p>
         </w:tc>
@@ -22148,7 +22814,7 @@
                 <w:color w:val="1C3A36"/>
                 <w:sz w:val="18"/>
               </w:rPr>
-              <w:t>Mid-cycle PAT 4.2 bn × 8.5×</w:t>
+              <w:t>Mid-cycle PAT 4.2 bn × 8.5× (stake-blind)</w:t>
             </w:r>
           </w:p>
         </w:tc>
@@ -22222,7 +22888,7 @@
                 <w:color w:val="1C3A36"/>
                 <w:sz w:val="18"/>
               </w:rPr>
-              <w:t>ROCE fade to ~0.9× capital</w:t>
+              <w:t>ROCE fade + stake haircut to 0.85×</w:t>
             </w:r>
           </w:p>
         </w:tc>
@@ -22240,7 +22906,7 @@
                 <w:color w:val="1C3A36"/>
                 <w:sz w:val="18"/>
               </w:rPr>
-              <w:t>EGP 27.5</w:t>
+              <w:t>EGP 39.2</w:t>
             </w:r>
           </w:p>
         </w:tc>
@@ -22262,7 +22928,7 @@
           <w:color w:val="1C3A36"/>
           <w:sz w:val="21"/>
         </w:rPr>
-        <w:t>The spread — EGP 27.5 to 32.9 at base — is narrow for an EM cyclical, and it is almost entirely one disagreement: none of the three contests the volumes, the lender’s profitability, or the existence of the associate stake. What separates them is whether growth here converts to cash or consumes it. Expert 2 says the working capital releases (operating leverage); Expert 3 says prove it (the capital cost is the story); Expert 1 says the marks already settle it and only the wrapper is left to argue. The EGP 5.4 spread is therefore a clean measure of one uncertainty — the steady-state working-capital intensity of selling cars in Egypt. Resolve that, and the three converge.</w:t>
+        <w:t>The spread — EGP 32.9 to 42.0 at base — is wide for what is otherwise a set of broadly-agreeing methods, and it is now almost entirely one disagreement: not the volumes, not the lender’s profitability, not the Auto cash-conversion path (all three experts effectively agree on those) — but whether a mid-2024 stake disclosure should still anchor a 2026 valuation. Expert 2 sidesteps the question entirely by never pricing the stake; Experts 1 and 3 both use it but disagree on how much to trust it. Unlike the working-capital disagreement in the prior draft of this study — a genuine business uncertainty that resolves with quarterly prints — this one resolves the moment GB Corp discloses a current number. Resolve that, and the panel’s range collapses dramatically; until then, Expert 2’s stake-blind number is arguably the most robust single estimate in the room.</w:t>
       </w:r>
     </w:p>
     <w:p>
@@ -22410,7 +23076,7 @@
           <w:color w:val="1C3A36"/>
           <w:sz w:val="19"/>
         </w:rPr>
-        <w:t>Reported financial and operating figures are drawn from the company’s public disclosure and other public sources believed reliable but not independently verified; they may contain errors or be superseded. Forward-looking inputs — the leg marks, the MNT-Halan stake estimate, the complexity discount, projections, multiples, the DCF and Monte-Carlo factor probabilities — are the preparer’s own judgments and are inherently uncertain.</w:t>
+        <w:t>Reported financial and operating figures are drawn from the company’s public disclosure and other public sources believed reliable but not independently verified; they may contain errors or be superseded. Forward-looking inputs — the leg marks (including the current applicability of GB Corp’s last-disclosed MNT-Halan stake), the complexity discount, projections, multiples, the DCF and Monte-Carlo factor probabilities — are the preparer’s own judgments and are inherently uncertain.</w:t>
       </w:r>
     </w:p>
     <w:p>

</xml_diff>

<commit_message>
Update GBCO to confirmed MNT-Halan stake (41.61%, GB Corp PR 9-Jun-2026, superseding the interim 42.58% correction): replace study/model/PDF, update fair value 37.3->37.0 in data.js/coverage.js, hero/plain-terms/MC-lab copy reframed from 'unconfirmed stake' to 'confirmed stake, open discount question'; cache-bust 20260709b
</commit_message>
<xml_diff>
--- a/files/GBCO_Valuation_Study_08-07-2026_public.docx
+++ b/files/GBCO_Valuation_Study_08-07-2026_public.docx
@@ -270,7 +270,7 @@
           <w:color w:val="1C3A36"/>
           <w:sz w:val="21"/>
         </w:rPr>
-        <w:t xml:space="preserve">The model's read: the fundamentals point meaningfully undervalued — but the entire gap traces to one uncertain number, GB Corp's current stake in MNT-Halan. </w:t>
+        <w:t xml:space="preserve">The model's read: meaningfully undervalued on a now-confirmed number — and that number raises a real puzzle the market hasn't obviously resolved. </w:t>
       </w:r>
       <w:r>
         <w:rPr>
@@ -279,7 +279,7 @@
           <w:color w:val="1C3A36"/>
           <w:sz w:val="21"/>
         </w:rPr>
-        <w:t>At EGP 31.25 the shares sit about 19% below our weighted central estimate of EGP 37.3. The four lenses spread wider than usual: the split-the-legs sum-of-the-parts lands at 41.1 after a 10% complexity discount (pre-discount 45.7), a conservative relative read at 28.9 marks the floor, and a normalized mid-cycle read at 32.9 sits in between. One correction belongs up front: GB Corp's own 28-Jul-2024 press release discloses its MNT-Halan stake directly — 42.58% fully diluted — dramatically higher than an earlier ~20% placeholder used in this study's first draft, which was an unsourced estimate made in error (§1.1 box). Applying the disclosed 42.58% to June's USD 1.4bn round values the stake alone at ≈EGP 28.3bn — 83% of GB Corp's entire spot market cap, which is itself an implausible read (it would leave almost nothing priced in for a real, profitable, EGP 66bn-revenue auto business) and the strongest signal that the stake has likely been diluted well below 42.58% by two capital events since 2024 that GB Corp has not individually quantified. This is now the single largest swing factor in the entire study — every 5 percentage points of stake is worth ≈EGP 3.3/share — and it dominates the Auto-leg cash-conversion question that would otherwise be the crux (FY25 revenue grew 49% but working capital swallowed EGP 8.1bn and Auto net debt rose to EGP 15.2bn; the DCF still depends on working-capital intensity gliding from 28.5% of revenue back toward its FY23–24 range and on the pace of Egyptian nominal-rate cuts). Technically the stock is the mirror image of a cheap chart: above all four moving averages, RSI in the low-60s, five months into a new all-time-high zone. Over three months the Monte Carlo — whose secular drift is the configuration that passed the Step 0 calibration gate — places the 5th–95th percentile band at roughly EGP 24–51 with a median near 35; that engine is completely unaffected by the stake correction, since it prices the stock's own path, not the SOTP.</w:t>
+        <w:t>At EGP 31.25 the shares sit about 18% below our weighted central estimate of EGP 37.0. The four lenses spread wider than usual: the split-the-legs sum-of-the-parts lands at 40.6 after a 10% complexity discount (pre-discount 45.1), a conservative relative read at 28.9 marks the floor, and a normalized mid-cycle read at 32.9 sits in between. One update belongs up front: GB Corp's own 9-June-2026 press release on MNT-Halan's Al Ahly Capital-led round states the resulting stake directly — 41.61% (down from 42.58% pre-transaction) — a current, dated, company-confirmed figure, not an estimate. Applying 41.61% to the round's USD 1.4bn valuation values the stake alone at ≈EGP 27.7bn — 73% of GB Corp's entire spot market cap. That is now a confirmed fact, not a sourcing gap, and it is genuinely strange: it implies the market prices almost nothing into a real, profitable, EGP 66bn-revenue auto business, which points to one of two things — either the market applies a far steeper discount to this private mark than this study's 10% complexity haircut (illiquidity, minority-stake, execution-risk on the second closing), or GB Corp is genuinely mispriced. This study cannot settle which; §7 returns to it. The stake is now the largest single input in the model — every 5 percentage points is worth ≈EGP 3.3/share — ahead of the Auto-leg cash-conversion question that would otherwise be the crux (FY25 revenue grew 49% but working capital swallowed EGP 8.1bn and Auto net debt rose to EGP 15.2bn; the DCF still depends on working-capital intensity gliding from 28.5% of revenue back toward its FY23–24 range and on the pace of Egyptian nominal-rate cuts). Technically the stock is the mirror image of a cheap chart: above all four moving averages, RSI in the low-60s, five months into a new all-time-high zone. Over three months the Monte Carlo — whose secular drift is the configuration that passed the Step 0 calibration gate — places the 5th–95th percentile band at roughly EGP 24–51 with a median near 35; that engine is completely unaffected by the stake correction, since it prices the stock's own path, not the SOTP.</w:t>
       </w:r>
     </w:p>
     <w:p>
@@ -543,7 +543,7 @@
                 <w:color w:val="1C3A36"/>
                 <w:sz w:val="17"/>
               </w:rPr>
-              <w:t>EGP 41.1</w:t>
+              <w:t>EGP 40.6</w:t>
             </w:r>
           </w:p>
         </w:tc>
@@ -561,7 +561,7 @@
                 <w:color w:val="1C3A36"/>
                 <w:sz w:val="17"/>
               </w:rPr>
-              <w:t>+32% vs spot</w:t>
+              <w:t>+30% vs spot</w:t>
             </w:r>
           </w:p>
         </w:tc>
@@ -616,7 +616,7 @@
                 <w:color w:val="1C3A36"/>
                 <w:sz w:val="17"/>
               </w:rPr>
-              <w:t>EGP 45.7</w:t>
+              <w:t>EGP 45.1</w:t>
             </w:r>
           </w:p>
         </w:tc>
@@ -634,7 +634,7 @@
                 <w:color w:val="1C3A36"/>
                 <w:sz w:val="17"/>
               </w:rPr>
-              <w:t>+46%</w:t>
+              <w:t>+44%</w:t>
             </w:r>
           </w:p>
         </w:tc>
@@ -835,7 +835,7 @@
                 <w:color w:val="1C3A36"/>
                 <w:sz w:val="17"/>
               </w:rPr>
-              <w:t>EGP 37.3</w:t>
+              <w:t>EGP 37.0</w:t>
             </w:r>
           </w:p>
         </w:tc>
@@ -853,7 +853,7 @@
                 <w:color w:val="1C3A36"/>
                 <w:sz w:val="17"/>
               </w:rPr>
-              <w:t>+19% vs EGP 31.25</w:t>
+              <w:t>+18% vs EGP 31.25</w:t>
             </w:r>
           </w:p>
         </w:tc>
@@ -1434,7 +1434,7 @@
                 <w:color w:val="1C3A36"/>
                 <w:sz w:val="17"/>
               </w:rPr>
-              <w:t>EGP 42.0</w:t>
+              <w:t>EGP 41.5</w:t>
             </w:r>
           </w:p>
         </w:tc>
@@ -1507,7 +1507,7 @@
                 <w:color w:val="1C3A36"/>
                 <w:sz w:val="17"/>
               </w:rPr>
-              <w:t>EGP 42.0</w:t>
+              <w:t>EGP 41.5</w:t>
             </w:r>
           </w:p>
         </w:tc>
@@ -1653,7 +1653,7 @@
                 <w:color w:val="1C3A36"/>
                 <w:sz w:val="17"/>
               </w:rPr>
-              <w:t>EGP 39.2</w:t>
+              <w:t>EGP 38.7</w:t>
             </w:r>
           </w:p>
         </w:tc>
@@ -1726,7 +1726,7 @@
                 <w:color w:val="1C3A36"/>
                 <w:sz w:val="17"/>
               </w:rPr>
-              <w:t>EGP 32.9–42.0</w:t>
+              <w:t>EGP 32.9–41.5</w:t>
             </w:r>
           </w:p>
         </w:tc>
@@ -1775,7 +1775,7 @@
           <w:color w:val="1C3A36"/>
           <w:sz w:val="19"/>
         </w:rPr>
-        <w:t>The reads spread wider than usual, and every disagreement now traces to the same open question: what GB Corp's MNT-Halan stake actually is today. The fundamental central sits near EGP 37 — 19% below the EGP 31.25 spot — the three experts span 33–42, and the tape (unusually) sits closer to fair value than the fundamental work: price has not yet caught up to what the disclosed stake would be worth if taken at face value — or the market already suspects the stake is smaller than 42.58% today and is pricing that in. The three-month Monte Carlo distribution is unaffected either way: it prices the stock's own historical path, and its median sits above spot only because the engine's secular drift survived the calibration gate; Appendix B shows exactly how thin that margin is.</w:t>
+        <w:t>The reads spread wider than usual, and every disagreement now traces to the same open question: not what GB Corp's MNT-Halan stake is (confirmed: 41.61%, 9-Jun-2026), but what that stake is actually worth and why the market doesn't price it at face value. The fundamental central sits near EGP 37 — 18% below the EGP 31.25 spot — the three experts span 33–41, and the tape (unusually) sits closer to spot than the fundamental work — either the market is applying a much steeper discount to the private MNT-Halan mark than this study's 10%, or it doesn't fully trust the round's valuation, or GB Corp really is mispriced. The three-month Monte Carlo distribution is unaffected either way: it prices the stock's own historical path, and its median sits above spot only because the engine's secular drift survived the calibration gate; Appendix B shows exactly how thin that margin is.</w:t>
       </w:r>
     </w:p>
     <w:p>
@@ -2348,7 +2348,7 @@
           <w:color w:val="1C3A36"/>
           <w:sz w:val="21"/>
         </w:rPr>
-        <w:t>Each leg is marked on the basis that fits it. The Auto leg takes the §1.2 DCF value; GB Capital is marked on the company’s own adjusted-ROAE equity base (the disclosure that strips the MNT-Halan revaluation out of the equity denominator: NP EGP 1,366 mn / 15.1% adjusted ROAE ⇒ ~EGP 9.5 bn of operating book) at 1.0× — the return-justified multiple for a mid-teens-ROE lender whose margin is a beneficiary of the easing cycle; and the associates are marked by applying GB Corp’s own last-confirmed disclosed stake to the June-2026 funding round (USD 1.4 bn × 42.58% × EGP/USD ≈ 47.5 ⇒ ≈EGP 28.3 bn). CORRECTION (09-07-2026): the first draft of this study used an unsourced ~20% stake estimate — GB Corp had in fact already disclosed the figure (28-Jul-2024 press release, Tam Finans transaction: "pre-transactions GBCO’s stake in MNT-Halan was 49.45%, and following the Capital raise ... GBCO’s stake shall become 42.58% on a fully diluted basis"). That is now used as the base case, flagged as "last confirmed, pre-2026-round" rather than a guaranteed current figure — see the box below for why even this corrected number should be treated with real caution. Within the associates line, MNT-Halan is now the overwhelming majority of the value (≈99%), with Bedaya and Kaf the ≈EGP 0.4 bn residual. From the sum we deduct a 10% complexity discount for the wrapper: an auto operator, an NBFI and an unlisted fintech in one listing will not trade at the clean sum of its parts.</w:t>
+        <w:t>Each leg is marked on the basis that fits it. The Auto leg takes the §1.2 DCF value; GB Capital is marked on the company’s own adjusted-ROAE equity base (the disclosure that strips the MNT-Halan revaluation out of the equity denominator: NP EGP 1,366 mn / 15.1% adjusted ROAE ⇒ ~EGP 9.5 bn of operating book) at 1.0× — the return-justified multiple for a mid-teens-ROE lender whose margin is a beneficiary of the easing cycle; and the associates are marked by applying GB Corp’s own current, confirmed stake to the June-2026 funding round (USD 1.4 bn × 41.61% × EGP/USD ≈ 47.5 ⇒ ≈EGP 27.7 bn). UPDATE (09-07-2026): an earlier draft of this study used an unsourced ~20% stake estimate, later corrected to 42.58% (GB Corp’s last-disclosed figure at the time, from a 28-Jul-2024 press release). GB Corp has since confirmed the current figure directly: its 9-June-2026 press release on MNT-Halan’s Al Ahly Capital-led capital increase states "GB Corp’s ownership stake in MNT-Halan will be adjusted to 41.61%, compared to 42.58% prior to the transaction" — a dated, current, company-confirmed number, now used as the base case without a staleness caveat. Within the associates line, MNT-Halan is the overwhelming majority of the value (≈99%), with Bedaya and Kaf the ≈EGP 0.4 bn residual. From the sum we deduct a 10% complexity discount for the wrapper: an auto operator, an NBFI and an unlisted fintech in one listing will not trade at the clean sum of its parts.</w:t>
       </w:r>
     </w:p>
     <w:tbl>
@@ -2563,7 +2563,7 @@
                 <w:color w:val="1C3A36"/>
                 <w:sz w:val="18"/>
               </w:rPr>
-              <w:t>Associate — MNT-Halan (42.58%, last confirmed)</w:t>
+              <w:t>Associate — MNT-Halan (41.61%, confirmed 9-Jun-2026)</w:t>
             </w:r>
           </w:p>
         </w:tc>
@@ -2581,7 +2581,7 @@
                 <w:color w:val="1C3A36"/>
                 <w:sz w:val="18"/>
               </w:rPr>
-              <w:t>USD 1.4 bn Jun-26 round × 42.58% stake × 47.5 EGP/USD</w:t>
+              <w:t>USD 1.4 bn Jun-26 round × 41.61% stake × 47.5 EGP/USD</w:t>
             </w:r>
           </w:p>
         </w:tc>
@@ -2599,7 +2599,7 @@
                 <w:color w:val="1C3A36"/>
                 <w:sz w:val="18"/>
               </w:rPr>
-              <w:t>28,316</w:t>
+              <w:t>27,671</w:t>
             </w:r>
           </w:p>
         </w:tc>
@@ -2693,7 +2693,7 @@
                 <w:color w:val="1C3A36"/>
                 <w:sz w:val="18"/>
               </w:rPr>
-              <w:t>= EGP 45.7 / share</w:t>
+              <w:t>= EGP 45.1 / share</w:t>
             </w:r>
           </w:p>
         </w:tc>
@@ -2711,7 +2711,7 @@
                 <w:color w:val="1C3A36"/>
                 <w:sz w:val="18"/>
               </w:rPr>
-              <w:t>49,594</w:t>
+              <w:t>48,949</w:t>
             </w:r>
           </w:p>
         </w:tc>
@@ -2767,7 +2767,7 @@
                 <w:color w:val="1C3A36"/>
                 <w:sz w:val="18"/>
               </w:rPr>
-              <w:t>(4,959)</w:t>
+              <w:t>(4,895)</w:t>
             </w:r>
           </w:p>
         </w:tc>
@@ -2805,7 +2805,7 @@
                 <w:color w:val="1C3A36"/>
                 <w:sz w:val="18"/>
               </w:rPr>
-              <w:t>= EGP 41.1 / share</w:t>
+              <w:t>= EGP 40.6 / share</w:t>
             </w:r>
           </w:p>
         </w:tc>
@@ -2823,7 +2823,7 @@
                 <w:color w:val="1C3A36"/>
                 <w:sz w:val="18"/>
               </w:rPr>
-              <w:t>44,634</w:t>
+              <w:t>44,054</w:t>
             </w:r>
           </w:p>
         </w:tc>
@@ -2845,7 +2845,7 @@
           <w:color w:val="1C3A36"/>
           <w:sz w:val="21"/>
         </w:rPr>
-        <w:t>SOTP base ≈ EGP 41.1/share</w:t>
+        <w:t>SOTP base ≈ EGP 40.6/share</w:t>
       </w:r>
       <w:r>
         <w:rPr>
@@ -2854,7 +2854,7 @@
           <w:color w:val="1C3A36"/>
           <w:sz w:val="21"/>
         </w:rPr>
-        <w:t>, with a very wide bear–bull span of 22–66 — driven now mainly by the MNT-Halan stake and mark (see below), with the Auto margin/working-capital path and the discount a secondary factor (§1.9). The market-implied read has flipped from reassuring to a genuine red flag: market cap less the lender and the associates at the corrected stake would need to be strongly negative for the Auto leg — an impossibility for a profitable, EGP 66bn-revenue business — which is the clearest signal available that 42.58% overstates GB Corp’s current stake and that real dilution has occurred since mid-2024 that this study cannot yet quantify precisely.</w:t>
+        <w:t>, with a wide bear–bull span of 22–65 — driven mainly by the discount applied to the MNT-Halan mark and the Auto margin/working-capital path (§1.9). The market-implied read is now a confirmed puzzle rather than a sourcing question: market cap less the lender and the associates at the confirmed 41.61% stake implies a deeply negative value for the Auto leg — impossible for a profitable, EGP 66bn-revenue business. Since the stake itself is no longer in question, the honest reads are that the market applies a much steeper discount to this private mark than this study’s 10%, doesn’t fully trust the USD 1.4bn valuation’s read-through to GB Corp’s economic interest, or GB Corp is genuinely mispriced. §7 discusses which is most plausible.</w:t>
       </w:r>
     </w:p>
     <w:p>
@@ -2868,7 +2868,7 @@
           <w:color w:val="1C3A36"/>
           <w:sz w:val="24"/>
         </w:rPr>
-        <w:t>What the MNT-Halan stake is worth inside this valuation — and why the percentage itself is now the crux</w:t>
+        <w:t>What the MNT-Halan stake is worth inside this valuation — now a confirmed number, and a real puzzle</w:t>
       </w:r>
     </w:p>
     <w:p>
@@ -2882,7 +2882,7 @@
           <w:color w:val="1C3A36"/>
           <w:sz w:val="19"/>
         </w:rPr>
-        <w:t>Because this single line now swings the whole valuation more than any other input, here is its exact footprint, followed by why the corrected 42.58% figure should still be treated as an upper bound rather than a settled number:</w:t>
+        <w:t>Because this single line dominates the whole valuation, here is its exact footprint, using GB Corp’s own 9-June-2026 confirmed figure:</w:t>
       </w:r>
     </w:p>
     <w:tbl>
@@ -2965,7 +2965,7 @@
                 <w:color w:val="1C3A36"/>
                 <w:sz w:val="18"/>
               </w:rPr>
-              <w:t>Implied value at the June-2026 round (42.58% stake)</w:t>
+              <w:t>Confirmed value at the June-2026 round (41.61% stake)</w:t>
             </w:r>
           </w:p>
         </w:tc>
@@ -2983,7 +2983,7 @@
                 <w:color w:val="1C3A36"/>
                 <w:sz w:val="18"/>
               </w:rPr>
-              <w:t>USD 1.4 bn × 42.58% × 47.5 = EGP 28,316 mn</w:t>
+              <w:t>USD 1.4 bn × 41.61% × 47.5 = EGP 27,671 mn</w:t>
             </w:r>
           </w:p>
         </w:tc>
@@ -3021,7 +3021,7 @@
                 <w:color w:val="1C3A36"/>
                 <w:sz w:val="18"/>
               </w:rPr>
-              <w:t>EGP 26.09 — 57% of the EGP 45.7 pre-discount NAV</w:t>
+              <w:t>EGP 25.49 — 57% of the EGP 45.1 pre-discount NAV</w:t>
             </w:r>
           </w:p>
         </w:tc>
@@ -3059,7 +3059,7 @@
                 <w:color w:val="1C3A36"/>
                 <w:sz w:val="18"/>
               </w:rPr>
-              <w:t>EGP 23.48 — same 57% share of the EGP 41.1 SOTP</w:t>
+              <w:t>EGP 22.94 — same 57% share of the EGP 40.6 SOTP</w:t>
             </w:r>
           </w:p>
         </w:tc>
@@ -3097,7 +3097,7 @@
                 <w:color w:val="1C3A36"/>
                 <w:sz w:val="18"/>
               </w:rPr>
-              <w:t>≈75% — this is the red flag (see below)</w:t>
+              <w:t>≈73% — confirmed, and the puzzle (see below)</w:t>
             </w:r>
           </w:p>
         </w:tc>
@@ -3117,7 +3117,7 @@
                 <w:color w:val="1C3A36"/>
                 <w:sz w:val="18"/>
               </w:rPr>
-              <w:t>Every 5 percentage points of stake</w:t>
+              <w:t>Every 5 percentage points of stake (for context)</w:t>
             </w:r>
           </w:p>
         </w:tc>
@@ -3135,7 +3135,7 @@
                 <w:color w:val="1C3A36"/>
                 <w:sz w:val="18"/>
               </w:rPr>
-              <w:t>≈EGP 3.3/share of SOTP fair value</w:t>
+              <w:t>≈EGP 3.3/share of SOTP fair value — no longer the open question it was</w:t>
             </w:r>
           </w:p>
         </w:tc>
@@ -3157,7 +3157,7 @@
           <w:color w:val="1C3A36"/>
           <w:sz w:val="24"/>
         </w:rPr>
-        <w:t>Stake-sensitivity — the number that actually matters</w:t>
+        <w:t>The market-cap puzzle — what a confirmed 41.61% stake actually implies</w:t>
       </w:r>
     </w:p>
     <w:p>
@@ -3171,7 +3171,7 @@
           <w:color w:val="1C3A36"/>
           <w:sz w:val="19"/>
         </w:rPr>
-        <w:t>GB Corp’s 42.58% is the last figure the company confirmed in writing (28-Jul-2024), but two capital events since — a 2024 international raise (GB Corp itself re-invested, per the participant list, so may have partly defended its pro-rata share) and the small Jun-2026 Al Ahly Capital first close (initial ~USD 30mn into a USD 1.4bn company, second closing pending, size undisclosed) — will have diluted it further by an unquantified amount. The table below shows the resulting SOTP fair value across a plausible range, so the reader can substitute their own view of the current stake rather than take 42.58% on faith:</w:t>
+        <w:t>With the stake now confirmed rather than estimated, the residual uncertainty shifts entirely to the mark and the discount, not the ownership percentage. The table below shows how sensitive the SOTP would have been to the stake question that is now closed, followed by what actually needs explaining:</w:t>
       </w:r>
     </w:p>
     <w:tbl>
@@ -3568,7 +3568,6 @@
                 <w:color w:val="1C3A36"/>
                 <w:sz w:val="17"/>
               </w:rPr>
-              <w:t>if GB Corp only defended the 2024 raise pro-rata</w:t>
             </w:r>
           </w:p>
         </w:tc>
@@ -3715,7 +3714,81 @@
                 <w:color w:val="1C3A36"/>
                 <w:sz w:val="17"/>
               </w:rPr>
-              <w:t>last confirmed disclosure — pre-2026-round base case</w:t>
+              <w:t>the interim correction — pre-transaction figure, now superseded</w:t>
+            </w:r>
+          </w:p>
+        </w:tc>
+      </w:tr>
+      <w:tr>
+        <w:tc>
+          <w:tcPr>
+            <w:tcW w:type="dxa" w:w="2160"/>
+          </w:tcPr>
+          <w:p>
+            <w:pPr>
+              <w:spacing w:after="20"/>
+            </w:pPr>
+            <w:r>
+              <w:rPr>
+                <w:b/>
+                <w:color w:val="1C3A36"/>
+                <w:sz w:val="17"/>
+              </w:rPr>
+              <w:t>41.61%</w:t>
+            </w:r>
+          </w:p>
+        </w:tc>
+        <w:tc>
+          <w:tcPr>
+            <w:tcW w:type="dxa" w:w="2448"/>
+          </w:tcPr>
+          <w:p>
+            <w:pPr>
+              <w:spacing w:after="20"/>
+              <w:jc w:val="right"/>
+            </w:pPr>
+            <w:r>
+              <w:rPr>
+                <w:color w:val="1C3A36"/>
+                <w:sz w:val="17"/>
+              </w:rPr>
+              <w:t>27,671</w:t>
+            </w:r>
+          </w:p>
+        </w:tc>
+        <w:tc>
+          <w:tcPr>
+            <w:tcW w:type="dxa" w:w="1872"/>
+          </w:tcPr>
+          <w:p>
+            <w:pPr>
+              <w:spacing w:after="20"/>
+              <w:jc w:val="right"/>
+            </w:pPr>
+            <w:r>
+              <w:rPr>
+                <w:color w:val="1C3A36"/>
+                <w:sz w:val="17"/>
+              </w:rPr>
+              <w:t>40.6</w:t>
+            </w:r>
+          </w:p>
+        </w:tc>
+        <w:tc>
+          <w:tcPr>
+            <w:tcW w:type="dxa" w:w="3744"/>
+          </w:tcPr>
+          <w:p>
+            <w:pPr>
+              <w:spacing w:after="20"/>
+              <w:jc w:val="right"/>
+            </w:pPr>
+            <w:r>
+              <w:rPr>
+                <w:color w:val="1C3A36"/>
+                <w:sz w:val="17"/>
+              </w:rPr>
+              <w:t>CONFIRMED current (GB Corp PR, 9-Jun-2026) — base case</w:t>
             </w:r>
           </w:p>
         </w:tc>
@@ -3746,7 +3819,7 @@
           <w:color w:val="1C3A36"/>
           <w:sz w:val="19"/>
         </w:rPr>
-        <w:t>this study cannot currently pin down GB Corp's precise MNT-Halan stake to the decimal, and that single unknown now matters more to the fair value than every other assumption in the model combined. The base case (42.58%) is the last hard, company-disclosed number and is used because it is sourced — not because it is certain to still be current. Anyone relying on this study for a decision should confirm the FY25 annual-report associates footnote (GB Corp's own related-party disclosure typically states ownership % directly) before leaning on any single point in the table above. The bear case in this study's football field (§1.5) carries the stake and the mark down together; the crux (§1.7) and caveats (§7) return to this explicitly.</w:t>
+        <w:t>the stake question this study originally flagged as its biggest uncertainty is now closed — GB Corp confirmed 41.61% in writing on 9 June 2026. What remains open is not “what does GB Corp own” but “what is that ownership worth, and why doesn’t the market price it at face value.” A confirmed 41.61% stake in a company marked at USD 1.4bn is worth more than 73% of GB Corp’s entire market cap — either the market is applying a steep private-mark discount this study’s 10% doesn’t capture, or GB Corp is genuinely mispriced. The bear case in this study’s football field (§1.5) reflects the former via a much heavier discount on the stake; the base case takes the confirmed number at the round’s valuation. §7 returns to this as the study’s central open question.</w:t>
       </w:r>
     </w:p>
     <w:p>
@@ -6479,7 +6552,7 @@
                 <w:color w:val="1C3A36"/>
                 <w:sz w:val="18"/>
               </w:rPr>
-              <w:t>41.1</w:t>
+              <w:t>40.6</w:t>
             </w:r>
           </w:p>
         </w:tc>
@@ -6497,7 +6570,7 @@
                 <w:color w:val="1C3A36"/>
                 <w:sz w:val="18"/>
               </w:rPr>
-              <w:t>66</w:t>
+              <w:t>65</w:t>
             </w:r>
           </w:p>
         </w:tc>
@@ -6571,7 +6644,7 @@
                 <w:color w:val="1C3A36"/>
                 <w:sz w:val="18"/>
               </w:rPr>
-              <w:t>45.7</w:t>
+              <w:t>45.1</w:t>
             </w:r>
           </w:p>
         </w:tc>
@@ -6589,7 +6662,7 @@
                 <w:color w:val="1C3A36"/>
                 <w:sz w:val="18"/>
               </w:rPr>
-              <w:t>69</w:t>
+              <w:t>68</w:t>
             </w:r>
           </w:p>
         </w:tc>
@@ -6833,7 +6906,7 @@
                 <w:color w:val="1C3A36"/>
                 <w:sz w:val="18"/>
               </w:rPr>
-              <w:t>24.1</w:t>
+              <w:t>23.8</w:t>
             </w:r>
           </w:p>
         </w:tc>
@@ -6853,7 +6926,7 @@
                 <w:color w:val="1C3A36"/>
                 <w:sz w:val="18"/>
               </w:rPr>
-              <w:t>37.3</w:t>
+              <w:t>37.0</w:t>
             </w:r>
           </w:p>
         </w:tc>
@@ -6873,7 +6946,7 @@
                 <w:color w:val="1C3A36"/>
                 <w:sz w:val="18"/>
               </w:rPr>
-              <w:t>53.9</w:t>
+              <w:t>53.5</w:t>
             </w:r>
           </w:p>
         </w:tc>
@@ -6949,7 +7022,7 @@
           <w:color w:val="1C3A36"/>
           <w:sz w:val="21"/>
         </w:rPr>
-        <w:t>Central fair value ≈ EGP 37.3/share</w:t>
+        <w:t>Central fair value ≈ EGP 37.0/share</w:t>
       </w:r>
       <w:r>
         <w:rPr>
@@ -6958,7 +7031,7 @@
           <w:color w:val="1C3A36"/>
           <w:sz w:val="21"/>
         </w:rPr>
-        <w:t>, 19% below spot. Unlike a typical Testahil football field, the width here is not really four independent views converging — the SOTP and pre-discount NAV lenses (41.1 and 45.7) both carry the same MNT-Halan stake assumption, so they move together with it, while the relative (28.9) and normalized (32.9) lenses don’t touch the stake at all and sit much closer to spot. That split is itself informative: strip out the MNT-Halan question and this is a fairly-priced operator; include it at the last disclosed stake and it looks meaningfully cheap. Which is right depends entirely on a number this study cannot currently confirm to the decimal (§1.1 box).</w:t>
+        <w:t>, 18% below spot. Unlike a typical Testahil football field, the width here is not really four independent views converging — the SOTP and pre-discount NAV lenses (40.6 and 45.1) both carry the same MNT-Halan stake assumption, so they move together with it, while the relative (28.9) and normalized (32.9) lenses don’t touch the stake at all and sit much closer to spot. That split is itself informative: strip out the MNT-Halan question and this is a fairly-priced operator; include it at the last disclosed stake and it looks meaningfully cheap. Which is right depends entirely on a number this study cannot currently confirm to the decimal (§1.1 box).</w:t>
       </w:r>
     </w:p>
     <w:p>
@@ -8434,7 +8507,7 @@
           <w:color w:val="1C3A36"/>
           <w:sz w:val="24"/>
         </w:rPr>
-        <w:t>1.7  The crux: the MNT-Halan stake, then cash conversion and the rate path</w:t>
+        <w:t>1.7  The crux: the MNT-Halan mark and discount, then cash conversion and the rate path</w:t>
       </w:r>
     </w:p>
     <w:p>
@@ -8448,7 +8521,7 @@
           <w:color w:val="1C3A36"/>
           <w:sz w:val="21"/>
         </w:rPr>
-        <w:t>Three judgments drive the valuation, in order of size. First and now by far the largest: what GB Corp’s current MNT-Halan stake actually is (§1.1 box). Every 5 percentage points is worth ≈EGP 3.3/share of SOTP fair value — roughly ten times the impact of a full percentage point on Auto working capital. This study uses 42.58% (GB Corp’s last disclosed figure, 28-Jul-2024) as a sourced but likely-stale base case; the honest range runs from there down to whatever dilution two subsequent, unquantified capital events have produced. Second, where Auto working-capital intensity settles (the observable, disclosed unit: net Auto working capital as % of Auto revenue — device A-1). It ran 18.7% in FY23, 22.9% in FY24 and 28.5% in FY25 as import-restriction payables normalized and inventory was pre-built for Sadat; we glide it to 21.5% by FY30E. Each percentage point of steady-state intensity is worth roughly EGP 4–5/share of SOTP value. Third, the Egyptian nominal-rate path: the 22.0% WACC against 11.5% terminal growth is a 10.5-pt real spread struck off a 19% blended risk-free; every 100 bp the CBE easing cycle takes out of that spread adds ~EGP 3/share (§1.9 grid). A fourth, binary-style exposure (§3.5-E device 6, applied cross-class): roughly a fifth of PC revenue is Iraq/Jordan, where the regional conflict cut 1Q26 volumes — a full-year regional freeze would take ~EGP 1.5–2 bn off Auto gross profit, worth ~EGP 2–3/share.</w:t>
+        <w:t>Three judgments drive the valuation, in order of size. First and now by far the largest: not what GB Corp’s MNT-Halan stake is — that is confirmed (41.61%, 9-Jun-2026 press release, §1.1 box) — but what a private mark this large should be discounted by, given that taking it at face value implies the stake alone is worth roughly three quarters of GB Corp’s entire market cap. This study applies a 10% complexity discount uniformly across all three legs; a reader who believes the market is applying a much steeper illiquidity/minority discount specifically to the MNT-Halan mark should treat the SOTP bear case, not the base case, as the more realistic anchor. Second, where Auto working-capital intensity settles (the observable, disclosed unit: net Auto working capital as % of Auto revenue — device A-1). It ran 18.7% in FY23, 22.9% in FY24 and 28.5% in FY25 as import-restriction payables normalized and inventory was pre-built for Sadat; we glide it to 21.5% by FY30E. Each percentage point of steady-state intensity is worth roughly EGP 4–5/share of SOTP value. Third, the Egyptian nominal-rate path: the 22.0% WACC against 11.5% terminal growth is a 10.5-pt real spread struck off a 19% blended risk-free; every 100 bp the CBE easing cycle takes out of that spread adds ~EGP 3/share (§1.9 grid). A fourth, binary-style exposure (§3.5-E device 6, applied cross-class): roughly a fifth of PC revenue is Iraq/Jordan, where the regional conflict cut 1Q26 volumes — a full-year regional freeze would take ~EGP 1.5–2 bn off Auto gross profit, worth ~EGP 2–3/share.</w:t>
       </w:r>
     </w:p>
     <w:p>
@@ -8841,7 +8914,7 @@
           <w:color w:val="1C3A36"/>
           <w:sz w:val="21"/>
         </w:rPr>
-        <w:t>Holding the lender and associate marks (and the MNT-Halan stake, at the 42.58% base case) fixed, the first grid re-prices the SOTP across the Auto gross-margin path and the complexity discount; the second across the WACC × terminal-growth spread (the rate-cycle bet made explicit, device A-7). The stake itself — now the larger swing factor — is sensitized separately in the §1.1 box, since it dominates both of these grids combined.</w:t>
+        <w:t>Holding the lender and associate marks (and the MNT-Halan stake, at the confirmed 41.61%) fixed, the first grid re-prices the SOTP across the Auto gross-margin path and the complexity discount; the second across the WACC × terminal-growth spread (the rate-cycle bet made explicit, device A-7). The stake is no longer the open question — what matters now is the discount applied to its mark, sensitized in the §1.1 box, since it dominates both of these grids combined.</w:t>
       </w:r>
     </w:p>
     <w:p>
@@ -9076,7 +9149,7 @@
                 <w:color w:val="1C3A36"/>
                 <w:sz w:val="18"/>
               </w:rPr>
-              <w:t>42.6</w:t>
+              <w:t>42.1</w:t>
             </w:r>
           </w:p>
         </w:tc>
@@ -9094,7 +9167,7 @@
                 <w:color w:val="1C3A36"/>
                 <w:sz w:val="18"/>
               </w:rPr>
-              <w:t>44.8</w:t>
+              <w:t>44.2</w:t>
             </w:r>
           </w:p>
         </w:tc>
@@ -9112,7 +9185,7 @@
                 <w:color w:val="1C3A36"/>
                 <w:sz w:val="18"/>
               </w:rPr>
-              <w:t>47.4</w:t>
+              <w:t>46.9</w:t>
             </w:r>
           </w:p>
         </w:tc>
@@ -9130,7 +9203,7 @@
                 <w:color w:val="1C3A36"/>
                 <w:sz w:val="18"/>
               </w:rPr>
-              <w:t>50.8</w:t>
+              <w:t>50.3</w:t>
             </w:r>
           </w:p>
         </w:tc>
@@ -9148,7 +9221,7 @@
                 <w:color w:val="1C3A36"/>
                 <w:sz w:val="18"/>
               </w:rPr>
-              <w:t>55.2</w:t>
+              <w:t>54.7</w:t>
             </w:r>
           </w:p>
         </w:tc>
@@ -9186,7 +9259,7 @@
                 <w:color w:val="1C3A36"/>
                 <w:sz w:val="18"/>
               </w:rPr>
-              <w:t>40.1</w:t>
+              <w:t>39.6</w:t>
             </w:r>
           </w:p>
         </w:tc>
@@ -9204,7 +9277,7 @@
                 <w:color w:val="1C3A36"/>
                 <w:sz w:val="18"/>
               </w:rPr>
-              <w:t>41.9</w:t>
+              <w:t>41.3</w:t>
             </w:r>
           </w:p>
         </w:tc>
@@ -9222,7 +9295,7 @@
                 <w:color w:val="1C3A36"/>
                 <w:sz w:val="18"/>
               </w:rPr>
-              <w:t>43.9</w:t>
+              <w:t>43.4</w:t>
             </w:r>
           </w:p>
         </w:tc>
@@ -9240,7 +9313,7 @@
                 <w:color w:val="1C3A36"/>
                 <w:sz w:val="18"/>
               </w:rPr>
-              <w:t>46.5</w:t>
+              <w:t>46.0</w:t>
             </w:r>
           </w:p>
         </w:tc>
@@ -9258,7 +9331,7 @@
                 <w:color w:val="1C3A36"/>
                 <w:sz w:val="18"/>
               </w:rPr>
-              <w:t>49.8</w:t>
+              <w:t>49.3</w:t>
             </w:r>
           </w:p>
         </w:tc>
@@ -9296,7 +9369,7 @@
                 <w:color w:val="1C3A36"/>
                 <w:sz w:val="18"/>
               </w:rPr>
-              <w:t>38.0</w:t>
+              <w:t>37.5</w:t>
             </w:r>
           </w:p>
         </w:tc>
@@ -9314,7 +9387,7 @@
                 <w:color w:val="1C3A36"/>
                 <w:sz w:val="18"/>
               </w:rPr>
-              <w:t>39.4</w:t>
+              <w:t>38.9</w:t>
             </w:r>
           </w:p>
         </w:tc>
@@ -9332,7 +9405,7 @@
                 <w:color w:val="1C3A36"/>
                 <w:sz w:val="18"/>
               </w:rPr>
-              <w:t>41.1</w:t>
+              <w:t>40.6</w:t>
             </w:r>
           </w:p>
         </w:tc>
@@ -9350,7 +9423,7 @@
                 <w:color w:val="1C3A36"/>
                 <w:sz w:val="18"/>
               </w:rPr>
-              <w:t>43.1</w:t>
+              <w:t>42.6</w:t>
             </w:r>
           </w:p>
         </w:tc>
@@ -9368,7 +9441,7 @@
                 <w:color w:val="1C3A36"/>
                 <w:sz w:val="18"/>
               </w:rPr>
-              <w:t>45.6</w:t>
+              <w:t>45.1</w:t>
             </w:r>
           </w:p>
         </w:tc>
@@ -9406,7 +9479,7 @@
                 <w:color w:val="1C3A36"/>
                 <w:sz w:val="18"/>
               </w:rPr>
-              <w:t>36.3</w:t>
+              <w:t>35.7</w:t>
             </w:r>
           </w:p>
         </w:tc>
@@ -9424,7 +9497,7 @@
                 <w:color w:val="1C3A36"/>
                 <w:sz w:val="18"/>
               </w:rPr>
-              <w:t>37.4</w:t>
+              <w:t>36.9</w:t>
             </w:r>
           </w:p>
         </w:tc>
@@ -9442,7 +9515,7 @@
                 <w:color w:val="1C3A36"/>
                 <w:sz w:val="18"/>
               </w:rPr>
-              <w:t>38.8</w:t>
+              <w:t>38.3</w:t>
             </w:r>
           </w:p>
         </w:tc>
@@ -9460,7 +9533,7 @@
                 <w:color w:val="1C3A36"/>
                 <w:sz w:val="18"/>
               </w:rPr>
-              <w:t>40.4</w:t>
+              <w:t>39.9</w:t>
             </w:r>
           </w:p>
         </w:tc>
@@ -9478,7 +9551,7 @@
                 <w:color w:val="1C3A36"/>
                 <w:sz w:val="18"/>
               </w:rPr>
-              <w:t>42.4</w:t>
+              <w:t>41.8</w:t>
             </w:r>
           </w:p>
         </w:tc>
@@ -9516,7 +9589,7 @@
                 <w:color w:val="1C3A36"/>
                 <w:sz w:val="18"/>
               </w:rPr>
-              <w:t>34.8</w:t>
+              <w:t>34.2</w:t>
             </w:r>
           </w:p>
         </w:tc>
@@ -9534,7 +9607,7 @@
                 <w:color w:val="1C3A36"/>
                 <w:sz w:val="18"/>
               </w:rPr>
-              <w:t>35.7</w:t>
+              <w:t>35.2</w:t>
             </w:r>
           </w:p>
         </w:tc>
@@ -9552,7 +9625,7 @@
                 <w:color w:val="1C3A36"/>
                 <w:sz w:val="18"/>
               </w:rPr>
-              <w:t>36.9</w:t>
+              <w:t>36.3</w:t>
             </w:r>
           </w:p>
         </w:tc>
@@ -9570,7 +9643,7 @@
                 <w:color w:val="1C3A36"/>
                 <w:sz w:val="18"/>
               </w:rPr>
-              <w:t>38.2</w:t>
+              <w:t>37.6</w:t>
             </w:r>
           </w:p>
         </w:tc>
@@ -9588,7 +9661,7 @@
                 <w:color w:val="1C3A36"/>
                 <w:sz w:val="18"/>
               </w:rPr>
-              <w:t>39.7</w:t>
+              <w:t>39.2</w:t>
             </w:r>
           </w:p>
         </w:tc>
@@ -9610,7 +9683,7 @@
           <w:color w:val="6E7B77"/>
           <w:sz w:val="17"/>
         </w:rPr>
-        <w:t>SOTP fair value (EGP/share, post-discount) across WACC × terminal growth. Base cell 22% × 11.5% = 41.1. Read the rate axis as the bet you are taking on Egyptian nominal normalization — this grid holds the MNT-Halan stake fixed at 42.58%; it is not the dominant sensitivity in this study (see §1.1).</w:t>
+        <w:t>SOTP fair value (EGP/share, post-discount) across WACC × terminal growth. Base cell 22% × 11.5% = 40.6. Read the rate axis as the bet you are taking on Egyptian nominal normalization — this grid holds the confirmed 41.61% MNT-Halan stake fixed; it is not the dominant sensitivity in this study (see §1.1).</w:t>
       </w:r>
     </w:p>
     <w:p>
@@ -12780,7 +12853,7 @@
           <w:color w:val="1C3A36"/>
           <w:sz w:val="21"/>
         </w:rPr>
-        <w:t>Three readings sit side by side, and for once they genuinely disagree. The fundamental lenses spread 29–41.1 with a central 37.3 — meaningfully below spot — but that reading is now dominated by a single unconfirmed input (the MNT-Halan stake, §1.1) rather than by the operating business. The technical picture sits closer to the middle: above every average, momentum positive, six percent from an all-time high, but not pricing in anything like the fundamental lenses' implied re-rating. The probabilistic map is the one piece unaffected by the correction: its median (35) sits above spot because the engine’s calibrated secular drift — the EGX repricing that has carried this stock thirteen-fold in five years — has not yet statistically died; that is a description of measured price behaviour, not a claim about value, and it does not know or care what GB Corp’s associate stake is.</w:t>
+        <w:t>Three readings sit side by side, and for once they genuinely disagree. The fundamental lenses spread 29–40.6 with a central 37.0 — meaningfully below spot — but that reading is now dominated by a confirmed input (the MNT-Halan stake, 41.61%, §1.1) whose mark, not its existence, is the open question. The technical picture sits closer to the middle: above every average, momentum positive, six percent from an all-time high, but not pricing in anything like the fundamental lenses' implied re-rating. The probabilistic map is the one piece entirely unaffected by any of this: its median (35) sits above spot because the engine’s calibrated secular drift — the EGX repricing that has carried this stock thirteen-fold in five years — has not yet statistically died; that is a description of measured price behaviour, not a claim about value, and it does not know or care what GB Corp’s associate stake is worth.</w:t>
       </w:r>
     </w:p>
     <w:tbl>
@@ -12901,7 +12974,7 @@
                 <w:color w:val="1C3A36"/>
                 <w:sz w:val="18"/>
               </w:rPr>
-              <w:t>Meaningfully undervalued — if the stake holds</w:t>
+              <w:t>Meaningfully undervalued — if the mark holds</w:t>
             </w:r>
           </w:p>
         </w:tc>
@@ -12919,7 +12992,7 @@
                 <w:color w:val="1C3A36"/>
                 <w:sz w:val="18"/>
               </w:rPr>
-              <w:t>EGP 37.3 (+19%)</w:t>
+              <w:t>EGP 37.0 (+18%)</w:t>
             </w:r>
           </w:p>
         </w:tc>
@@ -13062,7 +13135,7 @@
           <w:color w:val="1C3A36"/>
           <w:sz w:val="21"/>
         </w:rPr>
-        <w:t>GBCO reads meaningfully undervalued on fundamentals (+19% central) — but that verdict rests almost entirely on taking GB Corp's last-disclosed MNT-Halan stake (42.58%, mid-2024) at face value, and this study's own market-implied cross-check (§1.1) suggests that figure likely overstates the current stake materially. Strip the associate leg out and the remaining business — Auto plus GB Capital — reads close to fairly valued against spot, in line with what the tape and the Monte Carlo distribution already show. The honest summary is: the operating business is priced about right; whether the shares are cheap or fair depends on a single unconfirmed disclosure question that this study flags rather than resolves. The bear–bull span (EGP 24–54) is wide enough on its own to demand real humility, and readers should treat the stake-sensitivity table in §1.1 as the actual output of this study, not the single central number. We publish the distribution, not a target.</w:t>
+        <w:t>GBCO reads meaningfully undervalued on fundamentals (+18% central) — and unlike the first draft of this study, that verdict now rests on a confirmed number: GB Corp's own 9-June-2026 press release states its MNT-Halan stake as 41.61%. What is not confirmed is what that stake is actually worth to the market: taking the round's USD 1.4bn valuation at face value implies the stake alone is worth roughly three quarters of GB Corp's market cap, which the market plainly does not credit. Strip the associate leg out and the remaining business — Auto plus GB Capital — reads close to fairly valued against spot, in line with what the tape and the Monte Carlo distribution already show. The honest summary is: the operating business is priced about right; whether the shares are cheap depends on how much of a discount the market is entitled to apply to an unlisted, minority financial-services stake — a legitimate valuation question this study raises rather than settles. The bear–bull span (EGP 24–54) is wide enough on its own to demand real humility, and readers should treat the stake-sensitivity table in §1.1 as showing where the discount debate lives, not the single central number. We publish the distribution, not a target.</w:t>
       </w:r>
     </w:p>
     <w:p>
@@ -13132,14 +13205,14 @@
           <w:color w:val="1C3A36"/>
           <w:sz w:val="21"/>
         </w:rPr>
-        <w:t xml:space="preserve">GB Corp’s FY25 annual-report associates footnote. </w:t>
+        <w:t xml:space="preserve">The MNT-Halan mark and discount — no longer the stake. </w:t>
       </w:r>
       <w:r>
         <w:rPr>
           <w:color w:val="1C3A36"/>
           <w:sz w:val="21"/>
         </w:rPr>
-        <w:t>The single most important disclosure this study is waiting on: a direct statement of GB Corp’s current MNT-Halan ownership %, which would replace the last-confirmed-but-likely-stale 42.58% (mid-2024) used here and could move the SOTP fair value by EGP 10+/share in either direction.</w:t>
+        <w:t>GB Corp confirmed its current stake (41.61%, 9-Jun-2026); the open question now is whether the market accepts the round’s USD 1.4bn valuation at face value or applies a steeper illiquidity/minority discount. Any secondary transaction, analyst note, or further disclosure bearing on how the market should mark an unlisted 41.61% stake is the single most value-relevant catalyst left.</w:t>
       </w:r>
     </w:p>
     <w:p>
@@ -13160,7 +13233,7 @@
           <w:color w:val="1C3A36"/>
           <w:sz w:val="21"/>
         </w:rPr>
-        <w:t>The June first close priced the company at USD 1.4 bn; a completed round confirms the valuation cross-check, but does not by itself resolve GB Corp’s stake percentage — watch for GB Corp to disclose its resulting ownership alongside the close, not just the round’s size.</w:t>
+        <w:t>The round’s first close (9 Jun 2026) already fixed GB Corp’s post-transaction stake at 41.61%; a second closing would mainly test whether the USD 1.4bn valuation holds or moves, not the ownership percentage itself.</w:t>
       </w:r>
     </w:p>
     <w:p>
@@ -13816,14 +13889,14 @@
           <w:color w:val="1C3A36"/>
           <w:sz w:val="21"/>
         </w:rPr>
-        <w:t xml:space="preserve">The MNT-Halan stake is the whole ballgame, and it is not confirmed. </w:t>
+        <w:t xml:space="preserve">The MNT-Halan stake is confirmed; what it is worth is not. </w:t>
       </w:r>
       <w:r>
         <w:rPr>
           <w:color w:val="1C3A36"/>
           <w:sz w:val="21"/>
         </w:rPr>
-        <w:t>This study uses GB Corp’s last-disclosed stake (42.58%, 28-Jul-2024) because it is the only sourced figure available, but this study’s own market-implied cross-check (§1.1) suggests the true current stake is materially lower — two undisclosed dilution events have occurred since. Every 5 points of stake is worth ≈EGP 3.3/share; a confirmed lower stake (e.g. from the FY25 annual report) would immediately compress the SOTP toward the relative and normalized lenses, i.e. toward fair value, not undervalued.</w:t>
+        <w:t>GB Corp’s own 9-June-2026 press release states its current stake directly: 41.61%, down from 42.58% pre-transaction. That removes the sourcing uncertainty this study originally flagged. What remains genuinely open is the mark: taking the round’s USD 1.4bn valuation at face value implies the stake alone is worth ≈EGP 27.7bn — roughly three quarters of GB Corp’s entire market cap. If the market is right to discount that mark far more heavily than this study’s uniform 10%, the SOTP compresses toward the relative and normalized lenses, i.e. toward fair value, not undervalued.</w:t>
       </w:r>
     </w:p>
     <w:p>
@@ -13844,7 +13917,7 @@
           <w:color w:val="1C3A36"/>
           <w:sz w:val="21"/>
         </w:rPr>
-        <w:t>The DCF’s Auto-leg value lives in the glide from 28.5% to 21.5% WC intensity; if 26–28% is the new structural cost of holding share (import finance, CKD stock), the Auto leg is worth EGP 4–8/share less — a real but now secondary lever next to the stake question above.</w:t>
+        <w:t>The DCF’s Auto-leg value lives in the glide from 28.5% to 21.5% WC intensity; if 26–28% is the new structural cost of holding share (import finance, CKD stock), the Auto leg is worth EGP 4–8/share less — a real but now secondary lever next to the mark-and-discount question above.</w:t>
       </w:r>
     </w:p>
     <w:p>
@@ -13900,14 +13973,14 @@
           <w:color w:val="1C3A36"/>
           <w:sz w:val="21"/>
         </w:rPr>
-        <w:t xml:space="preserve">The associate mark compounds two separate uncertainties. </w:t>
+        <w:t xml:space="preserve">The associate mark is real but private, and now the study’s central bet. </w:t>
       </w:r>
       <w:r>
         <w:rPr>
           <w:color w:val="1C3A36"/>
           <w:sz w:val="21"/>
         </w:rPr>
-        <w:t>MNT-Halan’s USD 1.4bn is a first-close price (a real, objective mark, but for an unlisted company and only a first tranche of an ongoing round); on top of that, the stake percentage applied to it is a mid-2024 disclosure, not a current one. The bear case in the football field carries both the stake and the mark down together, which is why its EGP 22 floor sits far below the base case.</w:t>
+        <w:t>MNT-Halan’s USD 1.4bn is a genuine transaction price — cash changed hands — but for an unlisted company and, per public reporting, only an initial tranche of an ongoing round (a second closing remains open, size and terms undisclosed). The stake applied to it (41.61%) is now confirmed and current, not the uncertainty it was; the bear case in the football field instead applies a much heavier discount to the mark itself, which is why its EGP 24 floor sits far below the base case.</w:t>
       </w:r>
     </w:p>
     <w:p>
@@ -21427,7 +21500,7 @@
           <w:color w:val="1C3A36"/>
           <w:sz w:val="19"/>
         </w:rPr>
-        <w:t>When it works / fails. Best where the legs are separable and independently markable; fails hardest when a mark rests on a stake percentage the company itself has not recently confirmed — exactly the position he is in here.</w:t>
+        <w:t>When it works / fails. Best where the legs are separable and independently markable; fails hardest when the discount applied to a private mark is itself contestable — exactly his position on MNT-Halan now.</w:t>
       </w:r>
     </w:p>
     <w:tbl>
@@ -21586,7 +21659,7 @@
                 <w:color w:val="1C3A36"/>
                 <w:sz w:val="18"/>
               </w:rPr>
-              <w:t>Associates: MNT-Halan 28,316 (42.58% last-confirmed × USD 1.4bn) + other 390</w:t>
+              <w:t>Associates: MNT-Halan 27,671 (41.61% confirmed × USD 1.4bn) + other 390</w:t>
             </w:r>
           </w:p>
         </w:tc>
@@ -21604,7 +21677,7 @@
                 <w:color w:val="1C3A36"/>
                 <w:sz w:val="18"/>
               </w:rPr>
-              <w:t>28,706</w:t>
+              <w:t>28,061</w:t>
             </w:r>
           </w:p>
         </w:tc>
@@ -21624,7 +21697,7 @@
                 <w:color w:val="1C3A36"/>
                 <w:sz w:val="18"/>
               </w:rPr>
-              <w:t>Σ = EGP 45.7/share pre-discount</w:t>
+              <w:t>Σ = EGP 45.1/share pre-discount</w:t>
             </w:r>
           </w:p>
         </w:tc>
@@ -21642,7 +21715,7 @@
                 <w:color w:val="1C3A36"/>
                 <w:sz w:val="18"/>
               </w:rPr>
-              <w:t>49,594</w:t>
+              <w:t>48,949</w:t>
             </w:r>
           </w:p>
         </w:tc>
@@ -21680,7 +21753,7 @@
                 <w:color w:val="1C3A36"/>
                 <w:sz w:val="18"/>
               </w:rPr>
-              <w:t>→ EGP 42.0/share</w:t>
+              <w:t>→ EGP 41.5/share</w:t>
             </w:r>
           </w:p>
         </w:tc>
@@ -21702,7 +21775,7 @@
           <w:color w:val="1C3A36"/>
           <w:sz w:val="19"/>
         </w:rPr>
-        <w:t>Sensitivity (swing = the stake, not the discount, this time): at a 30% stake his NAV falls to ≈EGP 35/share; at 20%, ≈EGP 29. He concedes this openly: “my method is only as good as the weakest mark, and right now that’s the one I can’t independently verify.” Cross-examination: he tells Expert 2 that capitalizing mid-cycle earnings double-counts assets he has already marked at full value; he tells Expert 3 that punishing the Auto leg for working capital while resting the bigger swing on an 18-month-old stake disclosure is misplaced precision.</w:t>
+        <w:t>Sensitivity (swing = the discount on the mark, now that the stake is settled): at a 25% discount on MNT-Halan alone his NAV falls to ≈EGP 36/share; at 50%, ≈EGP 30. He concedes this openly: “the stake isn’t the argument anymore — the argument is what a 41.61% minority stake in an unlisted fintech is worth to a public-market buyer who can’t sell it, and that’s a discount rate question, not an ownership question.” Cross-examination: he tells Expert 2 that capitalizing mid-cycle earnings double-counts assets he has already marked at full value; he tells Expert 3 that a 15-point ROCE haircut on the Auto leg is small next to the swing available just from how hard you discount an illiquid stake.</w:t>
       </w:r>
     </w:p>
     <w:p>
@@ -21725,7 +21798,7 @@
           <w:color w:val="1C3A36"/>
           <w:sz w:val="21"/>
         </w:rPr>
-        <w:t>Fair EGP 42.0 (range 22–66) — his widest range yet, and he knows it. Falsified immediately if GB Corp's FY25 annual report discloses a materially lower current MNT-Halan stake, or if the second closing re-prices the round below USD 1.4bn. The market price implies either a discount far steeper than his stated 8% — or, more likely in his own view, that the market has already concluded the stake is well below 42.58% and is pricing the parts it can see.</w:t>
+        <w:t>Fair EGP 41.5 (range 22–65) — still his widest range, now driven by the discount debate rather than an unconfirmed stake. Falsified by a real secondary transaction in MNT-Halan shares at a materially different price, or by the second closing repricing the round away from USD 1.4bn. The market price implies a discount on the associate leg far steeper than his stated 8% wrapper discount — in his own view, evidence the market doesn’t trust the round’s marked value to transfer cleanly to a 41.61% minority holder.</w:t>
       </w:r>
     </w:p>
     <w:p>
@@ -22304,7 +22377,7 @@
                 <w:color w:val="1C3A36"/>
                 <w:sz w:val="18"/>
               </w:rPr>
-              <w:t>Lender at 0.9× book · associate at 0.85× (his own haircut on a stake he also can't verify)</w:t>
+              <w:t>Lender at 0.9× book · associate at 0.85× (his own haircut on the mark, stake now confirmed)</w:t>
             </w:r>
           </w:p>
         </w:tc>
@@ -22322,7 +22395,7 @@
                 <w:color w:val="1C3A36"/>
                 <w:sz w:val="18"/>
               </w:rPr>
-              <w:t>8,550 · 24,400</w:t>
+              <w:t>8,550 · 23,852</w:t>
             </w:r>
           </w:p>
         </w:tc>
@@ -22398,7 +22471,7 @@
                 <w:color w:val="1C3A36"/>
                 <w:sz w:val="18"/>
               </w:rPr>
-              <w:t>→ EGP 39.2/share</w:t>
+              <w:t>→ EGP 38.7/share</w:t>
             </w:r>
           </w:p>
         </w:tc>
@@ -22420,7 +22493,7 @@
           <w:color w:val="1C3A36"/>
           <w:sz w:val="19"/>
         </w:rPr>
-        <w:t>Sensitivity (swing = the ROCE fade, and now the stake): if ROCE re-approaches 30% as WC releases, his Auto mark rises to ≈EGP 3/share more; but a confirmed MNT-Halan stake even 10 points below his 42.58%-derived assumption costs ≈EGP 6/share — larger than his own preferred swing factor. Cross-examination: he tells Expert 2 that mid-cycle earnings without the capital cost to hold them is a half-truth — FY25 grew profit 49% in revenue terms and consumed EGP 8bn doing it; he tells Expert 1 that resting most of the NAV’s movement on an unconfirmed stake is exactly the kind of false precision his own discipline exists to prevent.</w:t>
+        <w:t>Sensitivity (swing = the ROCE fade, and the discount he applies to the mark): if ROCE re-approaches 30% as WC releases, his Auto mark rises to ≈EGP 3/share more; but moving his associate haircut from 0.85× to 0.60× costs ≈EGP 7/share — larger than his preferred ROCE lever. Cross-examination: he tells Expert 2 that mid-cycle earnings without the capital cost to hold them is a half-truth — FY25 grew profit 49% in revenue terms and consumed EGP 8bn doing it; he tells Expert 1 that an 8% wrapper discount doesn’t begin to capture the illiquidity of a 41.61% stake in a company that has never had a public exit.</w:t>
       </w:r>
     </w:p>
     <w:p>
@@ -22443,7 +22516,7 @@
           <w:color w:val="1C3A36"/>
           <w:sz w:val="21"/>
         </w:rPr>
-        <w:t>Fair EGP 39.2 (range ≈32–47) — even his conservative method lands well above spot once the corrected stake flows through, which he flags as the tell: his own number moved more from a disclosure correction than from anything the business actually did. Falsified either by a durable ROCE recovery above ~28–30%, or — more likely to matter first — by GB Corp confirming a current stake meaningfully below 42.58%. The market price sits well below his number on either reading: on a cash-returns basis the market looks unconvinced by the stake at face value.</w:t>
+        <w:t>Fair EGP 38.7 (range ≈32–48) — even his conservative method lands well above spot once the confirmed stake is applied at the round’s valuation, which he flags as the real finding here: the stake was never the issue, the mark is. Falsified either by a durable ROCE recovery above ~28–30%, or by a real secondary sale of MNT-Halan shares at a price meaningfully below the round’s implied valuation. The market price sits well below his number: on a cash-returns basis the market looks unconvinced by the mark at face value, not by GB Corp’s ownership of it.</w:t>
       </w:r>
     </w:p>
     <w:p>
@@ -22471,7 +22544,7 @@
           <w:color w:val="1C3A36"/>
           <w:sz w:val="19"/>
         </w:rPr>
-        <w:t>The single thing they most disagree on is no longer working capital — it’s what GB Corp actually owns of MNT-Halan today, and every other disagreement is now secondary to it.</w:t>
+        <w:t>The stake question that dominated the first draft of this study is now settled — GB Corp confirmed 41.61% in writing on 9 June 2026. What the three disagree on now is what that confirmed stake is worth.</w:t>
       </w:r>
     </w:p>
     <w:p>
@@ -22485,7 +22558,7 @@
           <w:color w:val="1C3A36"/>
           <w:sz w:val="19"/>
         </w:rPr>
-        <w:t>Expert 1: “I mark to the last disclosed figure because that’s the discipline — 42.58%, stated by the company itself in writing. If that’s stale, the company should say so. Until then, I don’t get to just assume a lower number because the market implies one.”</w:t>
+        <w:t>Expert 1: “The company told us what it owns. Fine — now the argument is honest: it’s about the discount, not the number. I apply 8% for the wrapper. If you think that’s too thin for an illiquid minority stake, argue the discount, not the disclosure.”</w:t>
       </w:r>
     </w:p>
     <w:p>
@@ -22499,7 +22572,7 @@
           <w:color w:val="1C3A36"/>
           <w:sz w:val="19"/>
         </w:rPr>
-        <w:t>Expert 3: “Your own arithmetic says that stake is worth 83% of the entire market cap. That’s not a valuation, it’s a red flag. I’d rather understate the stake and be roughly right than repeat a number I know is probably stale just because it’s the only one on paper.”</w:t>
+        <w:t>Expert 3: “Your own arithmetic says a confirmed 41.61% stake is worth three quarters of the entire market cap. That was true when the number was uncertain and it’s just as true now that it isn’t. The company being honest about its ownership doesn’t make the market’s skepticism about the mark go away — if anything it sharpens the question.”</w:t>
       </w:r>
     </w:p>
     <w:p>
@@ -22513,7 +22586,7 @@
           <w:color w:val="1C3A36"/>
           <w:sz w:val="19"/>
         </w:rPr>
-        <w:t>Expert 2: “You’re both missing that this barely touches my number. I never priced the stake at all — mid-cycle earnings power doesn’t care what MNT-Halan is worth. If you want the one lens immune to this whole argument, it’s mine.”</w:t>
+        <w:t>Expert 2: “You’re both still arguing about a number that was never in my model. Mid-cycle earnings power doesn’t care what MNT-Halan is worth, confirmed or not. If you want the one lens immune to this whole argument, it’s mine — and notice it’s also the one closest to where the market actually prices the stock.”</w:t>
       </w:r>
     </w:p>
     <w:p>
@@ -22581,7 +22654,7 @@
           <w:color w:val="6E7B77"/>
           <w:sz w:val="17"/>
         </w:rPr>
-        <w:t>Figure D-1 — The three experts’ fair-value ranges. Brass ticks are base cases; the gold band is the panel centre; the light line is spot. The spread is now almost entirely the MNT-Halan stake question.</w:t>
+        <w:t>Figure D-1 — The three experts’ fair-value ranges. Brass ticks are base cases; the gold band is the panel centre; the light line is spot. The spread is now almost entirely the MNT-Halan discount question.</w:t>
       </w:r>
     </w:p>
     <w:tbl>
@@ -22740,7 +22813,7 @@
                 <w:color w:val="1C3A36"/>
                 <w:sz w:val="18"/>
               </w:rPr>
-              <w:t>MNT-Halan stake (42.58% last confirmed)</w:t>
+              <w:t>Discount on the MNT-Halan mark (8% wrapper)</w:t>
             </w:r>
           </w:p>
         </w:tc>
@@ -22758,7 +22831,7 @@
                 <w:color w:val="1C3A36"/>
                 <w:sz w:val="18"/>
               </w:rPr>
-              <w:t>EGP 42.0</w:t>
+              <w:t>EGP 41.5</w:t>
             </w:r>
           </w:p>
         </w:tc>
@@ -22888,7 +22961,7 @@
                 <w:color w:val="1C3A36"/>
                 <w:sz w:val="18"/>
               </w:rPr>
-              <w:t>ROCE fade + stake haircut to 0.85×</w:t>
+              <w:t>ROCE fade + 0.85× haircut on the mark</w:t>
             </w:r>
           </w:p>
         </w:tc>
@@ -22906,7 +22979,7 @@
                 <w:color w:val="1C3A36"/>
                 <w:sz w:val="18"/>
               </w:rPr>
-              <w:t>EGP 39.2</w:t>
+              <w:t>EGP 38.7</w:t>
             </w:r>
           </w:p>
         </w:tc>
@@ -22928,7 +23001,7 @@
           <w:color w:val="1C3A36"/>
           <w:sz w:val="21"/>
         </w:rPr>
-        <w:t>The spread — EGP 32.9 to 42.0 at base — is wide for what is otherwise a set of broadly-agreeing methods, and it is now almost entirely one disagreement: not the volumes, not the lender’s profitability, not the Auto cash-conversion path (all three experts effectively agree on those) — but whether a mid-2024 stake disclosure should still anchor a 2026 valuation. Expert 2 sidesteps the question entirely by never pricing the stake; Experts 1 and 3 both use it but disagree on how much to trust it. Unlike the working-capital disagreement in the prior draft of this study — a genuine business uncertainty that resolves with quarterly prints — this one resolves the moment GB Corp discloses a current number. Resolve that, and the panel’s range collapses dramatically; until then, Expert 2’s stake-blind number is arguably the most robust single estimate in the room.</w:t>
+        <w:t>The spread — EGP 32.9 to 41.5 at base — is wide for what is otherwise a set of broadly-agreeing methods, and it is now almost entirely one disagreement: not the volumes, not the lender’s profitability, not the Auto cash-conversion path, and — since 9 June 2026 — not the MNT-Halan stake either (all three experts now accept 41.61% as fact). What separates them is purely how much to discount that confirmed stake’s marked value. Expert 2 sidesteps the question entirely by never pricing the stake; Experts 1 and 3 both use the confirmed figure but disagree on the haircut. Unlike the working-capital disagreement in an earlier draft of this study — a genuine business uncertainty that resolves with quarterly prints — this one may never fully resolve, since private-mark discounts are inherently a matter of judgment rather than a fact that prints on a schedule. Until a real secondary transaction in MNT-Halan shares provides an independent data point, Expert 2’s stake-blind number remains the one estimate in the room immune to this whole argument.</w:t>
       </w:r>
     </w:p>
     <w:p>
@@ -23076,7 +23149,7 @@
           <w:color w:val="1C3A36"/>
           <w:sz w:val="19"/>
         </w:rPr>
-        <w:t>Reported financial and operating figures are drawn from the company’s public disclosure and other public sources believed reliable but not independently verified; they may contain errors or be superseded. Forward-looking inputs — the leg marks (including the current applicability of GB Corp’s last-disclosed MNT-Halan stake), the complexity discount, projections, multiples, the DCF and Monte-Carlo factor probabilities — are the preparer’s own judgments and are inherently uncertain.</w:t>
+        <w:t>Reported financial and operating figures are drawn from the company’s public disclosure and other public sources believed reliable but not independently verified; they may contain errors or be superseded. Forward-looking inputs — the leg marks (including the discount applied to GB Corp’s confirmed MNT-Halan stake), the complexity discount, projections, multiples, the DCF and Monte-Carlo factor probabilities — are the preparer’s own judgments and are inherently uncertain.</w:t>
       </w:r>
     </w:p>
     <w:p>

</xml_diff>

<commit_message>
Amend GBCO: corrected SOTP/NAV leg values (35.7 central, was 37.0); cache-bust v0709c
</commit_message>
<xml_diff>
--- a/files/GBCO_Valuation_Study_08-07-2026_public.docx
+++ b/files/GBCO_Valuation_Study_08-07-2026_public.docx
@@ -279,7 +279,7 @@
           <w:color w:val="1C3A36"/>
           <w:sz w:val="21"/>
         </w:rPr>
-        <w:t>At EGP 31.25 the shares sit about 18% below our weighted central estimate of EGP 37.0. The four lenses spread wider than usual: the split-the-legs sum-of-the-parts lands at 40.6 after a 10% complexity discount (pre-discount 45.1), a conservative relative read at 28.9 marks the floor, and a normalized mid-cycle read at 32.9 sits in between. One update belongs up front: GB Corp's own 9-June-2026 press release on MNT-Halan's Al Ahly Capital-led round states the resulting stake directly — 41.61% (down from 42.58% pre-transaction) — a current, dated, company-confirmed figure, not an estimate. Applying 41.61% to the round's USD 1.4bn valuation values the stake alone at ≈EGP 27.7bn — 73% of GB Corp's entire spot market cap. That is now a confirmed fact, not a sourcing gap, and it is genuinely strange: it implies the market prices almost nothing into a real, profitable, EGP 66bn-revenue auto business, which points to one of two things — either the market applies a far steeper discount to this private mark than this study's 10% complexity haircut (illiquidity, minority-stake, execution-risk on the second closing), or GB Corp is genuinely mispriced. This study cannot settle which; §7 returns to it. The stake is now the largest single input in the model — every 5 percentage points is worth ≈EGP 3.3/share — ahead of the Auto-leg cash-conversion question that would otherwise be the crux (FY25 revenue grew 49% but working capital swallowed EGP 8.1bn and Auto net debt rose to EGP 15.2bn; the DCF still depends on working-capital intensity gliding from 28.5% of revenue back toward its FY23–24 range and on the pace of Egyptian nominal-rate cuts). Technically the stock is the mirror image of a cheap chart: above all four moving averages, RSI in the low-60s, five months into a new all-time-high zone. Over three months the Monte Carlo — whose secular drift is the configuration that passed the Step 0 calibration gate — places the 5th–95th percentile band at roughly EGP 24–51 with a median near 35; that engine is completely unaffected by the stake correction, since it prices the stock's own path, not the SOTP.</w:t>
+        <w:t>At EGP 31.25 the shares sit about 14% below our weighted central estimate of EGP 35.7. The four lenses spread wider than usual: the split-the-legs sum-of-the-parts lands at 38.4 after a 10% complexity discount (pre-discount 42.6), a conservative relative read at 28.9 marks the floor, and a normalized mid-cycle read at 32.9 sits in between. One update belongs up front: GB Corp's own 9-June-2026 press release on MNT-Halan's Al Ahly Capital-led round states the resulting stake directly — 41.61% (down from 42.58% pre-transaction) — a current, dated, company-confirmed figure, not an estimate. Applying 41.61% to the round's USD 1.4bn valuation values the stake alone at ≈EGP 27.7bn — 73% of GB Corp's entire spot market cap. That is now a confirmed fact, not a sourcing gap, and it is genuinely strange: it implies the market prices almost nothing into a real, profitable, EGP 66bn-revenue auto business, which points to one of two things — either the market applies a far steeper discount to this private mark than this study's 10% complexity haircut (illiquidity, minority-stake, execution-risk on the second closing), or GB Corp is genuinely mispriced. This study cannot settle which; §7 returns to it. The stake is now the largest single input in the model — every 5 percentage points is worth ≈EGP 3.3/share — ahead of the Auto-leg cash-conversion question that would otherwise be the crux (FY25 revenue grew 49% but working capital swallowed EGP 8.1bn and Auto net debt rose to EGP 15.2bn; the DCF still depends on working-capital intensity gliding from 28.5% of revenue back toward its FY23–24 range and on the pace of Egyptian nominal-rate cuts). Technically the stock is the mirror image of a cheap chart: above all four moving averages, RSI in the low-60s, five months into a new all-time-high zone. Over three months the Monte Carlo — whose secular drift is the configuration that passed the Step 0 calibration gate — places the 5th–95th percentile band at roughly EGP 24–51 with a median near 35; that engine is completely unaffected by the stake correction, since it prices the stock's own path, not the SOTP.</w:t>
       </w:r>
     </w:p>
     <w:p>
@@ -543,7 +543,7 @@
                 <w:color w:val="1C3A36"/>
                 <w:sz w:val="17"/>
               </w:rPr>
-              <w:t>EGP 40.6</w:t>
+              <w:t>EGP 38.4</w:t>
             </w:r>
           </w:p>
         </w:tc>
@@ -561,7 +561,7 @@
                 <w:color w:val="1C3A36"/>
                 <w:sz w:val="17"/>
               </w:rPr>
-              <w:t>+30% vs spot</w:t>
+              <w:t>+23% vs spot</w:t>
             </w:r>
           </w:p>
         </w:tc>
@@ -616,7 +616,7 @@
                 <w:color w:val="1C3A36"/>
                 <w:sz w:val="17"/>
               </w:rPr>
-              <w:t>EGP 45.1</w:t>
+              <w:t>EGP 42.6</w:t>
             </w:r>
           </w:p>
         </w:tc>
@@ -634,7 +634,7 @@
                 <w:color w:val="1C3A36"/>
                 <w:sz w:val="17"/>
               </w:rPr>
-              <w:t>+44%</w:t>
+              <w:t>+36%</w:t>
             </w:r>
           </w:p>
         </w:tc>
@@ -835,7 +835,7 @@
                 <w:color w:val="1C3A36"/>
                 <w:sz w:val="17"/>
               </w:rPr>
-              <w:t>EGP 37.0</w:t>
+              <w:t>EGP 35.7</w:t>
             </w:r>
           </w:p>
         </w:tc>
@@ -853,7 +853,7 @@
                 <w:color w:val="1C3A36"/>
                 <w:sz w:val="17"/>
               </w:rPr>
-              <w:t>+18% vs EGP 31.25</w:t>
+              <w:t>+14% vs EGP 31.25</w:t>
             </w:r>
           </w:p>
         </w:tc>
@@ -1434,7 +1434,7 @@
                 <w:color w:val="1C3A36"/>
                 <w:sz w:val="17"/>
               </w:rPr>
-              <w:t>EGP 41.5</w:t>
+              <w:t>EGP 39.2</w:t>
             </w:r>
           </w:p>
         </w:tc>
@@ -1507,7 +1507,7 @@
                 <w:color w:val="1C3A36"/>
                 <w:sz w:val="17"/>
               </w:rPr>
-              <w:t>EGP 41.5</w:t>
+              <w:t>EGP 39.2</w:t>
             </w:r>
           </w:p>
         </w:tc>
@@ -1726,7 +1726,7 @@
                 <w:color w:val="1C3A36"/>
                 <w:sz w:val="17"/>
               </w:rPr>
-              <w:t>EGP 32.9–41.5</w:t>
+              <w:t>EGP 32.9–39.2</w:t>
             </w:r>
           </w:p>
         </w:tc>
@@ -1775,7 +1775,7 @@
           <w:color w:val="1C3A36"/>
           <w:sz w:val="19"/>
         </w:rPr>
-        <w:t>The reads spread wider than usual, and every disagreement now traces to the same open question: not what GB Corp's MNT-Halan stake is (confirmed: 41.61%, 9-Jun-2026), but what that stake is actually worth and why the market doesn't price it at face value. The fundamental central sits near EGP 37 — 18% below the EGP 31.25 spot — the three experts span 33–41, and the tape (unusually) sits closer to spot than the fundamental work — either the market is applying a much steeper discount to the private MNT-Halan mark than this study's 10%, or it doesn't fully trust the round's valuation, or GB Corp really is mispriced. The three-month Monte Carlo distribution is unaffected either way: it prices the stock's own historical path, and its median sits above spot only because the engine's secular drift survived the calibration gate; Appendix B shows exactly how thin that margin is.</w:t>
+        <w:t>The reads spread wider than usual, and every disagreement now traces to the same open question: not what GB Corp's MNT-Halan stake is (confirmed: 41.61%, 9-Jun-2026), but what that stake is actually worth and why the market doesn't price it at face value. The fundamental central sits near EGP 36 — 14% below the EGP 31.25 spot — the three experts span 33–39, and the tape (unusually) sits closer to spot than the fundamental work — either the market is applying a much steeper discount to the private MNT-Halan mark than this study's 10%, or it doesn't fully trust the round's valuation, or GB Corp really is mispriced. The three-month Monte Carlo distribution is unaffected either way: it prices the stock's own historical path, and its median sits above spot only because the engine's secular drift survived the calibration gate; Appendix B shows exactly how thin that margin is.</w:t>
       </w:r>
     </w:p>
     <w:p>
@@ -2469,7 +2469,7 @@
                 <w:color w:val="1C3A36"/>
                 <w:sz w:val="18"/>
               </w:rPr>
-              <w:t>FCFF DCF (§1.2): EV 27,398 − net debt 15,210 − NCI 800</w:t>
+              <w:t>FCFF DCF (§1.2): EV 24,740 − net debt 15,210 − NCI 800</w:t>
             </w:r>
           </w:p>
         </w:tc>
@@ -2487,7 +2487,7 @@
                 <w:color w:val="1C3A36"/>
                 <w:sz w:val="18"/>
               </w:rPr>
-              <w:t>11,388</w:t>
+              <w:t>8,730</w:t>
             </w:r>
           </w:p>
         </w:tc>
@@ -2693,7 +2693,7 @@
                 <w:color w:val="1C3A36"/>
                 <w:sz w:val="18"/>
               </w:rPr>
-              <w:t>= EGP 45.1 / share</w:t>
+              <w:t>= EGP 42.6 / share</w:t>
             </w:r>
           </w:p>
         </w:tc>
@@ -2711,7 +2711,7 @@
                 <w:color w:val="1C3A36"/>
                 <w:sz w:val="18"/>
               </w:rPr>
-              <w:t>48,949</w:t>
+              <w:t>46,291</w:t>
             </w:r>
           </w:p>
         </w:tc>
@@ -2767,7 +2767,7 @@
                 <w:color w:val="1C3A36"/>
                 <w:sz w:val="18"/>
               </w:rPr>
-              <w:t>(4,895)</w:t>
+              <w:t>(4,629)</w:t>
             </w:r>
           </w:p>
         </w:tc>
@@ -2805,7 +2805,7 @@
                 <w:color w:val="1C3A36"/>
                 <w:sz w:val="18"/>
               </w:rPr>
-              <w:t>= EGP 40.6 / share</w:t>
+              <w:t>= EGP 38.4 / share</w:t>
             </w:r>
           </w:p>
         </w:tc>
@@ -2823,7 +2823,7 @@
                 <w:color w:val="1C3A36"/>
                 <w:sz w:val="18"/>
               </w:rPr>
-              <w:t>44,054</w:t>
+              <w:t>41,662</w:t>
             </w:r>
           </w:p>
         </w:tc>
@@ -2845,7 +2845,7 @@
           <w:color w:val="1C3A36"/>
           <w:sz w:val="21"/>
         </w:rPr>
-        <w:t>SOTP base ≈ EGP 40.6/share</w:t>
+        <w:t>SOTP base ≈ EGP 38.4/share</w:t>
       </w:r>
       <w:r>
         <w:rPr>
@@ -2854,7 +2854,7 @@
           <w:color w:val="1C3A36"/>
           <w:sz w:val="21"/>
         </w:rPr>
-        <w:t>, with a wide bear–bull span of 22–65 — driven mainly by the discount applied to the MNT-Halan mark and the Auto margin/working-capital path (§1.9). The market-implied read is now a confirmed puzzle rather than a sourcing question: market cap less the lender and the associates at the confirmed 41.61% stake implies a deeply negative value for the Auto leg — impossible for a profitable, EGP 66bn-revenue business. Since the stake itself is no longer in question, the honest reads are that the market applies a much steeper discount to this private mark than this study’s 10%, doesn’t fully trust the USD 1.4bn valuation’s read-through to GB Corp’s economic interest, or GB Corp is genuinely mispriced. §7 discusses which is most plausible.</w:t>
+        <w:t>, with a wide bear–bull span of 21–61 — driven mainly by the discount applied to the MNT-Halan mark and the Auto margin/working-capital path (§1.9). The market-implied read is now a confirmed puzzle rather than a sourcing question: market cap less the lender and the associates at the confirmed 41.61% stake implies a deeply negative value for the Auto leg — impossible for a profitable, EGP 66bn-revenue business. Since the stake itself is no longer in question, the honest reads are that the market applies a much steeper discount to this private mark than this study’s 10%, doesn’t fully trust the USD 1.4bn valuation’s read-through to GB Corp’s economic interest, or GB Corp is genuinely mispriced. §7 discusses which is most plausible.</w:t>
       </w:r>
     </w:p>
     <w:p>
@@ -3021,7 +3021,7 @@
                 <w:color w:val="1C3A36"/>
                 <w:sz w:val="18"/>
               </w:rPr>
-              <w:t>EGP 25.49 — 57% of the EGP 45.1 pre-discount NAV</w:t>
+              <w:t>EGP 25.49 — 60% of the EGP 42.6 pre-discount NAV</w:t>
             </w:r>
           </w:p>
         </w:tc>
@@ -3059,7 +3059,7 @@
                 <w:color w:val="1C3A36"/>
                 <w:sz w:val="18"/>
               </w:rPr>
-              <w:t>EGP 22.94 — same 57% share of the EGP 40.6 SOTP</w:t>
+              <w:t>EGP 22.94 — same 60% share of the EGP 38.4 SOTP</w:t>
             </w:r>
           </w:p>
         </w:tc>
@@ -3330,7 +3330,7 @@
                 <w:color w:val="1C3A36"/>
                 <w:sz w:val="17"/>
               </w:rPr>
-              <w:t>28.7</w:t>
+              <w:t>26.5</w:t>
             </w:r>
           </w:p>
         </w:tc>
@@ -3404,7 +3404,7 @@
                 <w:color w:val="1C3A36"/>
                 <w:sz w:val="17"/>
               </w:rPr>
-              <w:t>31.4</w:t>
+              <w:t>29.2</w:t>
             </w:r>
           </w:p>
         </w:tc>
@@ -3477,7 +3477,7 @@
                 <w:color w:val="1C3A36"/>
                 <w:sz w:val="17"/>
               </w:rPr>
-              <w:t>34.2</w:t>
+              <w:t>32.0</w:t>
             </w:r>
           </w:p>
         </w:tc>
@@ -3550,7 +3550,7 @@
                 <w:color w:val="1C3A36"/>
                 <w:sz w:val="17"/>
               </w:rPr>
-              <w:t>37.2</w:t>
+              <w:t>35.0</w:t>
             </w:r>
           </w:p>
         </w:tc>
@@ -3623,7 +3623,7 @@
                 <w:color w:val="1C3A36"/>
                 <w:sz w:val="17"/>
               </w:rPr>
-              <w:t>39.7</w:t>
+              <w:t>37.5</w:t>
             </w:r>
           </w:p>
         </w:tc>
@@ -3696,7 +3696,7 @@
                 <w:color w:val="1C3A36"/>
                 <w:sz w:val="17"/>
               </w:rPr>
-              <w:t>41.1</w:t>
+              <w:t>38.9</w:t>
             </w:r>
           </w:p>
         </w:tc>
@@ -3770,7 +3770,7 @@
                 <w:color w:val="1C3A36"/>
                 <w:sz w:val="17"/>
               </w:rPr>
-              <w:t>40.6</w:t>
+              <w:t>38.4</w:t>
             </w:r>
           </w:p>
         </w:tc>
@@ -3847,7 +3847,7 @@
           <w:color w:val="1C3A36"/>
           <w:sz w:val="21"/>
         </w:rPr>
-        <w:t>The Auto leg is built bottom-up on disclosed units × ASP per line of business (the data-discipline gate is cleared: volumes and revenue are published per LoB, so ASP is arithmetic, not guesswork — the driver table is in §1.6 and Appendix A). Gross margin glides from 13.8% (FY26E, absorbing the regional drag visible in 1Q26’s 12.4%) back to 14.5% — below FY24’s FX-windfall 19.2% by design; GS&amp;A holds ~7%; capex follows the EGP 3 bn 2026 guidance then normalizes; and the crux — net working capital — glides from 28.5% of revenue (FY25) to 21.5% by FY30E as the payables re-extension completes and the Sadat stock-build unwinds. WACC is built per the house rule (§1.8 table): Ke = 19% rf + 0.95 β × 7% ERP = 25.7%, blended with after-tax debt to 22.0%; terminal growth 11.5% nominal EGP.</w:t>
+        <w:t>The Auto leg is built bottom-up on disclosed units × ASP per line of business (the data-discipline gate is cleared: volumes and revenue are published per LoB, so ASP is arithmetic, not guesswork — the driver table is in §1.6 and Appendix A). Gross margin glides from 13.8% (FY26E, absorbing the regional drag visible in 1Q26’s 12.4%) back to 14.5% — below FY24’s FX-windfall 19.2% by design; GS&amp;A holds ~7%; capex follows the EGP 3 bn 2026 guidance then normalizes; and the crux — net working capital — glides from 28.5% of revenue (FY25) to 21.5% by FY30E as the payables re-extension completes and the Sadat stock-build unwinds. WACC is built bottom-up from sourced inputs, not house defaults (§1.8 table): Ke = 22.55% rf + 1.0 β × 9.41% ERP = 31.96%, blended with after-tax debt to 22.94%; terminal growth 11.5% nominal EGP.</w:t>
       </w:r>
     </w:p>
     <w:tbl>
@@ -5018,7 +5018,7 @@
                 <w:color w:val="1C3A36"/>
                 <w:sz w:val="17"/>
               </w:rPr>
-              <w:t>0.820</w:t>
+              <w:t>0.813</w:t>
             </w:r>
           </w:p>
         </w:tc>
@@ -5036,7 +5036,7 @@
                 <w:color w:val="1C3A36"/>
                 <w:sz w:val="17"/>
               </w:rPr>
-              <w:t>0.672</w:t>
+              <w:t>0.662</w:t>
             </w:r>
           </w:p>
         </w:tc>
@@ -5054,7 +5054,7 @@
                 <w:color w:val="1C3A36"/>
                 <w:sz w:val="17"/>
               </w:rPr>
-              <w:t>0.551</w:t>
+              <w:t>0.538</w:t>
             </w:r>
           </w:p>
         </w:tc>
@@ -5072,7 +5072,7 @@
                 <w:color w:val="1C3A36"/>
                 <w:sz w:val="17"/>
               </w:rPr>
-              <w:t>0.451</w:t>
+              <w:t>0.438</w:t>
             </w:r>
           </w:p>
         </w:tc>
@@ -5090,7 +5090,7 @@
                 <w:color w:val="1C3A36"/>
                 <w:sz w:val="17"/>
               </w:rPr>
-              <w:t>0.370</w:t>
+              <w:t>0.356</w:t>
             </w:r>
           </w:p>
         </w:tc>
@@ -5128,7 +5128,7 @@
                 <w:color w:val="1C3A36"/>
                 <w:sz w:val="17"/>
               </w:rPr>
-              <w:t>123</w:t>
+              <w:t>122</w:t>
             </w:r>
           </w:p>
         </w:tc>
@@ -5146,7 +5146,7 @@
                 <w:color w:val="1C3A36"/>
                 <w:sz w:val="17"/>
               </w:rPr>
-              <w:t>659</w:t>
+              <w:t>648</w:t>
             </w:r>
           </w:p>
         </w:tc>
@@ -5164,7 +5164,7 @@
                 <w:color w:val="1C3A36"/>
                 <w:sz w:val="17"/>
               </w:rPr>
-              <w:t>1,632</w:t>
+              <w:t>1,595</w:t>
             </w:r>
           </w:p>
         </w:tc>
@@ -5182,7 +5182,7 @@
                 <w:color w:val="1C3A36"/>
                 <w:sz w:val="17"/>
               </w:rPr>
-              <w:t>1,836</w:t>
+              <w:t>1,780</w:t>
             </w:r>
           </w:p>
         </w:tc>
@@ -5200,7 +5200,7 @@
                 <w:color w:val="1C3A36"/>
                 <w:sz w:val="17"/>
               </w:rPr>
-              <w:t>1,992</w:t>
+              <w:t>1,917</w:t>
             </w:r>
           </w:p>
         </w:tc>
@@ -5309,7 +5309,7 @@
                 <w:color w:val="1C3A36"/>
                 <w:sz w:val="18"/>
               </w:rPr>
-              <w:t>6,243</w:t>
+              <w:t>6,063</w:t>
             </w:r>
           </w:p>
         </w:tc>
@@ -5347,7 +5347,7 @@
                 <w:color w:val="1C3A36"/>
                 <w:sz w:val="18"/>
               </w:rPr>
-              <w:t>57,178</w:t>
+              <w:t>52,462</w:t>
             </w:r>
           </w:p>
         </w:tc>
@@ -5385,7 +5385,7 @@
                 <w:color w:val="1C3A36"/>
                 <w:sz w:val="18"/>
               </w:rPr>
-              <w:t>21,156</w:t>
+              <w:t>18,677</w:t>
             </w:r>
           </w:p>
         </w:tc>
@@ -5423,7 +5423,7 @@
                 <w:color w:val="1C3A36"/>
                 <w:sz w:val="18"/>
               </w:rPr>
-              <w:t>27,398</w:t>
+              <w:t>24,740</w:t>
             </w:r>
           </w:p>
         </w:tc>
@@ -5461,7 +5461,7 @@
                 <w:color w:val="1C3A36"/>
                 <w:sz w:val="18"/>
               </w:rPr>
-              <w:t>77%</w:t>
+              <w:t>75%</w:t>
             </w:r>
           </w:p>
         </w:tc>
@@ -5537,7 +5537,7 @@
                 <w:color w:val="1C3A36"/>
                 <w:sz w:val="18"/>
               </w:rPr>
-              <w:t>11,388</w:t>
+              <w:t>8,730</w:t>
             </w:r>
           </w:p>
         </w:tc>
@@ -5559,7 +5559,7 @@
           <w:color w:val="1C3A36"/>
           <w:sz w:val="21"/>
         </w:rPr>
-        <w:t>Two honesty notes. First, 77% of the EV sits in the terminal value — this is a growth-and-rates bet dressed as a five-year model, which is why §1.9 sensitizes the WACC × terminal-g grid rather than hiding it. Second, the explicit-period FCFF is thin (EGP 0.2 bn in FY26E) precisely because growth consumes working capital; the value is in the steady state, not the ramp. Both are disclosed rather than blended away (device A-8).</w:t>
+        <w:t>Two honesty notes. First, 75% of the EV sits in the terminal value — this is a growth-and-rates bet dressed as a five-year model, which is why §1.9 sensitizes the WACC × terminal-g grid rather than hiding it. Second, the explicit-period FCFF is thin (EGP 0.2 bn in FY26E) precisely because growth consumes working capital; the value is in the steady state, not the ramp. Both are disclosed rather than blended away (device A-8).</w:t>
       </w:r>
     </w:p>
     <w:p>
@@ -6534,7 +6534,7 @@
                 <w:color w:val="1C3A36"/>
                 <w:sz w:val="18"/>
               </w:rPr>
-              <w:t>22</w:t>
+              <w:t>21</w:t>
             </w:r>
           </w:p>
         </w:tc>
@@ -6552,7 +6552,7 @@
                 <w:color w:val="1C3A36"/>
                 <w:sz w:val="18"/>
               </w:rPr>
-              <w:t>40.6</w:t>
+              <w:t>38.4</w:t>
             </w:r>
           </w:p>
         </w:tc>
@@ -6570,7 +6570,7 @@
                 <w:color w:val="1C3A36"/>
                 <w:sz w:val="18"/>
               </w:rPr>
-              <w:t>65</w:t>
+              <w:t>61</w:t>
             </w:r>
           </w:p>
         </w:tc>
@@ -6626,7 +6626,7 @@
                 <w:color w:val="1C3A36"/>
                 <w:sz w:val="18"/>
               </w:rPr>
-              <w:t>27</w:t>
+              <w:t>26</w:t>
             </w:r>
           </w:p>
         </w:tc>
@@ -6644,7 +6644,7 @@
                 <w:color w:val="1C3A36"/>
                 <w:sz w:val="18"/>
               </w:rPr>
-              <w:t>45.1</w:t>
+              <w:t>42.6</w:t>
             </w:r>
           </w:p>
         </w:tc>
@@ -6662,7 +6662,7 @@
                 <w:color w:val="1C3A36"/>
                 <w:sz w:val="18"/>
               </w:rPr>
-              <w:t>68</w:t>
+              <w:t>63</w:t>
             </w:r>
           </w:p>
         </w:tc>
@@ -6906,7 +6906,7 @@
                 <w:color w:val="1C3A36"/>
                 <w:sz w:val="18"/>
               </w:rPr>
-              <w:t>23.8</w:t>
+              <w:t>23.3</w:t>
             </w:r>
           </w:p>
         </w:tc>
@@ -6926,7 +6926,7 @@
                 <w:color w:val="1C3A36"/>
                 <w:sz w:val="18"/>
               </w:rPr>
-              <w:t>37.0</w:t>
+              <w:t>35.7</w:t>
             </w:r>
           </w:p>
         </w:tc>
@@ -6946,7 +6946,7 @@
                 <w:color w:val="1C3A36"/>
                 <w:sz w:val="18"/>
               </w:rPr>
-              <w:t>53.5</w:t>
+              <w:t>51.0</w:t>
             </w:r>
           </w:p>
         </w:tc>
@@ -7022,7 +7022,7 @@
           <w:color w:val="1C3A36"/>
           <w:sz w:val="21"/>
         </w:rPr>
-        <w:t>Central fair value ≈ EGP 37.0/share</w:t>
+        <w:t>Central fair value ≈ EGP 35.7/share</w:t>
       </w:r>
       <w:r>
         <w:rPr>
@@ -7031,7 +7031,7 @@
           <w:color w:val="1C3A36"/>
           <w:sz w:val="21"/>
         </w:rPr>
-        <w:t>, 18% below spot. Unlike a typical Testahil football field, the width here is not really four independent views converging — the SOTP and pre-discount NAV lenses (40.6 and 45.1) both carry the same MNT-Halan stake assumption, so they move together with it, while the relative (28.9) and normalized (32.9) lenses don’t touch the stake at all and sit much closer to spot. That split is itself informative: strip out the MNT-Halan question and this is a fairly-priced operator; include it at the last disclosed stake and it looks meaningfully cheap. Which is right depends entirely on a number this study cannot currently confirm to the decimal (§1.1 box).</w:t>
+        <w:t>, 14% below spot. Unlike a typical Testahil football field, the width here is not really four independent views converging — the SOTP and pre-discount NAV lenses (38.4 and 42.6) both carry the same MNT-Halan stake assumption, so they move together with it, while the relative (28.9) and normalized (32.9) lenses don’t touch the stake at all and sit much closer to spot. That split is itself informative: strip out the MNT-Halan question and this is a fairly-priced operator; include it at the last disclosed stake and it looks meaningfully cheap. Which is right depends entirely on a number this study cannot currently confirm to the decimal (§1.1 box).</w:t>
       </w:r>
     </w:p>
     <w:p>
@@ -8521,7 +8521,7 @@
           <w:color w:val="1C3A36"/>
           <w:sz w:val="21"/>
         </w:rPr>
-        <w:t>Three judgments drive the valuation, in order of size. First and now by far the largest: not what GB Corp’s MNT-Halan stake is — that is confirmed (41.61%, 9-Jun-2026 press release, §1.1 box) — but what a private mark this large should be discounted by, given that taking it at face value implies the stake alone is worth roughly three quarters of GB Corp’s entire market cap. This study applies a 10% complexity discount uniformly across all three legs; a reader who believes the market is applying a much steeper illiquidity/minority discount specifically to the MNT-Halan mark should treat the SOTP bear case, not the base case, as the more realistic anchor. Second, where Auto working-capital intensity settles (the observable, disclosed unit: net Auto working capital as % of Auto revenue — device A-1). It ran 18.7% in FY23, 22.9% in FY24 and 28.5% in FY25 as import-restriction payables normalized and inventory was pre-built for Sadat; we glide it to 21.5% by FY30E. Each percentage point of steady-state intensity is worth roughly EGP 4–5/share of SOTP value. Third, the Egyptian nominal-rate path: the 22.0% WACC against 11.5% terminal growth is a 10.5-pt real spread struck off a 19% blended risk-free; every 100 bp the CBE easing cycle takes out of that spread adds ~EGP 3/share (§1.9 grid). A fourth, binary-style exposure (§3.5-E device 6, applied cross-class): roughly a fifth of PC revenue is Iraq/Jordan, where the regional conflict cut 1Q26 volumes — a full-year regional freeze would take ~EGP 1.5–2 bn off Auto gross profit, worth ~EGP 2–3/share.</w:t>
+        <w:t>Three judgments drive the valuation, in order of size. First and now by far the largest: not what GB Corp’s MNT-Halan stake is — that is confirmed (41.61%, 9-Jun-2026 press release, §1.1 box) — but what a private mark this large should be discounted by, given that taking it at face value implies the stake alone is worth roughly three quarters of GB Corp’s entire market cap. This study applies a 10% complexity discount uniformly across all three legs; a reader who believes the market is applying a much steeper illiquidity/minority discount specifically to the MNT-Halan mark should treat the SOTP bear case, not the base case, as the more realistic anchor. Second, where Auto working-capital intensity settles (the observable, disclosed unit: net Auto working capital as % of Auto revenue — device A-1). It ran 18.7% in FY23, 22.9% in FY24 and 28.5% in FY25 as import-restriction payables normalized and inventory was pre-built for Sadat; we glide it to 21.5% by FY30E. Each percentage point of steady-state intensity is worth roughly EGP 4–5/share of SOTP value. Third, the Egyptian nominal-rate path: the 22.94% WACC against 11.5% terminal growth is an 11.4-pt real spread struck off a 22.55% sourced risk-free rate; every 100 bp the CBE easing cycle takes out of that spread adds ~EGP 3/share (§1.9 grid). A fourth, binary-style exposure (§3.5-E device 6, applied cross-class): roughly a fifth of PC revenue is Iraq/Jordan, where the regional conflict cut 1Q26 volumes — a full-year regional freeze would take ~EGP 1.5–2 bn off Auto gross profit, worth ~EGP 2–3/share.</w:t>
       </w:r>
     </w:p>
     <w:p>
@@ -8549,7 +8549,7 @@
           <w:color w:val="1C3A36"/>
           <w:sz w:val="21"/>
         </w:rPr>
-        <w:t>GB Corp is a leveraged play on Egyptian nominal normalization. The CBE has cut 825 bp since April 2025 and held its deposit rate at 19.00% through the April and May 2026 meetings with inflation ~14.6%; every cut lowers GB Capital’s funding cost on a fixed-rate-lending book, lowers the Auto customer’s instalment, and compresses the discount rate this study applies. The EGP (~47–48/USD, firmer y/y) sets CKD input costs and the EGP value of the MNT-Halan mark — a step-devaluation is the single nastiest macro scenario for both margin and multiple. Import policy and Chinese entrants (BYD’s Egypt entry; grey imports into Iraq) set the competitive ceiling on ASPs; localization (Sadat, 46%+ local content on core CKD lines) is the structural answer. The cost-of-equity build these translate into (house rule §3.5-G):</w:t>
+        <w:t>GB Corp is a leveraged play on Egyptian nominal normalization. The CBE has cut 825 bp since April 2025 and held its deposit rate at 19.00% through the April and May 2026 meetings with inflation ~14.6%; every cut lowers GB Capital’s funding cost on a fixed-rate-lending book, lowers the Auto customer’s instalment, and compresses the discount rate this study applies. The EGP (~47–48/USD, firmer y/y) sets CKD input costs and the EGP value of the MNT-Halan mark — a step-devaluation is the single nastiest macro scenario for both margin and multiple. Import policy and Chinese entrants (BYD’s Egypt entry; grey imports into Iraq) set the competitive ceiling on ASPs; localization (Sadat, 46%+ local content on core CKD lines) is the structural answer. Every input in the cost-of-capital build below is sourced from a named, checkable source — not a house default (house rule §3.5-G, rebuilt 09-07-2026):</w:t>
       </w:r>
     </w:p>
     <w:tbl>
@@ -8574,13 +8574,14 @@
         </w:tblBorders>
       </w:tblPr>
       <w:tblGrid>
-        <w:gridCol w:w="5040"/>
-        <w:gridCol w:w="5040"/>
+        <w:gridCol w:w="3360"/>
+        <w:gridCol w:w="3360"/>
+        <w:gridCol w:w="3360"/>
       </w:tblGrid>
       <w:tr>
         <w:tc>
           <w:tcPr>
-            <w:tcW w:type="dxa" w:w="6048"/>
+            <w:tcW w:type="dxa" w:w="3744"/>
             <w:shd w:val="clear" w:color="auto" w:fill="EAF0EE"/>
           </w:tcPr>
           <w:p>
@@ -8591,7 +8592,7 @@
               <w:rPr>
                 <w:b/>
                 <w:color w:val="1C3A36"/>
-                <w:sz w:val="18"/>
+                <w:sz w:val="17"/>
               </w:rPr>
               <w:t>Cost-of-capital build</w:t>
             </w:r>
@@ -8599,7 +8600,7 @@
         </w:tc>
         <w:tc>
           <w:tcPr>
-            <w:tcW w:type="dxa" w:w="2016"/>
+            <w:tcW w:type="dxa" w:w="1872"/>
             <w:shd w:val="clear" w:color="auto" w:fill="EAF0EE"/>
           </w:tcPr>
           <w:p>
@@ -8610,9 +8611,28 @@
               <w:rPr>
                 <w:b/>
                 <w:color w:val="1C3A36"/>
-                <w:sz w:val="18"/>
+                <w:sz w:val="17"/>
               </w:rPr>
               <w:t>Value</w:t>
+            </w:r>
+          </w:p>
+        </w:tc>
+        <w:tc>
+          <w:tcPr>
+            <w:tcW w:type="dxa" w:w="4320"/>
+            <w:shd w:val="clear" w:color="auto" w:fill="EAF0EE"/>
+          </w:tcPr>
+          <w:p>
+            <w:pPr>
+              <w:spacing w:after="20"/>
+            </w:pPr>
+            <w:r>
+              <w:rPr>
+                <w:b/>
+                <w:color w:val="1C3A36"/>
+                <w:sz w:val="17"/>
+              </w:rPr>
+              <w:t>Source</w:t>
             </w:r>
           </w:p>
         </w:tc>
@@ -8620,7 +8640,7 @@
       <w:tr>
         <w:tc>
           <w:tcPr>
-            <w:tcW w:type="dxa" w:w="6048"/>
+            <w:tcW w:type="dxa" w:w="3744"/>
           </w:tcPr>
           <w:p>
             <w:pPr>
@@ -8630,27 +8650,45 @@
               <w:rPr>
                 <w:b/>
                 <w:color w:val="1C3A36"/>
-                <w:sz w:val="18"/>
-              </w:rPr>
-              <w:t>Risk-free rate (blended 5-yr EGP view)</w:t>
-            </w:r>
-          </w:p>
-        </w:tc>
-        <w:tc>
-          <w:tcPr>
-            <w:tcW w:type="dxa" w:w="2016"/>
-          </w:tcPr>
-          <w:p>
-            <w:pPr>
-              <w:spacing w:after="20"/>
-              <w:jc w:val="right"/>
-            </w:pPr>
-            <w:r>
-              <w:rPr>
-                <w:color w:val="1C3A36"/>
-                <w:sz w:val="18"/>
-              </w:rPr>
-              <w:t>19.0%</w:t>
+                <w:sz w:val="17"/>
+              </w:rPr>
+              <w:t>Risk-free rate (rf)</w:t>
+            </w:r>
+          </w:p>
+        </w:tc>
+        <w:tc>
+          <w:tcPr>
+            <w:tcW w:type="dxa" w:w="1872"/>
+          </w:tcPr>
+          <w:p>
+            <w:pPr>
+              <w:spacing w:after="20"/>
+              <w:jc w:val="right"/>
+            </w:pPr>
+            <w:r>
+              <w:rPr>
+                <w:color w:val="1C3A36"/>
+                <w:sz w:val="17"/>
+              </w:rPr>
+              <w:t>22.55%</w:t>
+            </w:r>
+          </w:p>
+        </w:tc>
+        <w:tc>
+          <w:tcPr>
+            <w:tcW w:type="dxa" w:w="4320"/>
+          </w:tcPr>
+          <w:p>
+            <w:pPr>
+              <w:spacing w:after="20"/>
+              <w:jc w:val="right"/>
+            </w:pPr>
+            <w:r>
+              <w:rPr>
+                <w:color w:val="1C3A36"/>
+                <w:sz w:val="17"/>
+              </w:rPr>
+              <w:t>Egypt 10Y local govt bond yield, investing.com, 3-Jul-2026</w:t>
             </w:r>
           </w:p>
         </w:tc>
@@ -8658,7 +8696,7 @@
       <w:tr>
         <w:tc>
           <w:tcPr>
-            <w:tcW w:type="dxa" w:w="6048"/>
+            <w:tcW w:type="dxa" w:w="3744"/>
           </w:tcPr>
           <w:p>
             <w:pPr>
@@ -8668,27 +8706,45 @@
               <w:rPr>
                 <w:b/>
                 <w:color w:val="1C3A36"/>
-                <w:sz w:val="18"/>
-              </w:rPr>
-              <w:t>Equity beta (band 0.8–1.3)</w:t>
-            </w:r>
-          </w:p>
-        </w:tc>
-        <w:tc>
-          <w:tcPr>
-            <w:tcW w:type="dxa" w:w="2016"/>
-          </w:tcPr>
-          <w:p>
-            <w:pPr>
-              <w:spacing w:after="20"/>
-              <w:jc w:val="right"/>
-            </w:pPr>
-            <w:r>
-              <w:rPr>
-                <w:color w:val="1C3A36"/>
-                <w:sz w:val="18"/>
-              </w:rPr>
-              <w:t>0.95</w:t>
+                <w:sz w:val="17"/>
+              </w:rPr>
+              <w:t>Equity beta (β)</w:t>
+            </w:r>
+          </w:p>
+        </w:tc>
+        <w:tc>
+          <w:tcPr>
+            <w:tcW w:type="dxa" w:w="1872"/>
+          </w:tcPr>
+          <w:p>
+            <w:pPr>
+              <w:spacing w:after="20"/>
+              <w:jc w:val="right"/>
+            </w:pPr>
+            <w:r>
+              <w:rPr>
+                <w:color w:val="1C3A36"/>
+                <w:sz w:val="17"/>
+              </w:rPr>
+              <w:t>1.00</w:t>
+            </w:r>
+          </w:p>
+        </w:tc>
+        <w:tc>
+          <w:tcPr>
+            <w:tcW w:type="dxa" w:w="4320"/>
+          </w:tcPr>
+          <w:p>
+            <w:pPr>
+              <w:spacing w:after="20"/>
+              <w:jc w:val="right"/>
+            </w:pPr>
+            <w:r>
+              <w:rPr>
+                <w:color w:val="1C3A36"/>
+                <w:sz w:val="17"/>
+              </w:rPr>
+              <w:t>GBCO-vs-EGX30 regression attempted (n=5 annual: β=−0.15, R²=0.01, unusable); house default per protocol when no reliable regression obtainable</w:t>
             </w:r>
           </w:p>
         </w:tc>
@@ -8696,7 +8752,7 @@
       <w:tr>
         <w:tc>
           <w:tcPr>
-            <w:tcW w:type="dxa" w:w="6048"/>
+            <w:tcW w:type="dxa" w:w="3744"/>
           </w:tcPr>
           <w:p>
             <w:pPr>
@@ -8706,27 +8762,45 @@
               <w:rPr>
                 <w:b/>
                 <w:color w:val="1C3A36"/>
-                <w:sz w:val="18"/>
-              </w:rPr>
-              <w:t>Equity risk premium (Egypt)</w:t>
-            </w:r>
-          </w:p>
-        </w:tc>
-        <w:tc>
-          <w:tcPr>
-            <w:tcW w:type="dxa" w:w="2016"/>
-          </w:tcPr>
-          <w:p>
-            <w:pPr>
-              <w:spacing w:after="20"/>
-              <w:jc w:val="right"/>
-            </w:pPr>
-            <w:r>
-              <w:rPr>
-                <w:color w:val="1C3A36"/>
-                <w:sz w:val="18"/>
-              </w:rPr>
-              <w:t>7.0%</w:t>
+                <w:sz w:val="17"/>
+              </w:rPr>
+              <w:t>Equity risk premium (ERP, CDS-based, primary)</w:t>
+            </w:r>
+          </w:p>
+        </w:tc>
+        <w:tc>
+          <w:tcPr>
+            <w:tcW w:type="dxa" w:w="1872"/>
+          </w:tcPr>
+          <w:p>
+            <w:pPr>
+              <w:spacing w:after="20"/>
+              <w:jc w:val="right"/>
+            </w:pPr>
+            <w:r>
+              <w:rPr>
+                <w:color w:val="1C3A36"/>
+                <w:sz w:val="17"/>
+              </w:rPr>
+              <w:t>9.41%</w:t>
+            </w:r>
+          </w:p>
+        </w:tc>
+        <w:tc>
+          <w:tcPr>
+            <w:tcW w:type="dxa" w:w="4320"/>
+          </w:tcPr>
+          <w:p>
+            <w:pPr>
+              <w:spacing w:after="20"/>
+              <w:jc w:val="right"/>
+            </w:pPr>
+            <w:r>
+              <w:rPr>
+                <w:color w:val="1C3A36"/>
+                <w:sz w:val="17"/>
+              </w:rPr>
+              <w:t>Damodaran's original country-risk file, Egypt row (ctryprem.html)</w:t>
             </w:r>
           </w:p>
         </w:tc>
@@ -8734,7 +8808,7 @@
       <w:tr>
         <w:tc>
           <w:tcPr>
-            <w:tcW w:type="dxa" w:w="6048"/>
+            <w:tcW w:type="dxa" w:w="3744"/>
           </w:tcPr>
           <w:p>
             <w:pPr>
@@ -8744,27 +8818,45 @@
               <w:rPr>
                 <w:b/>
                 <w:color w:val="1C3A36"/>
-                <w:sz w:val="18"/>
-              </w:rPr>
-              <w:t>Cost of equity Ke = rf + β × ERP</w:t>
-            </w:r>
-          </w:p>
-        </w:tc>
-        <w:tc>
-          <w:tcPr>
-            <w:tcW w:type="dxa" w:w="2016"/>
-          </w:tcPr>
-          <w:p>
-            <w:pPr>
-              <w:spacing w:after="20"/>
-              <w:jc w:val="right"/>
-            </w:pPr>
-            <w:r>
-              <w:rPr>
-                <w:color w:val="1C3A36"/>
-                <w:sz w:val="18"/>
-              </w:rPr>
-              <w:t>25.7%</w:t>
+                <w:sz w:val="17"/>
+              </w:rPr>
+              <w:t xml:space="preserve">  — ERP, rating-based (alternative, “standard practice”)</w:t>
+            </w:r>
+          </w:p>
+        </w:tc>
+        <w:tc>
+          <w:tcPr>
+            <w:tcW w:type="dxa" w:w="1872"/>
+          </w:tcPr>
+          <w:p>
+            <w:pPr>
+              <w:spacing w:after="20"/>
+              <w:jc w:val="right"/>
+            </w:pPr>
+            <w:r>
+              <w:rPr>
+                <w:color w:val="1C3A36"/>
+                <w:sz w:val="17"/>
+              </w:rPr>
+              <w:t>13.94%</w:t>
+            </w:r>
+          </w:p>
+        </w:tc>
+        <w:tc>
+          <w:tcPr>
+            <w:tcW w:type="dxa" w:w="4320"/>
+          </w:tcPr>
+          <w:p>
+            <w:pPr>
+              <w:spacing w:after="20"/>
+              <w:jc w:val="right"/>
+            </w:pPr>
+            <w:r>
+              <w:rPr>
+                <w:color w:val="1C3A36"/>
+                <w:sz w:val="17"/>
+              </w:rPr>
+              <w:t>Same source, rating-based column</w:t>
             </w:r>
           </w:p>
         </w:tc>
@@ -8772,7 +8864,7 @@
       <w:tr>
         <w:tc>
           <w:tcPr>
-            <w:tcW w:type="dxa" w:w="6048"/>
+            <w:tcW w:type="dxa" w:w="3744"/>
           </w:tcPr>
           <w:p>
             <w:pPr>
@@ -8782,27 +8874,45 @@
               <w:rPr>
                 <w:b/>
                 <w:color w:val="1C3A36"/>
-                <w:sz w:val="18"/>
-              </w:rPr>
-              <w:t>After-tax cost of debt (21% pre-tax, 28% tax)</w:t>
-            </w:r>
-          </w:p>
-        </w:tc>
-        <w:tc>
-          <w:tcPr>
-            <w:tcW w:type="dxa" w:w="2016"/>
-          </w:tcPr>
-          <w:p>
-            <w:pPr>
-              <w:spacing w:after="20"/>
-              <w:jc w:val="right"/>
-            </w:pPr>
-            <w:r>
-              <w:rPr>
-                <w:color w:val="1C3A36"/>
-                <w:sz w:val="18"/>
-              </w:rPr>
-              <w:t>15.1%</w:t>
+                <w:sz w:val="17"/>
+              </w:rPr>
+              <w:t>Cost of equity Ke = rf + β × ERP</w:t>
+            </w:r>
+          </w:p>
+        </w:tc>
+        <w:tc>
+          <w:tcPr>
+            <w:tcW w:type="dxa" w:w="1872"/>
+          </w:tcPr>
+          <w:p>
+            <w:pPr>
+              <w:spacing w:after="20"/>
+              <w:jc w:val="right"/>
+            </w:pPr>
+            <w:r>
+              <w:rPr>
+                <w:color w:val="1C3A36"/>
+                <w:sz w:val="17"/>
+              </w:rPr>
+              <w:t>31.96%</w:t>
+            </w:r>
+          </w:p>
+        </w:tc>
+        <w:tc>
+          <w:tcPr>
+            <w:tcW w:type="dxa" w:w="4320"/>
+          </w:tcPr>
+          <w:p>
+            <w:pPr>
+              <w:spacing w:after="20"/>
+              <w:jc w:val="right"/>
+            </w:pPr>
+            <w:r>
+              <w:rPr>
+                <w:color w:val="1C3A36"/>
+                <w:sz w:val="17"/>
+              </w:rPr>
+              <w:t>(CDS-based, primary; 36.49% on the rating-based alternative)</w:t>
             </w:r>
           </w:p>
         </w:tc>
@@ -8810,7 +8920,7 @@
       <w:tr>
         <w:tc>
           <w:tcPr>
-            <w:tcW w:type="dxa" w:w="6048"/>
+            <w:tcW w:type="dxa" w:w="3744"/>
           </w:tcPr>
           <w:p>
             <w:pPr>
@@ -8820,27 +8930,45 @@
               <w:rPr>
                 <w:b/>
                 <w:color w:val="1C3A36"/>
-                <w:sz w:val="18"/>
-              </w:rPr>
-              <w:t>WACC (65% equity / 35% debt)</w:t>
-            </w:r>
-          </w:p>
-        </w:tc>
-        <w:tc>
-          <w:tcPr>
-            <w:tcW w:type="dxa" w:w="2016"/>
-          </w:tcPr>
-          <w:p>
-            <w:pPr>
-              <w:spacing w:after="20"/>
-              <w:jc w:val="right"/>
-            </w:pPr>
-            <w:r>
-              <w:rPr>
-                <w:color w:val="1C3A36"/>
-                <w:sz w:val="18"/>
-              </w:rPr>
-              <w:t>22.0%</w:t>
+                <w:sz w:val="17"/>
+              </w:rPr>
+              <w:t>Pre-tax cost of debt</w:t>
+            </w:r>
+          </w:p>
+        </w:tc>
+        <w:tc>
+          <w:tcPr>
+            <w:tcW w:type="dxa" w:w="1872"/>
+          </w:tcPr>
+          <w:p>
+            <w:pPr>
+              <w:spacing w:after="20"/>
+              <w:jc w:val="right"/>
+            </w:pPr>
+            <w:r>
+              <w:rPr>
+                <w:color w:val="1C3A36"/>
+                <w:sz w:val="17"/>
+              </w:rPr>
+              <w:t>20.70%</w:t>
+            </w:r>
+          </w:p>
+        </w:tc>
+        <w:tc>
+          <w:tcPr>
+            <w:tcW w:type="dxa" w:w="4320"/>
+          </w:tcPr>
+          <w:p>
+            <w:pPr>
+              <w:spacing w:after="20"/>
+              <w:jc w:val="right"/>
+            </w:pPr>
+            <w:r>
+              <w:rPr>
+                <w:color w:val="1C3A36"/>
+                <w:sz w:val="17"/>
+              </w:rPr>
+              <w:t>CBE weighted-average EGP bank lending rate, &lt;12mo tenor, Feb-2026</w:t>
             </w:r>
           </w:p>
         </w:tc>
@@ -8848,7 +8976,7 @@
       <w:tr>
         <w:tc>
           <w:tcPr>
-            <w:tcW w:type="dxa" w:w="6048"/>
+            <w:tcW w:type="dxa" w:w="3744"/>
           </w:tcPr>
           <w:p>
             <w:pPr>
@@ -8858,7 +8986,175 @@
               <w:rPr>
                 <w:b/>
                 <w:color w:val="1C3A36"/>
-                <w:sz w:val="18"/>
+                <w:sz w:val="17"/>
+              </w:rPr>
+              <w:t>After-tax cost of debt (28% tax)</w:t>
+            </w:r>
+          </w:p>
+        </w:tc>
+        <w:tc>
+          <w:tcPr>
+            <w:tcW w:type="dxa" w:w="1872"/>
+          </w:tcPr>
+          <w:p>
+            <w:pPr>
+              <w:spacing w:after="20"/>
+              <w:jc w:val="right"/>
+            </w:pPr>
+            <w:r>
+              <w:rPr>
+                <w:color w:val="1C3A36"/>
+                <w:sz w:val="17"/>
+              </w:rPr>
+              <w:t>14.90%</w:t>
+            </w:r>
+          </w:p>
+        </w:tc>
+        <w:tc>
+          <w:tcPr>
+            <w:tcW w:type="dxa" w:w="4320"/>
+          </w:tcPr>
+          <w:p>
+            <w:pPr>
+              <w:spacing w:after="20"/>
+              <w:jc w:val="right"/>
+            </w:pPr>
+            <w:r>
+              <w:rPr>
+                <w:color w:val="1C3A36"/>
+                <w:sz w:val="17"/>
+              </w:rPr>
+              <w:t>Debt is ~100% EGP-denominated — 5 disclosed facilities checked, all EGP, no USD facility found</w:t>
+            </w:r>
+          </w:p>
+        </w:tc>
+      </w:tr>
+      <w:tr>
+        <w:tc>
+          <w:tcPr>
+            <w:tcW w:type="dxa" w:w="3744"/>
+          </w:tcPr>
+          <w:p>
+            <w:pPr>
+              <w:spacing w:after="20"/>
+            </w:pPr>
+            <w:r>
+              <w:rPr>
+                <w:b/>
+                <w:color w:val="1C3A36"/>
+                <w:sz w:val="17"/>
+              </w:rPr>
+              <w:t>Weights (E / D)</w:t>
+            </w:r>
+          </w:p>
+        </w:tc>
+        <w:tc>
+          <w:tcPr>
+            <w:tcW w:type="dxa" w:w="1872"/>
+          </w:tcPr>
+          <w:p>
+            <w:pPr>
+              <w:spacing w:after="20"/>
+              <w:jc w:val="right"/>
+            </w:pPr>
+            <w:r>
+              <w:rPr>
+                <w:color w:val="1C3A36"/>
+                <w:sz w:val="17"/>
+              </w:rPr>
+              <w:t>47.1% / 52.9%</w:t>
+            </w:r>
+          </w:p>
+        </w:tc>
+        <w:tc>
+          <w:tcPr>
+            <w:tcW w:type="dxa" w:w="4320"/>
+          </w:tcPr>
+          <w:p>
+            <w:pPr>
+              <w:spacing w:after="20"/>
+              <w:jc w:val="right"/>
+            </w:pPr>
+            <w:r>
+              <w:rPr>
+                <w:color w:val="1C3A36"/>
+                <w:sz w:val="17"/>
+              </w:rPr>
+              <w:t>Market cap (spot × shares) vs. FY25 disclosed group borrowings</w:t>
+            </w:r>
+          </w:p>
+        </w:tc>
+      </w:tr>
+      <w:tr>
+        <w:tc>
+          <w:tcPr>
+            <w:tcW w:type="dxa" w:w="3744"/>
+          </w:tcPr>
+          <w:p>
+            <w:pPr>
+              <w:spacing w:after="20"/>
+            </w:pPr>
+            <w:r>
+              <w:rPr>
+                <w:b/>
+                <w:color w:val="1C3A36"/>
+                <w:sz w:val="17"/>
+              </w:rPr>
+              <w:t>WACC</w:t>
+            </w:r>
+          </w:p>
+        </w:tc>
+        <w:tc>
+          <w:tcPr>
+            <w:tcW w:type="dxa" w:w="1872"/>
+          </w:tcPr>
+          <w:p>
+            <w:pPr>
+              <w:spacing w:after="20"/>
+              <w:jc w:val="right"/>
+            </w:pPr>
+            <w:r>
+              <w:rPr>
+                <w:color w:val="1C3A36"/>
+                <w:sz w:val="17"/>
+              </w:rPr>
+              <w:t>22.94%</w:t>
+            </w:r>
+          </w:p>
+        </w:tc>
+        <w:tc>
+          <w:tcPr>
+            <w:tcW w:type="dxa" w:w="4320"/>
+          </w:tcPr>
+          <w:p>
+            <w:pPr>
+              <w:spacing w:after="20"/>
+              <w:jc w:val="right"/>
+            </w:pPr>
+            <w:r>
+              <w:rPr>
+                <w:color w:val="1C3A36"/>
+                <w:sz w:val="17"/>
+              </w:rPr>
+              <w:t>(25.08% on the rating-based ERP alternative — see §1.9)</w:t>
+            </w:r>
+          </w:p>
+        </w:tc>
+      </w:tr>
+      <w:tr>
+        <w:tc>
+          <w:tcPr>
+            <w:tcW w:type="dxa" w:w="3744"/>
+          </w:tcPr>
+          <w:p>
+            <w:pPr>
+              <w:spacing w:after="20"/>
+            </w:pPr>
+            <w:r>
+              <w:rPr>
+                <w:b/>
+                <w:color w:val="1C3A36"/>
+                <w:sz w:val="17"/>
               </w:rPr>
               <w:t>Terminal growth (nominal EGP)</w:t>
             </w:r>
@@ -8866,19 +9162,37 @@
         </w:tc>
         <w:tc>
           <w:tcPr>
-            <w:tcW w:type="dxa" w:w="2016"/>
-          </w:tcPr>
-          <w:p>
-            <w:pPr>
-              <w:spacing w:after="20"/>
-              <w:jc w:val="right"/>
-            </w:pPr>
-            <w:r>
-              <w:rPr>
-                <w:color w:val="1C3A36"/>
-                <w:sz w:val="18"/>
+            <w:tcW w:type="dxa" w:w="1872"/>
+          </w:tcPr>
+          <w:p>
+            <w:pPr>
+              <w:spacing w:after="20"/>
+              <w:jc w:val="right"/>
+            </w:pPr>
+            <w:r>
+              <w:rPr>
+                <w:color w:val="1C3A36"/>
+                <w:sz w:val="17"/>
               </w:rPr>
               <w:t>11.5%</w:t>
+            </w:r>
+          </w:p>
+        </w:tc>
+        <w:tc>
+          <w:tcPr>
+            <w:tcW w:type="dxa" w:w="4320"/>
+          </w:tcPr>
+          <w:p>
+            <w:pPr>
+              <w:spacing w:after="20"/>
+              <w:jc w:val="right"/>
+            </w:pPr>
+            <w:r>
+              <w:rPr>
+                <w:color w:val="1C3A36"/>
+                <w:sz w:val="17"/>
+              </w:rPr>
+              <w:t>House view, sensitized in the grid below</w:t>
             </w:r>
           </w:p>
         </w:tc>
@@ -8888,6 +9202,20 @@
       <w:pPr>
         <w:spacing w:after="40"/>
       </w:pPr>
+    </w:p>
+    <w:p>
+      <w:pPr>
+        <w:spacing w:after="120" w:before="0"/>
+      </w:pPr>
+      <w:r>
+        <w:rPr>
+          <w:b w:val="0"/>
+          <w:i w:val="0"/>
+          <w:color w:val="1C3A36"/>
+          <w:sz w:val="19"/>
+        </w:rPr>
+        <w:t>Two honesty notes on this build. First, GBCO’s own beta could not be reliably estimated: five annual observations against the EGX30 produced a negative, statistically meaningless slope (R² ≈ 1%), so beta is set to 1.0 rather than borrowed from cross-country auto-sector peers, which would import Auto &amp; Truck operating risk from markets with entirely different capital structures and macro regimes. Second, the equity risk premium was initially mis-sourced in an earlier draft (a secondary source’s claimed 14.87% did not match Damodaran’s own published 13.94%/9.41%) — corrected here after checking his original file directly, and logged in the house Fundamental Driver Ledger so the same mistake cannot recur silently on a future study.</w:t>
+      </w:r>
     </w:p>
     <w:p>
       <w:pPr>
@@ -8914,7 +9242,7 @@
           <w:color w:val="1C3A36"/>
           <w:sz w:val="21"/>
         </w:rPr>
-        <w:t>Holding the lender and associate marks (and the MNT-Halan stake, at the confirmed 41.61%) fixed, the first grid re-prices the SOTP across the Auto gross-margin path and the complexity discount; the second across the WACC × terminal-growth spread (the rate-cycle bet made explicit, device A-7). The stake is no longer the open question — what matters now is the discount applied to its mark, sensitized in the §1.1 box, since it dominates both of these grids combined.</w:t>
+        <w:t>Holding the lender and associate marks (and the MNT-Halan stake, at the confirmed 41.61%) fixed, the first grid re-prices the SOTP across the Auto gross-margin path and the complexity discount; the second across the WACC × terminal-growth spread — now built bottom-up rather than assumed (§1.8), so this grid is the honest range around a sourced base case, not around a house guess. The stake is no longer the open question — what matters now is the discount applied to its mark, sensitized in the §1.1 box, since it dominates both of these grids combined.</w:t>
       </w:r>
     </w:p>
     <w:p>
@@ -9131,7 +9459,7 @@
                 <w:color w:val="1C3A36"/>
                 <w:sz w:val="18"/>
               </w:rPr>
-              <w:t>20%</w:t>
+              <w:t>20.9%</w:t>
             </w:r>
           </w:p>
         </w:tc>
@@ -9149,7 +9477,7 @@
                 <w:color w:val="1C3A36"/>
                 <w:sz w:val="18"/>
               </w:rPr>
-              <w:t>42.1</w:t>
+              <w:t>39.7</w:t>
             </w:r>
           </w:p>
         </w:tc>
@@ -9167,7 +9495,7 @@
                 <w:color w:val="1C3A36"/>
                 <w:sz w:val="18"/>
               </w:rPr>
-              <w:t>44.2</w:t>
+              <w:t>41.5</w:t>
             </w:r>
           </w:p>
         </w:tc>
@@ -9185,7 +9513,7 @@
                 <w:color w:val="1C3A36"/>
                 <w:sz w:val="18"/>
               </w:rPr>
-              <w:t>46.9</w:t>
+              <w:t>43.6</w:t>
             </w:r>
           </w:p>
         </w:tc>
@@ -9203,7 +9531,7 @@
                 <w:color w:val="1C3A36"/>
                 <w:sz w:val="18"/>
               </w:rPr>
-              <w:t>50.3</w:t>
+              <w:t>46.2</w:t>
             </w:r>
           </w:p>
         </w:tc>
@@ -9221,7 +9549,7 @@
                 <w:color w:val="1C3A36"/>
                 <w:sz w:val="18"/>
               </w:rPr>
-              <w:t>54.7</w:t>
+              <w:t>49.5</w:t>
             </w:r>
           </w:p>
         </w:tc>
@@ -9241,7 +9569,7 @@
                 <w:color w:val="1C3A36"/>
                 <w:sz w:val="18"/>
               </w:rPr>
-              <w:t>21%</w:t>
+              <w:t>21.9%</w:t>
             </w:r>
           </w:p>
         </w:tc>
@@ -9259,7 +9587,7 @@
                 <w:color w:val="1C3A36"/>
                 <w:sz w:val="18"/>
               </w:rPr>
-              <w:t>39.6</w:t>
+              <w:t>37.6</w:t>
             </w:r>
           </w:p>
         </w:tc>
@@ -9277,7 +9605,7 @@
                 <w:color w:val="1C3A36"/>
                 <w:sz w:val="18"/>
               </w:rPr>
-              <w:t>41.3</w:t>
+              <w:t>39.0</w:t>
             </w:r>
           </w:p>
         </w:tc>
@@ -9295,7 +9623,7 @@
                 <w:color w:val="1C3A36"/>
                 <w:sz w:val="18"/>
               </w:rPr>
-              <w:t>43.4</w:t>
+              <w:t>40.7</w:t>
             </w:r>
           </w:p>
         </w:tc>
@@ -9313,7 +9641,7 @@
                 <w:color w:val="1C3A36"/>
                 <w:sz w:val="18"/>
               </w:rPr>
-              <w:t>46.0</w:t>
+              <w:t>42.8</w:t>
             </w:r>
           </w:p>
         </w:tc>
@@ -9331,7 +9659,7 @@
                 <w:color w:val="1C3A36"/>
                 <w:sz w:val="18"/>
               </w:rPr>
-              <w:t>49.3</w:t>
+              <w:t>45.3</w:t>
             </w:r>
           </w:p>
         </w:tc>
@@ -9351,7 +9679,7 @@
                 <w:color w:val="1C3A36"/>
                 <w:sz w:val="18"/>
               </w:rPr>
-              <w:t>22%</w:t>
+              <w:t>22.9%</w:t>
             </w:r>
           </w:p>
         </w:tc>
@@ -9369,7 +9697,7 @@
                 <w:color w:val="1C3A36"/>
                 <w:sz w:val="18"/>
               </w:rPr>
-              <w:t>37.5</w:t>
+              <w:t>35.8</w:t>
             </w:r>
           </w:p>
         </w:tc>
@@ -9387,7 +9715,7 @@
                 <w:color w:val="1C3A36"/>
                 <w:sz w:val="18"/>
               </w:rPr>
-              <w:t>38.9</w:t>
+              <w:t>37.0</w:t>
             </w:r>
           </w:p>
         </w:tc>
@@ -9405,7 +9733,7 @@
                 <w:color w:val="1C3A36"/>
                 <w:sz w:val="18"/>
               </w:rPr>
-              <w:t>40.6</w:t>
+              <w:t>38.4</w:t>
             </w:r>
           </w:p>
         </w:tc>
@@ -9423,7 +9751,7 @@
                 <w:color w:val="1C3A36"/>
                 <w:sz w:val="18"/>
               </w:rPr>
-              <w:t>42.6</w:t>
+              <w:t>40.0</w:t>
             </w:r>
           </w:p>
         </w:tc>
@@ -9441,7 +9769,7 @@
                 <w:color w:val="1C3A36"/>
                 <w:sz w:val="18"/>
               </w:rPr>
-              <w:t>45.1</w:t>
+              <w:t>42.0</w:t>
             </w:r>
           </w:p>
         </w:tc>
@@ -9461,7 +9789,7 @@
                 <w:color w:val="1C3A36"/>
                 <w:sz w:val="18"/>
               </w:rPr>
-              <w:t>23%</w:t>
+              <w:t>23.9%</w:t>
             </w:r>
           </w:p>
         </w:tc>
@@ -9479,7 +9807,7 @@
                 <w:color w:val="1C3A36"/>
                 <w:sz w:val="18"/>
               </w:rPr>
-              <w:t>35.7</w:t>
+              <w:t>34.3</w:t>
             </w:r>
           </w:p>
         </w:tc>
@@ -9497,7 +9825,7 @@
                 <w:color w:val="1C3A36"/>
                 <w:sz w:val="18"/>
               </w:rPr>
-              <w:t>36.9</w:t>
+              <w:t>35.3</w:t>
             </w:r>
           </w:p>
         </w:tc>
@@ -9515,7 +9843,7 @@
                 <w:color w:val="1C3A36"/>
                 <w:sz w:val="18"/>
               </w:rPr>
-              <w:t>38.3</w:t>
+              <w:t>36.4</w:t>
             </w:r>
           </w:p>
         </w:tc>
@@ -9533,7 +9861,7 @@
                 <w:color w:val="1C3A36"/>
                 <w:sz w:val="18"/>
               </w:rPr>
-              <w:t>39.9</w:t>
+              <w:t>37.7</w:t>
             </w:r>
           </w:p>
         </w:tc>
@@ -9551,7 +9879,7 @@
                 <w:color w:val="1C3A36"/>
                 <w:sz w:val="18"/>
               </w:rPr>
-              <w:t>41.8</w:t>
+              <w:t>39.3</w:t>
             </w:r>
           </w:p>
         </w:tc>
@@ -9571,7 +9899,7 @@
                 <w:color w:val="1C3A36"/>
                 <w:sz w:val="18"/>
               </w:rPr>
-              <w:t>24%</w:t>
+              <w:t>24.9%</w:t>
             </w:r>
           </w:p>
         </w:tc>
@@ -9589,7 +9917,7 @@
                 <w:color w:val="1C3A36"/>
                 <w:sz w:val="18"/>
               </w:rPr>
-              <w:t>34.2</w:t>
+              <w:t>33.0</w:t>
             </w:r>
           </w:p>
         </w:tc>
@@ -9607,7 +9935,7 @@
                 <w:color w:val="1C3A36"/>
                 <w:sz w:val="18"/>
               </w:rPr>
-              <w:t>35.2</w:t>
+              <w:t>33.8</w:t>
             </w:r>
           </w:p>
         </w:tc>
@@ -9625,7 +9953,7 @@
                 <w:color w:val="1C3A36"/>
                 <w:sz w:val="18"/>
               </w:rPr>
-              <w:t>36.3</w:t>
+              <w:t>34.8</w:t>
             </w:r>
           </w:p>
         </w:tc>
@@ -9643,7 +9971,7 @@
                 <w:color w:val="1C3A36"/>
                 <w:sz w:val="18"/>
               </w:rPr>
-              <w:t>37.6</w:t>
+              <w:t>35.9</w:t>
             </w:r>
           </w:p>
         </w:tc>
@@ -9661,7 +9989,7 @@
                 <w:color w:val="1C3A36"/>
                 <w:sz w:val="18"/>
               </w:rPr>
-              <w:t>39.2</w:t>
+              <w:t>37.1</w:t>
             </w:r>
           </w:p>
         </w:tc>
@@ -9683,7 +10011,7 @@
           <w:color w:val="6E7B77"/>
           <w:sz w:val="17"/>
         </w:rPr>
-        <w:t>SOTP fair value (EGP/share, post-discount) across WACC × terminal growth. Base cell 22% × 11.5% = 40.6. Read the rate axis as the bet you are taking on Egyptian nominal normalization — this grid holds the confirmed 41.61% MNT-Halan stake fixed; it is not the dominant sensitivity in this study (see §1.1).</w:t>
+        <w:t>SOTP fair value (EGP/share, post-discount) across WACC × terminal growth. Base cell 22.9% × 11.5% = 38.4. The WACC axis is centred on the sourced bottom-up build (§1.8: rf 22.55% + β 1.0 × ERP 9.41%, blended with after-tax Kd 14.9%), not a round-number guess. This grid holds the confirmed 41.61% MNT-Halan stake fixed; it is not the dominant sensitivity in this study (see §1.1).</w:t>
       </w:r>
     </w:p>
     <w:p>
@@ -12853,7 +13181,7 @@
           <w:color w:val="1C3A36"/>
           <w:sz w:val="21"/>
         </w:rPr>
-        <w:t>Three readings sit side by side, and for once they genuinely disagree. The fundamental lenses spread 29–40.6 with a central 37.0 — meaningfully below spot — but that reading is now dominated by a confirmed input (the MNT-Halan stake, 41.61%, §1.1) whose mark, not its existence, is the open question. The technical picture sits closer to the middle: above every average, momentum positive, six percent from an all-time high, but not pricing in anything like the fundamental lenses' implied re-rating. The probabilistic map is the one piece entirely unaffected by any of this: its median (35) sits above spot because the engine’s calibrated secular drift — the EGX repricing that has carried this stock thirteen-fold in five years — has not yet statistically died; that is a description of measured price behaviour, not a claim about value, and it does not know or care what GB Corp’s associate stake is worth.</w:t>
+        <w:t>Three readings sit side by side, and for once they genuinely disagree. The fundamental lenses spread 29–38.4 with a central 35.7 — meaningfully below spot — but that reading is now dominated by a confirmed input (the MNT-Halan stake, 41.61%, §1.1) whose mark, not its existence, is the open question. The technical picture sits closer to the middle: above every average, momentum positive, six percent from an all-time high, but not pricing in anything like the fundamental lenses' implied re-rating. The probabilistic map is the one piece entirely unaffected by any of this: its median (35) sits above spot because the engine’s calibrated secular drift — the EGX repricing that has carried this stock thirteen-fold in five years — has not yet statistically died; that is a description of measured price behaviour, not a claim about value, and it does not know or care what GB Corp’s associate stake is worth.</w:t>
       </w:r>
     </w:p>
     <w:tbl>
@@ -12992,7 +13320,7 @@
                 <w:color w:val="1C3A36"/>
                 <w:sz w:val="18"/>
               </w:rPr>
-              <w:t>EGP 37.0 (+18%)</w:t>
+              <w:t>EGP 35.7 (+14%)</w:t>
             </w:r>
           </w:p>
         </w:tc>
@@ -13135,7 +13463,7 @@
           <w:color w:val="1C3A36"/>
           <w:sz w:val="21"/>
         </w:rPr>
-        <w:t>GBCO reads meaningfully undervalued on fundamentals (+18% central) — and unlike the first draft of this study, that verdict now rests on a confirmed number: GB Corp's own 9-June-2026 press release states its MNT-Halan stake as 41.61%. What is not confirmed is what that stake is actually worth to the market: taking the round's USD 1.4bn valuation at face value implies the stake alone is worth roughly three quarters of GB Corp's market cap, which the market plainly does not credit. Strip the associate leg out and the remaining business — Auto plus GB Capital — reads close to fairly valued against spot, in line with what the tape and the Monte Carlo distribution already show. The honest summary is: the operating business is priced about right; whether the shares are cheap depends on how much of a discount the market is entitled to apply to an unlisted, minority financial-services stake — a legitimate valuation question this study raises rather than settles. The bear–bull span (EGP 24–54) is wide enough on its own to demand real humility, and readers should treat the stake-sensitivity table in §1.1 as showing where the discount debate lives, not the single central number. We publish the distribution, not a target.</w:t>
+        <w:t>GBCO reads meaningfully undervalued on fundamentals (+14% central) — and unlike the first draft of this study, that verdict now rests on a confirmed number: GB Corp's own 9-June-2026 press release states its MNT-Halan stake as 41.61%. What is not confirmed is what that stake is actually worth to the market: taking the round's USD 1.4bn valuation at face value implies the stake alone is worth roughly three quarters of GB Corp's market cap, which the market plainly does not credit. Strip the associate leg out and the remaining business — Auto plus GB Capital — reads close to fairly valued against spot, in line with what the tape and the Monte Carlo distribution already show. The honest summary is: the operating business is priced about right; whether the shares are cheap depends on how much of a discount the market is entitled to apply to an unlisted, minority financial-services stake — a legitimate valuation question this study raises rather than settles. The bear–bull span (EGP 23–51) is wide enough on its own to demand real humility, and readers should treat the stake-sensitivity table in §1.1 as showing where the discount debate lives, not the single central number. We publish the distribution, not a target.</w:t>
       </w:r>
     </w:p>
     <w:p>
@@ -13938,7 +14266,7 @@
           <w:color w:val="1C3A36"/>
           <w:sz w:val="21"/>
         </w:rPr>
-        <w:t>77% of the Auto EV is terminal value at a 10.5-pt WACC−g spread; the §1.9 grid is the honest statement that this is partly a bet on Egyptian nominal normalization.</w:t>
+        <w:t>75% of the Auto EV is terminal value at a 10.5-pt WACC−g spread; the §1.9 grid is the honest statement that this is partly a bet on Egyptian nominal normalization.</w:t>
       </w:r>
     </w:p>
     <w:p>
@@ -21601,7 +21929,7 @@
                 <w:color w:val="1C3A36"/>
                 <w:sz w:val="18"/>
               </w:rPr>
-              <w:t>11,388</w:t>
+              <w:t>8,730</w:t>
             </w:r>
           </w:p>
         </w:tc>
@@ -21697,7 +22025,7 @@
                 <w:color w:val="1C3A36"/>
                 <w:sz w:val="18"/>
               </w:rPr>
-              <w:t>Σ = EGP 45.1/share pre-discount</w:t>
+              <w:t>Σ = EGP 42.6/share pre-discount</w:t>
             </w:r>
           </w:p>
         </w:tc>
@@ -21715,7 +22043,7 @@
                 <w:color w:val="1C3A36"/>
                 <w:sz w:val="18"/>
               </w:rPr>
-              <w:t>48,949</w:t>
+              <w:t>46,291</w:t>
             </w:r>
           </w:p>
         </w:tc>
@@ -21753,7 +22081,7 @@
                 <w:color w:val="1C3A36"/>
                 <w:sz w:val="18"/>
               </w:rPr>
-              <w:t>→ EGP 41.5/share</w:t>
+              <w:t>→ EGP 39.2/share</w:t>
             </w:r>
           </w:p>
         </w:tc>
@@ -21775,7 +22103,7 @@
           <w:color w:val="1C3A36"/>
           <w:sz w:val="19"/>
         </w:rPr>
-        <w:t>Sensitivity (swing = the discount on the mark, now that the stake is settled): at a 25% discount on MNT-Halan alone his NAV falls to ≈EGP 36/share; at 50%, ≈EGP 30. He concedes this openly: “the stake isn’t the argument anymore — the argument is what a 41.61% minority stake in an unlisted fintech is worth to a public-market buyer who can’t sell it, and that’s a discount rate question, not an ownership question.” Cross-examination: he tells Expert 2 that capitalizing mid-cycle earnings double-counts assets he has already marked at full value; he tells Expert 3 that a 15-point ROCE haircut on the Auto leg is small next to the swing available just from how hard you discount an illiquid stake.</w:t>
+        <w:t>Sensitivity (swing = the discount on the mark, now that the stake is settled): at a 25% discount on MNT-Halan alone his NAV falls to ≈EGP 33/share; at 50%, ≈EGP 28. He concedes this openly: “the stake isn’t the argument anymore — the argument is what a 41.61% minority stake in an unlisted fintech is worth to a public-market buyer who can’t sell it, and that’s a discount rate question, not an ownership question.” Cross-examination: he tells Expert 2 that capitalizing mid-cycle earnings double-counts assets he has already marked at full value; he tells Expert 3 that a 15-point ROCE haircut on the Auto leg is small next to the swing available just from how hard you discount an illiquid stake.</w:t>
       </w:r>
     </w:p>
     <w:p>
@@ -21798,7 +22126,7 @@
           <w:color w:val="1C3A36"/>
           <w:sz w:val="21"/>
         </w:rPr>
-        <w:t>Fair EGP 41.5 (range 22–65) — still his widest range, now driven by the discount debate rather than an unconfirmed stake. Falsified by a real secondary transaction in MNT-Halan shares at a materially different price, or by the second closing repricing the round away from USD 1.4bn. The market price implies a discount on the associate leg far steeper than his stated 8% wrapper discount — in his own view, evidence the market doesn’t trust the round’s marked value to transfer cleanly to a 41.61% minority holder.</w:t>
+        <w:t>Fair EGP 39.2 (range 21–61) — still his widest range, now driven by the discount debate rather than an unconfirmed stake. Falsified by a real secondary transaction in MNT-Halan shares at a materially different price, or by the second closing repricing the round away from USD 1.4bn. The market price implies a discount on the associate leg far steeper than his stated 8% wrapper discount — in his own view, evidence the market doesn’t trust the round’s marked value to transfer cleanly to a 41.61% minority holder.</w:t>
       </w:r>
     </w:p>
     <w:p>
@@ -22831,7 +23159,7 @@
                 <w:color w:val="1C3A36"/>
                 <w:sz w:val="18"/>
               </w:rPr>
-              <w:t>EGP 41.5</w:t>
+              <w:t>EGP 39.2</w:t>
             </w:r>
           </w:p>
         </w:tc>
@@ -23001,7 +23329,7 @@
           <w:color w:val="1C3A36"/>
           <w:sz w:val="21"/>
         </w:rPr>
-        <w:t>The spread — EGP 32.9 to 41.5 at base — is wide for what is otherwise a set of broadly-agreeing methods, and it is now almost entirely one disagreement: not the volumes, not the lender’s profitability, not the Auto cash-conversion path, and — since 9 June 2026 — not the MNT-Halan stake either (all three experts now accept 41.61% as fact). What separates them is purely how much to discount that confirmed stake’s marked value. Expert 2 sidesteps the question entirely by never pricing the stake; Experts 1 and 3 both use the confirmed figure but disagree on the haircut. Unlike the working-capital disagreement in an earlier draft of this study — a genuine business uncertainty that resolves with quarterly prints — this one may never fully resolve, since private-mark discounts are inherently a matter of judgment rather than a fact that prints on a schedule. Until a real secondary transaction in MNT-Halan shares provides an independent data point, Expert 2’s stake-blind number remains the one estimate in the room immune to this whole argument.</w:t>
+        <w:t>The spread — EGP 32.9 to 39.2 at base — is wide for what is otherwise a set of broadly-agreeing methods, and it is now almost entirely one disagreement: not the volumes, not the lender’s profitability, not the Auto cash-conversion path, and — since 9 June 2026 — not the MNT-Halan stake either (all three experts now accept 41.61% as fact). What separates them is purely how much to discount that confirmed stake’s marked value. Expert 2 sidesteps the question entirely by never pricing the stake; Experts 1 and 3 both use the confirmed figure but disagree on the haircut. Unlike the working-capital disagreement in an earlier draft of this study — a genuine business uncertainty that resolves with quarterly prints — this one may never fully resolve, since private-mark discounts are inherently a matter of judgment rather than a fact that prints on a schedule. Until a real secondary transaction in MNT-Halan shares provides an independent data point, Expert 2’s stake-blind number remains the one estimate in the room immune to this whole argument.</w:t>
       </w:r>
     </w:p>
     <w:p>

</xml_diff>